<commit_message>
Requirements v3: Brand Trust extension
</commit_message>
<xml_diff>
--- a/AAA_Insights_PRD.docx
+++ b/AAA_Insights_PRD.docx
@@ -107,10 +107,10 @@
           <w:i/>
           <w:iCs/>
           <w:color w:val="6B6F76"/>
-          <w:sz w:val="27"/>
-          <w:szCs w:val="27"/>
-        </w:rPr>
-        <w:t xml:space="preserve">Collect surveys, reviews, ratings, and comments — then let AI turn them into customer and competitive insight.</w:t>
+          <w:sz w:val="26"/>
+          <w:szCs w:val="26"/>
+        </w:rPr>
+        <w:t xml:space="preserve">Collect surveys, reviews, ratings, and comments — then let AI turn them into customer, competitive, and relationship insight.</w:t>
       </w:r>
     </w:p>
     <w:p>
@@ -133,7 +133,7 @@
           <w:sz w:val="18"/>
           <w:szCs w:val="18"/>
         </w:rPr>
-        <w:t xml:space="preserve">v2 — Draft (revised per client input)</w:t>
+        <w:t xml:space="preserve">v3 — Draft (Trust extension)</w:t>
       </w:r>
     </w:p>
     <w:p>
@@ -156,7 +156,7 @@
           <w:sz w:val="18"/>
           <w:szCs w:val="18"/>
         </w:rPr>
-        <w:t xml:space="preserve">2026-07-13</w:t>
+        <w:t xml:space="preserve">2026-07-14</w:t>
       </w:r>
     </w:p>
     <w:p>
@@ -273,7 +273,7 @@
           <w:sz w:val="17"/>
           <w:szCs w:val="17"/>
         </w:rPr>
-        <w:t xml:space="preserve">WHAT CHANGED IN V2</w:t>
+        <w:t xml:space="preserve">WHAT CHANGED IN V3</w:t>
       </w:r>
     </w:p>
     <w:p>
@@ -332,7 +332,7 @@
                 <w:sz w:val="20"/>
                 <w:szCs w:val="20"/>
               </w:rPr>
-              <w:t xml:space="preserve">Revised 2026-07-13 per client direction</w:t>
+              <w:t xml:space="preserve">Revised 2026-07-14 — Trust extension</w:t>
             </w:r>
           </w:p>
           <w:p>
@@ -346,7 +346,7 @@
                 <w:sz w:val="20"/>
                 <w:szCs w:val="20"/>
               </w:rPr>
-              <w:t xml:space="preserve">• Aggregate "unified customer" view across all feedback sources — identity stays optional (population, not person).</w:t>
+              <w:t xml:space="preserve">• Brand Trust added as a first-class indicator that complements Brand Love (love is the emotional pull; trust is confidence the brand is reliable, honest, and acts in your interest).</w:t>
             </w:r>
           </w:p>
           <w:p>
@@ -360,7 +360,7 @@
                 <w:sz w:val="20"/>
                 <w:szCs w:val="20"/>
               </w:rPr>
-              <w:t xml:space="preserve">• Competitors as first-class brands — aggregate benchmarking and per-competitor deep-dives.</w:t>
+              <w:t xml:space="preserve">• A Trust question type (single-item + optional driver battery: reliability, integrity, benevolence, security/privacy), a Trust Index, and trust inferred from open text.</w:t>
             </w:r>
           </w:p>
           <w:p>
@@ -374,7 +374,7 @@
                 <w:sz w:val="20"/>
                 <w:szCs w:val="20"/>
               </w:rPr>
-              <w:t xml:space="preserve">• Feedback collection from public web / review APIs / licensed providers / CSV, under compliance guardrails + a legal-review gate.</w:t>
+              <w:t xml:space="preserve">• A Love × Trust segmentation — Devoted / Infatuated (fragile) / Dependable / At-risk — with a recommended action per quadrant.</w:t>
             </w:r>
           </w:p>
           <w:p>
@@ -388,7 +388,7 @@
                 <w:sz w:val="20"/>
                 <w:szCs w:val="20"/>
               </w:rPr>
-              <w:t xml:space="preserve">• Brand Love scale (Love / Like / Ambiguity / Dislike / Hate) as a question type, a normalized metric, and a benchmark lens.</w:t>
+              <w:t xml:space="preserve">• Grounded in the library: Wardani &amp; Gustia (2016) — trust bridges satisfaction to attachment; Nobre (2011) — passion-love without trust is fragile.</w:t>
             </w:r>
           </w:p>
           <w:p>
@@ -402,7 +402,7 @@
                 <w:sz w:val="20"/>
                 <w:szCs w:val="20"/>
               </w:rPr>
-              <w:t xml:space="preserve">• A new explicit data model (Section 12).</w:t>
+              <w:t xml:space="preserve">  (v2 added: aggregate unified-customer view, competitors, lawful collection under DPS-7, the Brand Love scale, and the data model.)</w:t>
             </w:r>
           </w:p>
         </w:tc>
@@ -1284,7 +1284,7 @@
                 <w:sz w:val="19"/>
                 <w:szCs w:val="19"/>
               </w:rPr>
-              <w:t xml:space="preserve">Themes, sentiment, brand-love, quotes, and competitive position to guide messaging and positioning.</w:t>
+              <w:t xml:space="preserve">Themes, sentiment, brand-love, trust, quotes, and competitive position to guide messaging and positioning.</w:t>
             </w:r>
           </w:p>
         </w:tc>
@@ -1336,7 +1336,7 @@
                 <w:sz w:val="19"/>
                 <w:szCs w:val="19"/>
               </w:rPr>
-              <w:t xml:space="preserve">Early warning on dissatisfaction, drivers of churn, and a way to close the loop with unhappy customers.</w:t>
+              <w:t xml:space="preserve">Early warning on dissatisfaction, eroding trust, drivers of churn, and a way to close the loop.</w:t>
             </w:r>
           </w:p>
         </w:tc>
@@ -1509,7 +1509,7 @@
           <w:sz w:val="26"/>
           <w:szCs w:val="26"/>
         </w:rPr>
-        <w:t xml:space="preserve">Six commitments that shape every design decision.</w:t>
+        <w:t xml:space="preserve">Seven commitments that shape every design decision.</w:t>
       </w:r>
     </w:p>
     <w:p>
@@ -1605,7 +1605,7 @@
           <w:sz w:val="21"/>
           <w:szCs w:val="21"/>
         </w:rPr>
-        <w:t xml:space="preserve">Survey definition — built by an admin or AI-generated from a goal. Question types include the Brand Love scale (Love / Like / Ambiguity / Dislike / Hate).</w:t>
+        <w:t xml:space="preserve">Survey definition — built by an admin or AI-generated. Question types include single-select, multi-select, rating/scale, open text, the Brand Love scale (Love / Like / Ambiguity / Dislike / Hate), and the Trust battery (a single-item trust rating and/or a short driver battery: reliability, integrity, benevolence, security/privacy).</w:t>
       </w:r>
     </w:p>
     <w:p>
@@ -1635,7 +1635,7 @@
           <w:sz w:val="21"/>
           <w:szCs w:val="21"/>
         </w:rPr>
-        <w:t xml:space="preserve">Survey response — ratings (incl. Brand Love), multiple-choice, and open-text comments. May be partial.</w:t>
+        <w:t xml:space="preserve">Survey response — ratings (incl. Brand Love and Trust), multiple-choice, and open-text comments. May be partial.</w:t>
       </w:r>
     </w:p>
     <w:p>
@@ -1665,7 +1665,7 @@
           <w:sz w:val="21"/>
           <w:szCs w:val="21"/>
         </w:rPr>
-        <w:t xml:space="preserve">Conversational response — free-text turns in an AI-led adaptive interview, as a threaded transcript.</w:t>
+        <w:t xml:space="preserve">Conversational response — free-text turns in an AI-led adaptive interview, as a transcript.</w:t>
       </w:r>
     </w:p>
     <w:p>
@@ -1695,7 +1695,7 @@
           <w:sz w:val="21"/>
           <w:szCs w:val="21"/>
         </w:rPr>
-        <w:t xml:space="preserve">Imported feedback — external reviews/ratings/comments for the company’s own brand via CSV (source, timestamp, rating, text).</w:t>
+        <w:t xml:space="preserve">Imported feedback — external reviews/ratings/comments for the company’s own brand via CSV.</w:t>
       </w:r>
     </w:p>
     <w:p>
@@ -1815,7 +1815,7 @@
           <w:sz w:val="21"/>
           <w:szCs w:val="21"/>
         </w:rPr>
-        <w:t xml:space="preserve">Competitor configuration — the set of competitor brands to track: names, aliases, products, and the public sources where their reviews live.</w:t>
+        <w:t xml:space="preserve">Competitor configuration — the competitor brands to track: names, aliases, products, public sources.</w:t>
       </w:r>
     </w:p>
     <w:p>
@@ -1845,7 +1845,7 @@
           <w:sz w:val="21"/>
           <w:szCs w:val="21"/>
         </w:rPr>
-        <w:t xml:space="preserve">Externally-collected feedback — reviews/ratings/comments about the own brand and tracked competitors, from public web pages, review-site APIs, or a licensed provider. Each item carries source URL, capture date, brand, rating, text.</w:t>
+        <w:t xml:space="preserve">Externally-collected feedback — reviews/ratings/comments about the own brand and tracked competitors from public web pages, review-site APIs, or a licensed provider (source URL, capture date, brand, rating, text).</w:t>
       </w:r>
     </w:p>
     <w:p>
@@ -1941,7 +1941,7 @@
           <w:sz w:val="21"/>
           <w:szCs w:val="21"/>
         </w:rPr>
-        <w:t xml:space="preserve">Collected response store — every response (survey, conversational, imported, web-collected) persisted under a common schema, attributable to source, brand, and campaign.</w:t>
+        <w:t xml:space="preserve">Collected response store — every response persisted under a common schema, attributable to source, brand, and campaign.</w:t>
       </w:r>
     </w:p>
     <w:p>
@@ -1971,7 +1971,7 @@
           <w:sz w:val="21"/>
           <w:szCs w:val="21"/>
         </w:rPr>
-        <w:t xml:space="preserve">Theme analysis — AI-generated themes with counts, representative quotes, and trend vs. prior period. Filterable by brand.</w:t>
+        <w:t xml:space="preserve">Theme analysis — AI-generated themes with counts, quotes, and trend; filterable by brand.</w:t>
       </w:r>
     </w:p>
     <w:p>
@@ -2001,7 +2001,7 @@
           <w:sz w:val="21"/>
           <w:szCs w:val="21"/>
         </w:rPr>
-        <w:t xml:space="preserve">Sentiment analysis — positive / neutral / negative with intensity, per response and aggregated by theme, segment, source, brand, and time.</w:t>
+        <w:t xml:space="preserve">Sentiment analysis — positive/neutral/negative with intensity, aggregated by theme, segment, source, brand, and time.</w:t>
       </w:r>
     </w:p>
     <w:p>
@@ -2031,7 +2031,7 @@
           <w:sz w:val="21"/>
           <w:szCs w:val="21"/>
         </w:rPr>
-        <w:t xml:space="preserve">Ratings &amp; metrics — average ratings, distribution, response/completion rates, and NPS/CSAT where questions qualify.</w:t>
+        <w:t xml:space="preserve">Ratings &amp; metrics — average ratings, distribution, response/completion rates, NPS/CSAT.</w:t>
       </w:r>
     </w:p>
     <w:p>
@@ -2061,7 +2061,7 @@
           <w:sz w:val="21"/>
           <w:szCs w:val="21"/>
         </w:rPr>
-        <w:t xml:space="preserve">Insight report — a plain-language narrative of what’s happening, why, and what to do, with ranked actions; can include the competitive picture. Exportable.</w:t>
+        <w:t xml:space="preserve">Insight report — narrative of what’s happening, why, and what to do, with ranked actions; can include the competitive picture and the Love × Trust read. Exportable.</w:t>
       </w:r>
     </w:p>
     <w:p>
@@ -2091,7 +2091,7 @@
           <w:sz w:val="21"/>
           <w:szCs w:val="21"/>
         </w:rPr>
-        <w:t xml:space="preserve">Answer to an analysis query — grounded strictly in the account’s own data, citing the responses used.</w:t>
+        <w:t xml:space="preserve">Answer to an analysis query — grounded strictly in the account’s own data, with citations.</w:t>
       </w:r>
     </w:p>
     <w:p>
@@ -2181,7 +2181,7 @@
           <w:sz w:val="21"/>
           <w:szCs w:val="21"/>
         </w:rPr>
-        <w:t xml:space="preserve">Competitive benchmark — the company’s brand vs. competitors on ratings, Brand Love, sentiment, and themes over a chosen period.</w:t>
+        <w:t xml:space="preserve">Competitive benchmark — own brand vs. competitors on ratings, Brand Love, Trust, sentiment, and themes over a chosen period.</w:t>
       </w:r>
     </w:p>
     <w:p>
@@ -2211,7 +2211,7 @@
           <w:sz w:val="21"/>
           <w:szCs w:val="21"/>
         </w:rPr>
-        <w:t xml:space="preserve">Per-competitor analysis — for a selected competitor, an aggregate view of its customers’ themes, sentiment, ratings, and Brand Love, traceable to underlying public reviews.</w:t>
+        <w:t xml:space="preserve">Per-competitor analysis — for a selected competitor, an aggregate view with traceability.</w:t>
       </w:r>
     </w:p>
     <w:p>
@@ -2241,9 +2241,355 @@
           <w:sz w:val="21"/>
           <w:szCs w:val="21"/>
         </w:rPr>
-        <w:t xml:space="preserve">Brand Love read — the distribution across Love / Like / Ambiguity / Dislike / Hate and a Brand Love Index (share of Love+Like minus share of Dislike+Hate), for the company and per competitor, over time.</w:t>
-      </w:r>
-    </w:p>
+        <w:t xml:space="preserve">Brand Love read — the distribution across Love / Like / Ambiguity / Dislike / Hate and a Brand Love Index (share of Love+Like minus share of Dislike+Hate), per company and competitor, over time.</w:t>
+      </w:r>
+    </w:p>
+    <w:p>
+      <w:pPr>
+        <w:pStyle w:val="ListParagraph"/>
+        <w:numPr>
+          <w:ilvl w:val="0"/>
+          <w:numId w:val="2"/>
+        </w:numPr>
+        <w:spacing w:after="90" w:line="288"/>
+      </w:pPr>
+      <w:r>
+        <w:rPr>
+          <w:rFonts w:ascii="JetBrains Mono" w:cs="JetBrains Mono" w:eastAsia="JetBrains Mono" w:hAnsi="JetBrains Mono"/>
+          <w:b/>
+          <w:bCs/>
+          <w:color w:val="D9763A"/>
+          <w:sz w:val="20"/>
+          <w:szCs w:val="20"/>
+        </w:rPr>
+        <w:t xml:space="preserve">O-12  </w:t>
+      </w:r>
+      <w:r>
+        <w:rPr>
+          <w:rFonts w:ascii="Inter" w:cs="Inter" w:eastAsia="Inter" w:hAnsi="Inter"/>
+          <w:color w:val="1A1D21"/>
+          <w:sz w:val="21"/>
+          <w:szCs w:val="21"/>
+        </w:rPr>
+        <w:t xml:space="preserve">Trust read — a Trust Index (net trust) plus a driver breakdown (reliability, integrity, benevolence, security/privacy), per company and competitor, over time.</w:t>
+      </w:r>
+    </w:p>
+    <w:p>
+      <w:pPr>
+        <w:spacing w:after="90" w:before="200"/>
+      </w:pPr>
+      <w:r>
+        <w:rPr>
+          <w:rFonts w:ascii="Inter" w:cs="Inter" w:eastAsia="Inter" w:hAnsi="Inter"/>
+          <w:b/>
+          <w:bCs/>
+          <w:color w:val="1A1D21"/>
+          <w:sz w:val="22"/>
+          <w:szCs w:val="22"/>
+        </w:rPr>
+        <w:t xml:space="preserve">O-13 — Love × Trust segmentation</w:t>
+      </w:r>
+    </w:p>
+    <w:p>
+      <w:pPr>
+        <w:spacing w:after="140" w:line="300"/>
+      </w:pPr>
+      <w:r>
+        <w:rPr>
+          <w:rFonts w:ascii="Inter" w:cs="Inter" w:eastAsia="Inter" w:hAnsi="Inter"/>
+          <w:color w:val="1A1D21"/>
+          <w:sz w:val="21"/>
+          <w:szCs w:val="21"/>
+        </w:rPr>
+        <w:t xml:space="preserve">Respondents and segments are placed in one of four quadrants, each with a recommended action:</w:t>
+      </w:r>
+    </w:p>
+    <w:tbl>
+      <w:tblPr>
+        <w:tblW w:type="dxa" w:w="9360"/>
+        <w:tblBorders>
+          <w:top w:val="single" w:color="1A1D21" w:sz="12"/>
+          <w:left w:val="none" w:color="auto" w:sz="0"/>
+          <w:bottom w:val="single" w:color="1A1D21" w:sz="12"/>
+          <w:right w:val="none" w:color="auto" w:sz="0"/>
+          <w:insideH w:val="single" w:color="E5E2DA" w:sz="8"/>
+          <w:insideV w:val="none" w:color="auto" w:sz="0"/>
+        </w:tblBorders>
+      </w:tblPr>
+      <w:tblGrid>
+        <w:gridCol w:w="2400"/>
+        <w:gridCol w:w="6960"/>
+      </w:tblGrid>
+      <w:tr>
+        <w:trPr>
+          <w:tblHeader/>
+        </w:trPr>
+        <w:tc>
+          <w:tcPr>
+            <w:tcW w:type="dxa" w:w="2400"/>
+            <w:shd w:fill="E5E2DA" w:color="auto" w:val="clear"/>
+            <w:tcMar>
+              <w:top w:type="dxa" w:w="70"/>
+              <w:left w:type="dxa" w:w="130"/>
+              <w:bottom w:type="dxa" w:w="70"/>
+              <w:right w:type="dxa" w:w="130"/>
+            </w:tcMar>
+          </w:tcPr>
+          <w:p>
+            <w:pPr>
+              <w:spacing w:after="0" w:line="250"/>
+            </w:pPr>
+            <w:r>
+              <w:rPr>
+                <w:rFonts w:ascii="Inter" w:cs="Inter" w:eastAsia="Inter" w:hAnsi="Inter"/>
+                <w:b/>
+                <w:bCs/>
+                <w:color w:val="1A1D21"/>
+                <w:sz w:val="18"/>
+                <w:szCs w:val="18"/>
+              </w:rPr>
+              <w:t xml:space="preserve">Quadrant</w:t>
+            </w:r>
+          </w:p>
+        </w:tc>
+        <w:tc>
+          <w:tcPr>
+            <w:tcW w:type="dxa" w:w="6960"/>
+            <w:shd w:fill="E5E2DA" w:color="auto" w:val="clear"/>
+            <w:tcMar>
+              <w:top w:type="dxa" w:w="70"/>
+              <w:left w:type="dxa" w:w="130"/>
+              <w:bottom w:type="dxa" w:w="70"/>
+              <w:right w:type="dxa" w:w="130"/>
+            </w:tcMar>
+          </w:tcPr>
+          <w:p>
+            <w:pPr>
+              <w:spacing w:after="0" w:line="250"/>
+            </w:pPr>
+            <w:r>
+              <w:rPr>
+                <w:rFonts w:ascii="Inter" w:cs="Inter" w:eastAsia="Inter" w:hAnsi="Inter"/>
+                <w:b/>
+                <w:bCs/>
+                <w:color w:val="1A1D21"/>
+                <w:sz w:val="18"/>
+                <w:szCs w:val="18"/>
+              </w:rPr>
+              <w:t xml:space="preserve">Meaning and recommended action</w:t>
+            </w:r>
+          </w:p>
+        </w:tc>
+      </w:tr>
+      <w:tr>
+        <w:tc>
+          <w:tcPr>
+            <w:tcW w:type="dxa" w:w="2400"/>
+            <w:tcMar>
+              <w:top w:type="dxa" w:w="70"/>
+              <w:left w:type="dxa" w:w="130"/>
+              <w:bottom w:type="dxa" w:w="70"/>
+              <w:right w:type="dxa" w:w="130"/>
+            </w:tcMar>
+          </w:tcPr>
+          <w:p>
+            <w:pPr>
+              <w:spacing w:after="0" w:line="250"/>
+            </w:pPr>
+            <w:r>
+              <w:rPr>
+                <w:rFonts w:ascii="Inter" w:cs="Inter" w:eastAsia="Inter" w:hAnsi="Inter"/>
+                <w:color w:val="1A1D21"/>
+                <w:sz w:val="19"/>
+                <w:szCs w:val="19"/>
+              </w:rPr>
+              <w:t xml:space="preserve">Devoted</w:t>
+            </w:r>
+          </w:p>
+        </w:tc>
+        <w:tc>
+          <w:tcPr>
+            <w:tcW w:type="dxa" w:w="6960"/>
+            <w:tcMar>
+              <w:top w:type="dxa" w:w="70"/>
+              <w:left w:type="dxa" w:w="130"/>
+              <w:bottom w:type="dxa" w:w="70"/>
+              <w:right w:type="dxa" w:w="130"/>
+            </w:tcMar>
+          </w:tcPr>
+          <w:p>
+            <w:pPr>
+              <w:spacing w:after="0" w:line="250"/>
+            </w:pPr>
+            <w:r>
+              <w:rPr>
+                <w:rFonts w:ascii="Inter" w:cs="Inter" w:eastAsia="Inter" w:hAnsi="Inter"/>
+                <w:color w:val="1A1D21"/>
+                <w:sz w:val="19"/>
+                <w:szCs w:val="19"/>
+              </w:rPr>
+              <w:t xml:space="preserve">High love / high trust — your advocates. Protect and activate them.</w:t>
+            </w:r>
+          </w:p>
+        </w:tc>
+      </w:tr>
+      <w:tr>
+        <w:tc>
+          <w:tcPr>
+            <w:tcW w:type="dxa" w:w="2400"/>
+            <w:tcMar>
+              <w:top w:type="dxa" w:w="70"/>
+              <w:left w:type="dxa" w:w="130"/>
+              <w:bottom w:type="dxa" w:w="70"/>
+              <w:right w:type="dxa" w:w="130"/>
+            </w:tcMar>
+          </w:tcPr>
+          <w:p>
+            <w:pPr>
+              <w:spacing w:after="0" w:line="250"/>
+            </w:pPr>
+            <w:r>
+              <w:rPr>
+                <w:rFonts w:ascii="Inter" w:cs="Inter" w:eastAsia="Inter" w:hAnsi="Inter"/>
+                <w:color w:val="1A1D21"/>
+                <w:sz w:val="19"/>
+                <w:szCs w:val="19"/>
+              </w:rPr>
+              <w:t xml:space="preserve">Infatuated (fragile)</w:t>
+            </w:r>
+          </w:p>
+        </w:tc>
+        <w:tc>
+          <w:tcPr>
+            <w:tcW w:type="dxa" w:w="6960"/>
+            <w:tcMar>
+              <w:top w:type="dxa" w:w="70"/>
+              <w:left w:type="dxa" w:w="130"/>
+              <w:bottom w:type="dxa" w:w="70"/>
+              <w:right w:type="dxa" w:w="130"/>
+            </w:tcMar>
+          </w:tcPr>
+          <w:p>
+            <w:pPr>
+              <w:spacing w:after="0" w:line="250"/>
+            </w:pPr>
+            <w:r>
+              <w:rPr>
+                <w:rFonts w:ascii="Inter" w:cs="Inter" w:eastAsia="Inter" w:hAnsi="Inter"/>
+                <w:color w:val="1A1D21"/>
+                <w:sz w:val="19"/>
+                <w:szCs w:val="19"/>
+              </w:rPr>
+              <w:t xml:space="preserve">High love / low trust — passion without a safety net. One stumble triggers churn; shore up reliability and transparency.</w:t>
+            </w:r>
+          </w:p>
+        </w:tc>
+      </w:tr>
+      <w:tr>
+        <w:tc>
+          <w:tcPr>
+            <w:tcW w:type="dxa" w:w="2400"/>
+            <w:tcMar>
+              <w:top w:type="dxa" w:w="70"/>
+              <w:left w:type="dxa" w:w="130"/>
+              <w:bottom w:type="dxa" w:w="70"/>
+              <w:right w:type="dxa" w:w="130"/>
+            </w:tcMar>
+          </w:tcPr>
+          <w:p>
+            <w:pPr>
+              <w:spacing w:after="0" w:line="250"/>
+            </w:pPr>
+            <w:r>
+              <w:rPr>
+                <w:rFonts w:ascii="Inter" w:cs="Inter" w:eastAsia="Inter" w:hAnsi="Inter"/>
+                <w:color w:val="1A1D21"/>
+                <w:sz w:val="19"/>
+                <w:szCs w:val="19"/>
+              </w:rPr>
+              <w:t xml:space="preserve">Dependable</w:t>
+            </w:r>
+          </w:p>
+        </w:tc>
+        <w:tc>
+          <w:tcPr>
+            <w:tcW w:type="dxa" w:w="6960"/>
+            <w:tcMar>
+              <w:top w:type="dxa" w:w="70"/>
+              <w:left w:type="dxa" w:w="130"/>
+              <w:bottom w:type="dxa" w:w="70"/>
+              <w:right w:type="dxa" w:w="130"/>
+            </w:tcMar>
+          </w:tcPr>
+          <w:p>
+            <w:pPr>
+              <w:spacing w:after="0" w:line="250"/>
+            </w:pPr>
+            <w:r>
+              <w:rPr>
+                <w:rFonts w:ascii="Inter" w:cs="Inter" w:eastAsia="Inter" w:hAnsi="Inter"/>
+                <w:color w:val="1A1D21"/>
+                <w:sz w:val="19"/>
+                <w:szCs w:val="19"/>
+              </w:rPr>
+              <w:t xml:space="preserve">Low love / high trust — loyal by reliability, not emotion. Steady; deepen the relationship.</w:t>
+            </w:r>
+          </w:p>
+        </w:tc>
+      </w:tr>
+      <w:tr>
+        <w:tc>
+          <w:tcPr>
+            <w:tcW w:type="dxa" w:w="2400"/>
+            <w:tcMar>
+              <w:top w:type="dxa" w:w="70"/>
+              <w:left w:type="dxa" w:w="130"/>
+              <w:bottom w:type="dxa" w:w="70"/>
+              <w:right w:type="dxa" w:w="130"/>
+            </w:tcMar>
+          </w:tcPr>
+          <w:p>
+            <w:pPr>
+              <w:spacing w:after="0" w:line="250"/>
+            </w:pPr>
+            <w:r>
+              <w:rPr>
+                <w:rFonts w:ascii="Inter" w:cs="Inter" w:eastAsia="Inter" w:hAnsi="Inter"/>
+                <w:color w:val="1A1D21"/>
+                <w:sz w:val="19"/>
+                <w:szCs w:val="19"/>
+              </w:rPr>
+              <w:t xml:space="preserve">At-risk</w:t>
+            </w:r>
+          </w:p>
+        </w:tc>
+        <w:tc>
+          <w:tcPr>
+            <w:tcW w:type="dxa" w:w="6960"/>
+            <w:tcMar>
+              <w:top w:type="dxa" w:w="70"/>
+              <w:left w:type="dxa" w:w="130"/>
+              <w:bottom w:type="dxa" w:w="70"/>
+              <w:right w:type="dxa" w:w="130"/>
+            </w:tcMar>
+          </w:tcPr>
+          <w:p>
+            <w:pPr>
+              <w:spacing w:after="0" w:line="250"/>
+            </w:pPr>
+            <w:r>
+              <w:rPr>
+                <w:rFonts w:ascii="Inter" w:cs="Inter" w:eastAsia="Inter" w:hAnsi="Inter"/>
+                <w:color w:val="1A1D21"/>
+                <w:sz w:val="19"/>
+                <w:szCs w:val="19"/>
+              </w:rPr>
+              <w:t xml:space="preserve">Low love / low trust — churn risk and detractors. Intervene or triage.</w:t>
+            </w:r>
+          </w:p>
+        </w:tc>
+      </w:tr>
+    </w:tbl>
     <w:p>
       <w:pPr>
         <w:spacing w:after="80" w:before="360"/>
@@ -2353,7 +2699,7 @@
           <w:sz w:val="21"/>
           <w:szCs w:val="21"/>
         </w:rPr>
-        <w:t xml:space="preserve">Create a survey with at least: single-select, multi-select, rating/scale, open text, and the Brand Love scale (Love / Like / Ambiguity / Dislike / Hate).</w:t>
+        <w:t xml:space="preserve">Create a survey with at least: single-select, multi-select, rating/scale, open text, the Brand Love scale, and the Trust battery (single-item and/or driver items).</w:t>
       </w:r>
     </w:p>
     <w:p>
@@ -2549,7 +2895,7 @@
           <w:sz w:val="21"/>
           <w:szCs w:val="21"/>
         </w:rPr>
-        <w:t xml:space="preserve">Enable a conversational mode where an AI interviewer asks questions and relevant follow-up probes in natural language.</w:t>
+        <w:t xml:space="preserve">Enable a conversational mode where an AI interviewer asks questions and relevant follow-up probes.</w:t>
       </w:r>
     </w:p>
     <w:p>
@@ -2715,7 +3061,7 @@
           <w:sz w:val="21"/>
           <w:szCs w:val="21"/>
         </w:rPr>
-        <w:t xml:space="preserve">All feedback — survey, conversational, imported, web-collected — is queryable together, filterable by brand, source, campaign, date, segment, rating, sentiment.</w:t>
+        <w:t xml:space="preserve">All feedback is queryable together, filterable by brand, source, campaign, date, segment, rating, sentiment.</w:t>
       </w:r>
     </w:p>
     <w:p>
@@ -2761,7 +3107,7 @@
           <w:sz w:val="22"/>
           <w:szCs w:val="22"/>
         </w:rPr>
-        <w:t xml:space="preserve">Brand Love &amp; metrics</w:t>
+        <w:t xml:space="preserve">Brand Love, Trust &amp; metrics</w:t>
       </w:r>
     </w:p>
     <w:p>
@@ -2851,7 +3197,7 @@
           <w:sz w:val="21"/>
           <w:szCs w:val="21"/>
         </w:rPr>
-        <w:t xml:space="preserve">For every theme, sentiment aggregate, and Brand Love read, open the exact underlying responses (traceability — INV-3).</w:t>
+        <w:t xml:space="preserve">For every theme, sentiment aggregate, Brand Love read, and Trust read, open the exact underlying responses (traceability — INV-3).</w:t>
       </w:r>
     </w:p>
     <w:p>
@@ -2881,7 +3227,97 @@
           <w:sz w:val="21"/>
           <w:szCs w:val="21"/>
         </w:rPr>
-        <w:t xml:space="preserve">Record Brand Love on the five-point scale, normalize to an ordinal, and compute the Brand Love distribution and Index (O-11) — including inferring a Brand Love read from open text where no direct rating exists, clearly labeled as inferred (INV-4).</w:t>
+        <w:t xml:space="preserve">Record Brand Love on the five-point scale, normalize to an ordinal, and compute the Brand Love distribution and Index (O-11) — including inferring a read from open text where no direct rating exists, labeled inferred (INV-4).</w:t>
+      </w:r>
+    </w:p>
+    <w:p>
+      <w:pPr>
+        <w:pStyle w:val="ListParagraph"/>
+        <w:numPr>
+          <w:ilvl w:val="0"/>
+          <w:numId w:val="2"/>
+        </w:numPr>
+        <w:spacing w:after="90" w:line="288"/>
+      </w:pPr>
+      <w:r>
+        <w:rPr>
+          <w:rFonts w:ascii="JetBrains Mono" w:cs="JetBrains Mono" w:eastAsia="JetBrains Mono" w:hAnsi="JetBrains Mono"/>
+          <w:b/>
+          <w:bCs/>
+          <w:color w:val="D9763A"/>
+          <w:sz w:val="20"/>
+          <w:szCs w:val="20"/>
+        </w:rPr>
+        <w:t xml:space="preserve">R-31  </w:t>
+      </w:r>
+      <w:r>
+        <w:rPr>
+          <w:rFonts w:ascii="Inter" w:cs="Inter" w:eastAsia="Inter" w:hAnsi="Inter"/>
+          <w:color w:val="1A1D21"/>
+          <w:sz w:val="21"/>
+          <w:szCs w:val="21"/>
+        </w:rPr>
+        <w:t xml:space="preserve">Support a Trust question type — a single-item trust rating and an optional multi-item driver battery (reliability, integrity, benevolence, security/privacy).</w:t>
+      </w:r>
+    </w:p>
+    <w:p>
+      <w:pPr>
+        <w:pStyle w:val="ListParagraph"/>
+        <w:numPr>
+          <w:ilvl w:val="0"/>
+          <w:numId w:val="2"/>
+        </w:numPr>
+        <w:spacing w:after="90" w:line="288"/>
+      </w:pPr>
+      <w:r>
+        <w:rPr>
+          <w:rFonts w:ascii="JetBrains Mono" w:cs="JetBrains Mono" w:eastAsia="JetBrains Mono" w:hAnsi="JetBrains Mono"/>
+          <w:b/>
+          <w:bCs/>
+          <w:color w:val="D9763A"/>
+          <w:sz w:val="20"/>
+          <w:szCs w:val="20"/>
+        </w:rPr>
+        <w:t xml:space="preserve">R-32  </w:t>
+      </w:r>
+      <w:r>
+        <w:rPr>
+          <w:rFonts w:ascii="Inter" w:cs="Inter" w:eastAsia="Inter" w:hAnsi="Inter"/>
+          <w:color w:val="1A1D21"/>
+          <w:sz w:val="21"/>
+          <w:szCs w:val="21"/>
+        </w:rPr>
+        <w:t xml:space="preserve">Record trust; compute a Trust Index and per-driver breakdown (O-12) for any filtered set — including inferring a trust read from open text where no direct rating exists, labeled inferred (INV-4), the same way Brand Love is inferred (R-30).</w:t>
+      </w:r>
+    </w:p>
+    <w:p>
+      <w:pPr>
+        <w:pStyle w:val="ListParagraph"/>
+        <w:numPr>
+          <w:ilvl w:val="0"/>
+          <w:numId w:val="2"/>
+        </w:numPr>
+        <w:spacing w:after="90" w:line="288"/>
+      </w:pPr>
+      <w:r>
+        <w:rPr>
+          <w:rFonts w:ascii="JetBrains Mono" w:cs="JetBrains Mono" w:eastAsia="JetBrains Mono" w:hAnsi="JetBrains Mono"/>
+          <w:b/>
+          <w:bCs/>
+          <w:color w:val="D9763A"/>
+          <w:sz w:val="20"/>
+          <w:szCs w:val="20"/>
+        </w:rPr>
+        <w:t xml:space="preserve">R-33  </w:t>
+      </w:r>
+      <w:r>
+        <w:rPr>
+          <w:rFonts w:ascii="Inter" w:cs="Inter" w:eastAsia="Inter" w:hAnsi="Inter"/>
+          <w:color w:val="1A1D21"/>
+          <w:sz w:val="21"/>
+          <w:szCs w:val="21"/>
+        </w:rPr>
+        <w:t xml:space="preserve">Produce the Love × Trust segmentation (O-13) with a recommended action per quadrant, available in the insight report (O-5) and the competitive benchmark (O-9).</w:t>
       </w:r>
     </w:p>
     <w:p>
@@ -2927,7 +3363,7 @@
           <w:sz w:val="21"/>
           <w:szCs w:val="21"/>
         </w:rPr>
-        <w:t xml:space="preserve">Produce an aggregate, cross-source "unified customer" view of the account’s customer base — one combined read across all sources and time — WITHOUT building or requiring an identity-linked individual profile (INV-9).</w:t>
+        <w:t xml:space="preserve">Produce an aggregate, cross-source "unified customer" view WITHOUT building or requiring an identity-linked individual profile (INV-9).</w:t>
       </w:r>
     </w:p>
     <w:p>
@@ -2987,7 +3423,7 @@
           <w:sz w:val="21"/>
           <w:szCs w:val="21"/>
         </w:rPr>
-        <w:t xml:space="preserve">Collect publicly available reviews/ratings/comments about the own brand and tracked competitors from configured sources (review APIs, licensed provider, and/or public web) — subject to §10 (DPS-7) and a legal-review gate before live collection is enabled.</w:t>
+        <w:t xml:space="preserve">Collect publicly available reviews/ratings/comments about the own brand and tracked competitors from configured sources, subject to §10 (DPS-7) and a legal-review gate before live collection is enabled.</w:t>
       </w:r>
     </w:p>
     <w:p>
@@ -3017,7 +3453,7 @@
           <w:sz w:val="21"/>
           <w:szCs w:val="21"/>
         </w:rPr>
-        <w:t xml:space="preserve">Benchmark the company’s brand vs. competitors on ratings, Brand Love, sentiment, and themes over a chosen period (O-9).</w:t>
+        <w:t xml:space="preserve">Benchmark the company’s brand vs. competitors on ratings, Brand Love, Trust, sentiment, and themes over a chosen period (O-9).</w:t>
       </w:r>
     </w:p>
     <w:p>
@@ -3047,7 +3483,7 @@
           <w:sz w:val="21"/>
           <w:szCs w:val="21"/>
         </w:rPr>
-        <w:t xml:space="preserve">For a selected competitor, produce per-competitor aggregate analysis (O-10) traceable to underlying public reviews.</w:t>
+        <w:t xml:space="preserve">For a selected competitor, produce per-competitor aggregate analysis (O-10) with traceability.</w:t>
       </w:r>
     </w:p>
     <w:p>
@@ -3153,7 +3589,7 @@
           <w:sz w:val="21"/>
           <w:szCs w:val="21"/>
         </w:rPr>
-        <w:t xml:space="preserve">Generate an insight report: narrative, metrics, top themes, sentiment, Brand Love, competitive comparison, quotes, ranked actions.</w:t>
+        <w:t xml:space="preserve">Generate an insight report: narrative, metrics, top themes, sentiment, Brand Love, Trust and the Love × Trust read, competitive comparison, quotes, ranked actions.</w:t>
       </w:r>
     </w:p>
     <w:p>
@@ -3213,7 +3649,7 @@
           <w:sz w:val="21"/>
           <w:szCs w:val="21"/>
         </w:rPr>
-        <w:t xml:space="preserve">Configure an alert on a signal (negative-sentiment share, average rating, Brand Love Index, new theme) with notification when crossed.</w:t>
+        <w:t xml:space="preserve">Configure an alert on a signal (negative-sentiment share, average rating, Brand Love Index, Trust Index, new theme) with notification when crossed.</w:t>
       </w:r>
     </w:p>
     <w:p>
@@ -3273,7 +3709,7 @@
           <w:sz w:val="21"/>
           <w:szCs w:val="21"/>
         </w:rPr>
-        <w:t xml:space="preserve">Export any analysis view and the insight report (CSV for raw data; PDF and/or slides for the report).</w:t>
+        <w:t xml:space="preserve">Export any analysis view and the insight report (CSV for raw data; PDF and/or slides).</w:t>
       </w:r>
     </w:p>
     <w:p>
@@ -3459,7 +3895,7 @@
           <w:sz w:val="21"/>
           <w:szCs w:val="21"/>
         </w:rPr>
-        <w:t xml:space="preserve">Every theme, aggregate, Brand Love read, insight, recommendation, and query answer is traceable to its underlying responses. No AI claim without a path to its verbatim data.</w:t>
+        <w:t xml:space="preserve">Every theme, aggregate, Brand Love read, Trust read, insight, recommendation, and query answer is traceable to its underlying responses. No AI claim without a path to its verbatim data.</w:t>
       </w:r>
     </w:p>
     <w:p>
@@ -3489,7 +3925,7 @@
           <w:sz w:val="21"/>
           <w:szCs w:val="21"/>
         </w:rPr>
-        <w:t xml:space="preserve">The system never shows a quote or statistic absent from the data, and labels any value it inferred (e.g., Brand Love from text) as inferred, not stated.</w:t>
+        <w:t xml:space="preserve">The system never shows a quote or statistic absent from the data, and labels any value it inferred (e.g., Brand Love or Trust from text) as inferred, not stated.</w:t>
       </w:r>
     </w:p>
     <w:p>
@@ -3519,7 +3955,7 @@
           <w:sz w:val="21"/>
           <w:szCs w:val="21"/>
         </w:rPr>
-        <w:t xml:space="preserve">A respondent can complete a survey without providing identifying information; identity is never required.</w:t>
+        <w:t xml:space="preserve">A respondent can complete a survey without providing identifying information.</w:t>
       </w:r>
     </w:p>
     <w:p>
@@ -3639,7 +4075,7 @@
           <w:sz w:val="21"/>
           <w:szCs w:val="21"/>
         </w:rPr>
-        <w:t xml:space="preserve">The "unified customer" view is always aggregate. The system does not construct or expose an identity-resolved profile of any individual — customer or competitor customer.</w:t>
+        <w:t xml:space="preserve">The "unified customer" view is always aggregate; no identity-resolved profile of any individual.</w:t>
       </w:r>
     </w:p>
     <w:p>
@@ -3669,7 +4105,7 @@
           <w:sz w:val="21"/>
           <w:szCs w:val="21"/>
         </w:rPr>
-        <w:t xml:space="preserve">Externally-collected data is only ever publicly available and lawfully obtained. The system never bypasses authentication, paywalls, or technical controls, and keeps provenance (source, URL, capture date) on every item.</w:t>
+        <w:t xml:space="preserve">Externally-collected data is only ever publicly available and lawfully obtained; no bypassing authentication, paywalls, or technical controls; provenance kept on every item.</w:t>
       </w:r>
     </w:p>
     <w:p>
@@ -3699,7 +4135,37 @@
           <w:sz w:val="21"/>
           <w:szCs w:val="21"/>
         </w:rPr>
-        <w:t xml:space="preserve">Personal data in public reviews (names, handles) is minimized, never used to build a profile, and excluded from AI outputs by default.</w:t>
+        <w:t xml:space="preserve">Personal data in public reviews is minimized, never used to build a profile, and excluded from AI outputs by default.</w:t>
+      </w:r>
+    </w:p>
+    <w:p>
+      <w:pPr>
+        <w:pStyle w:val="ListParagraph"/>
+        <w:numPr>
+          <w:ilvl w:val="0"/>
+          <w:numId w:val="2"/>
+        </w:numPr>
+        <w:spacing w:after="90" w:line="288"/>
+      </w:pPr>
+      <w:r>
+        <w:rPr>
+          <w:rFonts w:ascii="JetBrains Mono" w:cs="JetBrains Mono" w:eastAsia="JetBrains Mono" w:hAnsi="JetBrains Mono"/>
+          <w:b/>
+          <w:bCs/>
+          <w:color w:val="D9763A"/>
+          <w:sz w:val="20"/>
+          <w:szCs w:val="20"/>
+        </w:rPr>
+        <w:t xml:space="preserve">INV-12  </w:t>
+      </w:r>
+      <w:r>
+        <w:rPr>
+          <w:rFonts w:ascii="Inter" w:cs="Inter" w:eastAsia="Inter" w:hAnsi="Inter"/>
+          <w:color w:val="1A1D21"/>
+          <w:sz w:val="21"/>
+          <w:szCs w:val="21"/>
+        </w:rPr>
+        <w:t xml:space="preserve">Brand Love and Brand Trust are measured and reported as DISTINCT indicators. The system never collapses them into a single score, and never presents Trust as satisfaction (or vice versa).</w:t>
       </w:r>
     </w:p>
     <w:p>
@@ -3795,7 +4261,7 @@
           <w:sz w:val="21"/>
           <w:szCs w:val="21"/>
         </w:rPr>
-        <w:t xml:space="preserve">Empty or tiny sample — states the sample is too small rather than fabricating confidence.</w:t>
+        <w:t xml:space="preserve">Empty or tiny sample — states the sample is too small for reliable findings (themes, sentiment, Brand Love, or Trust) rather than fabricating confidence.</w:t>
       </w:r>
     </w:p>
     <w:p>
@@ -4125,7 +4591,7 @@
           <w:sz w:val="21"/>
           <w:szCs w:val="21"/>
         </w:rPr>
-        <w:t xml:space="preserve">Source blocks or rate-limits collection — collection backs off, records the gap, never fabricates missing items; coverage/freshness shown honestly.</w:t>
+        <w:t xml:space="preserve">Source blocks or rate-limits collection — collection backs off, records the gap, never fabricates missing items.</w:t>
       </w:r>
     </w:p>
     <w:p>
@@ -4155,7 +4621,7 @@
           <w:sz w:val="21"/>
           <w:szCs w:val="21"/>
         </w:rPr>
-        <w:t xml:space="preserve">Competitor identity ambiguity — reviews that may belong to a same-named different entity are flagged low-confidence and excluded from headline figures until confirmed.</w:t>
+        <w:t xml:space="preserve">Competitor identity ambiguity — low-confidence matches flagged and excluded from headline figures until confirmed.</w:t>
       </w:r>
     </w:p>
     <w:p>
@@ -4215,7 +4681,37 @@
           <w:sz w:val="21"/>
           <w:szCs w:val="21"/>
         </w:rPr>
-        <w:t xml:space="preserve">Mixed rating scales — 5-star, 10-point, thumbs, Brand Love each normalized to the common scale; un-mappable ratings stored raw and excluded from cross-source averages.</w:t>
+        <w:t xml:space="preserve">Mixed rating scales — 5-star, 10-point, thumbs, Brand Love, Trust each normalized to the common scale; un-mappable ratings stored raw and excluded from cross-source averages.</w:t>
+      </w:r>
+    </w:p>
+    <w:p>
+      <w:pPr>
+        <w:pStyle w:val="ListParagraph"/>
+        <w:numPr>
+          <w:ilvl w:val="0"/>
+          <w:numId w:val="2"/>
+        </w:numPr>
+        <w:spacing w:after="90" w:line="288"/>
+      </w:pPr>
+      <w:r>
+        <w:rPr>
+          <w:rFonts w:ascii="JetBrains Mono" w:cs="JetBrains Mono" w:eastAsia="JetBrains Mono" w:hAnsi="JetBrains Mono"/>
+          <w:b/>
+          <w:bCs/>
+          <w:color w:val="D9763A"/>
+          <w:sz w:val="20"/>
+          <w:szCs w:val="20"/>
+        </w:rPr>
+        <w:t xml:space="preserve">E-16  </w:t>
+      </w:r>
+      <w:r>
+        <w:rPr>
+          <w:rFonts w:ascii="Inter" w:cs="Inter" w:eastAsia="Inter" w:hAnsi="Inter"/>
+          <w:color w:val="1A1D21"/>
+          <w:sz w:val="21"/>
+          <w:szCs w:val="21"/>
+        </w:rPr>
+        <w:t xml:space="preserve">Category-relative trust — the Trust Index is read relative to category and prior period, not as an absolute (a bank’s trust bar differs from a snack brand’s). Cross-category trust comparisons are flagged as context-dependent.</w:t>
       </w:r>
     </w:p>
     <w:p>
@@ -4311,7 +4807,7 @@
           <w:sz w:val="21"/>
           <w:szCs w:val="21"/>
         </w:rPr>
-        <w:t xml:space="preserve">Not a CRM or customer-record system; stores feedback, not a system of record, and does not build identity-resolved individual profiles.</w:t>
+        <w:t xml:space="preserve">Not a CRM or customer-record system; does not build identity-resolved individual profiles.</w:t>
       </w:r>
     </w:p>
     <w:p>
@@ -4371,7 +4867,7 @@
           <w:sz w:val="21"/>
           <w:szCs w:val="21"/>
         </w:rPr>
-        <w:t xml:space="preserve">Collection is limited to publicly available content obtained lawfully via APIs, licensed providers, or public web pages under the DPS-7 guardrails. The system does NOT access private/authenticated content, bypass logins or paywalls, circumvent technical protections, or collect data a source’s terms prohibit.</w:t>
+        <w:t xml:space="preserve">Collection is limited to publicly available content obtained lawfully via APIs, licensed providers, or public web pages under the DPS-7 guardrails. No private/authenticated content, bypassing logins/paywalls/protections, or collecting data a source’s terms prohibit.</w:t>
       </w:r>
     </w:p>
     <w:p>
@@ -4431,7 +4927,7 @@
           <w:sz w:val="21"/>
           <w:szCs w:val="21"/>
         </w:rPr>
-        <w:t xml:space="preserve">No public respondent panel / audience marketplace; the company brings its own audience.</w:t>
+        <w:t xml:space="preserve">No public respondent panel / audience marketplace.</w:t>
       </w:r>
     </w:p>
     <w:p>
@@ -4461,7 +4957,7 @@
           <w:sz w:val="21"/>
           <w:szCs w:val="21"/>
         </w:rPr>
-        <w:t xml:space="preserve">Does not replace human research judgment; it is decision support, with every AI output shown alongside its evidence.</w:t>
+        <w:t xml:space="preserve">Does not replace human research judgment; it is decision support with evidence attached.</w:t>
       </w:r>
     </w:p>
     <w:p>
@@ -4491,7 +4987,7 @@
           <w:sz w:val="21"/>
           <w:szCs w:val="21"/>
         </w:rPr>
-        <w:t xml:space="preserve">Does not attempt to re-identify individuals, link competitor reviewers to real people, or merge scraped personal data into any profile.</w:t>
+        <w:t xml:space="preserve">Does not attempt to re-identify individuals or merge scraped personal data into any profile.</w:t>
       </w:r>
     </w:p>
     <w:p>
@@ -4737,7 +5233,7 @@
           <w:sz w:val="21"/>
           <w:szCs w:val="21"/>
         </w:rPr>
-        <w:t xml:space="preserve">The full security checklist (input validation, authz/authn, secret handling) is applied during build and verification.</w:t>
+        <w:t xml:space="preserve">The full security checklist is applied during build and verification. (Security/privacy is also a Trust driver measured in O-12 — how safe customers feel is part of the trust picture.)</w:t>
       </w:r>
     </w:p>
     <w:p>
@@ -4753,7 +5249,7 @@
           <w:sz w:val="22"/>
           <w:szCs w:val="22"/>
         </w:rPr>
-        <w:t xml:space="preserve">DPS-7 — Web / data-collection compliance (v2)</w:t>
+        <w:t xml:space="preserve">DPS-7 — Web / data-collection compliance</w:t>
       </w:r>
     </w:p>
     <w:tbl>
@@ -5115,7 +5611,7 @@
           <w:sz w:val="21"/>
           <w:szCs w:val="21"/>
         </w:rPr>
-        <w:t xml:space="preserve">Explainability — every AI output carries the data behind it and, where meaningful, a confidence signal.</w:t>
+        <w:t xml:space="preserve">Explainability — every AI output carries the data behind it and a confidence signal, including inferred Brand Love and Trust reads.</w:t>
       </w:r>
     </w:p>
     <w:p>
@@ -5145,7 +5641,7 @@
           <w:sz w:val="21"/>
           <w:szCs w:val="21"/>
         </w:rPr>
-        <w:t xml:space="preserve">Collection freshness &amp; politeness — collected data shows a freshness/coverage indicator; collection runs at a polite, configurable rate and records gaps rather than guessing.</w:t>
+        <w:t xml:space="preserve">Collection freshness &amp; politeness — collected data shows a freshness/coverage indicator; collection runs at a polite, configurable rate and records gaps.</w:t>
       </w:r>
     </w:p>
     <w:p>
@@ -5916,7 +6412,7 @@
           <w:sz w:val="20"/>
           <w:szCs w:val="20"/>
         </w:rPr>
-        <w:t xml:space="preserve">  — the core record — one rating and/or comment about one brand (the "database of brand ratings, date, comments")</w:t>
+        <w:t xml:space="preserve">  — the core record — one rating and/or comment about one brand</w:t>
       </w:r>
     </w:p>
     <w:tbl>
@@ -6303,7 +6799,7 @@
                 <w:sz w:val="19"/>
                 <w:szCs w:val="19"/>
               </w:rPr>
-              <w:t xml:space="preserve">Original rating and its scale (5_star, 10_pt, nps, csat, brand_love, …)</w:t>
+              <w:t xml:space="preserve">Original rating and its scale (5_star, 10_pt, nps, csat, brand_love, trust, …)</w:t>
             </w:r>
           </w:p>
         </w:tc>
@@ -6408,6 +6904,110 @@
                 <w:szCs w:val="19"/>
               </w:rPr>
               <w:t xml:space="preserve">Love / Like / Ambiguity / Dislike / Hate, if applicable — ordinal 5→1</w:t>
+            </w:r>
+          </w:p>
+        </w:tc>
+      </w:tr>
+      <w:tr>
+        <w:tc>
+          <w:tcPr>
+            <w:tcW w:type="dxa" w:w="2700"/>
+            <w:tcMar>
+              <w:top w:type="dxa" w:w="70"/>
+              <w:left w:type="dxa" w:w="130"/>
+              <w:bottom w:type="dxa" w:w="70"/>
+              <w:right w:type="dxa" w:w="130"/>
+            </w:tcMar>
+          </w:tcPr>
+          <w:p>
+            <w:pPr>
+              <w:spacing w:after="0" w:line="250"/>
+            </w:pPr>
+            <w:r>
+              <w:rPr>
+                <w:rFonts w:ascii="JetBrains Mono" w:cs="JetBrains Mono" w:eastAsia="JetBrains Mono" w:hAnsi="JetBrains Mono"/>
+                <w:color w:val="1A1D21"/>
+                <w:sz w:val="19"/>
+                <w:szCs w:val="19"/>
+              </w:rPr>
+              <w:t xml:space="preserve">trust  (v3)</w:t>
+            </w:r>
+          </w:p>
+        </w:tc>
+        <w:tc>
+          <w:tcPr>
+            <w:tcW w:type="dxa" w:w="6660"/>
+            <w:tcMar>
+              <w:top w:type="dxa" w:w="70"/>
+              <w:left w:type="dxa" w:w="130"/>
+              <w:bottom w:type="dxa" w:w="70"/>
+              <w:right w:type="dxa" w:w="130"/>
+            </w:tcMar>
+          </w:tcPr>
+          <w:p>
+            <w:pPr>
+              <w:spacing w:after="0" w:line="250"/>
+            </w:pPr>
+            <w:r>
+              <w:rPr>
+                <w:rFonts w:ascii="Inter" w:cs="Inter" w:eastAsia="Inter" w:hAnsi="Inter"/>
+                <w:color w:val="1A1D21"/>
+                <w:sz w:val="19"/>
+                <w:szCs w:val="19"/>
+              </w:rPr>
+              <w:t xml:space="preserve">Trust rating if directly asked — normalized 1–5</w:t>
+            </w:r>
+          </w:p>
+        </w:tc>
+      </w:tr>
+      <w:tr>
+        <w:tc>
+          <w:tcPr>
+            <w:tcW w:type="dxa" w:w="2700"/>
+            <w:tcMar>
+              <w:top w:type="dxa" w:w="70"/>
+              <w:left w:type="dxa" w:w="130"/>
+              <w:bottom w:type="dxa" w:w="70"/>
+              <w:right w:type="dxa" w:w="130"/>
+            </w:tcMar>
+          </w:tcPr>
+          <w:p>
+            <w:pPr>
+              <w:spacing w:after="0" w:line="250"/>
+            </w:pPr>
+            <w:r>
+              <w:rPr>
+                <w:rFonts w:ascii="JetBrains Mono" w:cs="JetBrains Mono" w:eastAsia="JetBrains Mono" w:hAnsi="JetBrains Mono"/>
+                <w:color w:val="1A1D21"/>
+                <w:sz w:val="19"/>
+                <w:szCs w:val="19"/>
+              </w:rPr>
+              <w:t xml:space="preserve">trust_drivers  (v3)</w:t>
+            </w:r>
+          </w:p>
+        </w:tc>
+        <w:tc>
+          <w:tcPr>
+            <w:tcW w:type="dxa" w:w="6660"/>
+            <w:tcMar>
+              <w:top w:type="dxa" w:w="70"/>
+              <w:left w:type="dxa" w:w="130"/>
+              <w:bottom w:type="dxa" w:w="70"/>
+              <w:right w:type="dxa" w:w="130"/>
+            </w:tcMar>
+          </w:tcPr>
+          <w:p>
+            <w:pPr>
+              <w:spacing w:after="0" w:line="250"/>
+            </w:pPr>
+            <w:r>
+              <w:rPr>
+                <w:rFonts w:ascii="Inter" w:cs="Inter" w:eastAsia="Inter" w:hAnsi="Inter"/>
+                <w:color w:val="1A1D21"/>
+                <w:sz w:val="19"/>
+                <w:szCs w:val="19"/>
+              </w:rPr>
+              <w:t xml:space="preserve">Optional per-driver scores/tags: reliability, integrity, benevolence, security_privacy</w:t>
             </w:r>
           </w:p>
         </w:tc>
@@ -6999,7 +7599,7 @@
           <w:sz w:val="22"/>
           <w:szCs w:val="22"/>
         </w:rPr>
-        <w:t xml:space="preserve">Theme / ThemeAssignment</w:t>
+        <w:t xml:space="preserve">Trust  (v3)</w:t>
       </w:r>
       <w:r>
         <w:rPr>
@@ -7010,7 +7610,7 @@
           <w:sz w:val="20"/>
           <w:szCs w:val="20"/>
         </w:rPr>
-        <w:t xml:space="preserve">  — discovered topics and their links to records</w:t>
+        <w:t xml:space="preserve">  — derived, one per record where trust is present or inferred</w:t>
       </w:r>
     </w:p>
     <w:tbl>
@@ -7112,7 +7712,7 @@
                 <w:sz w:val="19"/>
                 <w:szCs w:val="19"/>
               </w:rPr>
-              <w:t xml:space="preserve">theme_id / label</w:t>
+              <w:t xml:space="preserve">record_id</w:t>
             </w:r>
           </w:p>
         </w:tc>
@@ -7137,7 +7737,7 @@
                 <w:sz w:val="19"/>
                 <w:szCs w:val="19"/>
               </w:rPr>
-              <w:t xml:space="preserve">The theme and its plain-language name</w:t>
+              <w:t xml:space="preserve">The record it describes</w:t>
             </w:r>
           </w:p>
         </w:tc>
@@ -7164,7 +7764,7 @@
                 <w:sz w:val="19"/>
                 <w:szCs w:val="19"/>
               </w:rPr>
-              <w:t xml:space="preserve">scope</w:t>
+              <w:t xml:space="preserve">trust_score</w:t>
             </w:r>
           </w:p>
         </w:tc>
@@ -7189,7 +7789,7 @@
                 <w:sz w:val="19"/>
                 <w:szCs w:val="19"/>
               </w:rPr>
-              <w:t xml:space="preserve">Account + optional brand / period it was derived in</w:t>
+              <w:t xml:space="preserve">Normalized trust value</w:t>
             </w:r>
           </w:p>
         </w:tc>
@@ -7216,7 +7816,7 @@
                 <w:sz w:val="19"/>
                 <w:szCs w:val="19"/>
               </w:rPr>
-              <w:t xml:space="preserve">record_id → theme_id</w:t>
+              <w:t xml:space="preserve">drivers</w:t>
             </w:r>
           </w:p>
         </w:tc>
@@ -7241,7 +7841,111 @@
                 <w:sz w:val="19"/>
                 <w:szCs w:val="19"/>
               </w:rPr>
-              <w:t xml:space="preserve">Which records mention the theme, with confidence</w:t>
+              <w:t xml:space="preserve">reliability / integrity / benevolence / security_privacy sub-scores</w:t>
+            </w:r>
+          </w:p>
+        </w:tc>
+      </w:tr>
+      <w:tr>
+        <w:tc>
+          <w:tcPr>
+            <w:tcW w:type="dxa" w:w="2700"/>
+            <w:tcMar>
+              <w:top w:type="dxa" w:w="70"/>
+              <w:left w:type="dxa" w:w="130"/>
+              <w:bottom w:type="dxa" w:w="70"/>
+              <w:right w:type="dxa" w:w="130"/>
+            </w:tcMar>
+          </w:tcPr>
+          <w:p>
+            <w:pPr>
+              <w:spacing w:after="0" w:line="250"/>
+            </w:pPr>
+            <w:r>
+              <w:rPr>
+                <w:rFonts w:ascii="JetBrains Mono" w:cs="JetBrains Mono" w:eastAsia="JetBrains Mono" w:hAnsi="JetBrains Mono"/>
+                <w:color w:val="1A1D21"/>
+                <w:sz w:val="19"/>
+                <w:szCs w:val="19"/>
+              </w:rPr>
+              <w:t xml:space="preserve">model_version / confidence</w:t>
+            </w:r>
+          </w:p>
+        </w:tc>
+        <w:tc>
+          <w:tcPr>
+            <w:tcW w:type="dxa" w:w="6660"/>
+            <w:tcMar>
+              <w:top w:type="dxa" w:w="70"/>
+              <w:left w:type="dxa" w:w="130"/>
+              <w:bottom w:type="dxa" w:w="70"/>
+              <w:right w:type="dxa" w:w="130"/>
+            </w:tcMar>
+          </w:tcPr>
+          <w:p>
+            <w:pPr>
+              <w:spacing w:after="0" w:line="250"/>
+            </w:pPr>
+            <w:r>
+              <w:rPr>
+                <w:rFonts w:ascii="Inter" w:cs="Inter" w:eastAsia="Inter" w:hAnsi="Inter"/>
+                <w:color w:val="1A1D21"/>
+                <w:sz w:val="19"/>
+                <w:szCs w:val="19"/>
+              </w:rPr>
+              <w:t xml:space="preserve">What produced it and how sure (NFR-6)</w:t>
+            </w:r>
+          </w:p>
+        </w:tc>
+      </w:tr>
+      <w:tr>
+        <w:tc>
+          <w:tcPr>
+            <w:tcW w:type="dxa" w:w="2700"/>
+            <w:tcMar>
+              <w:top w:type="dxa" w:w="70"/>
+              <w:left w:type="dxa" w:w="130"/>
+              <w:bottom w:type="dxa" w:w="70"/>
+              <w:right w:type="dxa" w:w="130"/>
+            </w:tcMar>
+          </w:tcPr>
+          <w:p>
+            <w:pPr>
+              <w:spacing w:after="0" w:line="250"/>
+            </w:pPr>
+            <w:r>
+              <w:rPr>
+                <w:rFonts w:ascii="JetBrains Mono" w:cs="JetBrains Mono" w:eastAsia="JetBrains Mono" w:hAnsi="JetBrains Mono"/>
+                <w:color w:val="1A1D21"/>
+                <w:sz w:val="19"/>
+                <w:szCs w:val="19"/>
+              </w:rPr>
+              <w:t xml:space="preserve">inferred</w:t>
+            </w:r>
+          </w:p>
+        </w:tc>
+        <w:tc>
+          <w:tcPr>
+            <w:tcW w:type="dxa" w:w="6660"/>
+            <w:tcMar>
+              <w:top w:type="dxa" w:w="70"/>
+              <w:left w:type="dxa" w:w="130"/>
+              <w:bottom w:type="dxa" w:w="70"/>
+              <w:right w:type="dxa" w:w="130"/>
+            </w:tcMar>
+          </w:tcPr>
+          <w:p>
+            <w:pPr>
+              <w:spacing w:after="0" w:line="250"/>
+            </w:pPr>
+            <w:r>
+              <w:rPr>
+                <w:rFonts w:ascii="Inter" w:cs="Inter" w:eastAsia="Inter" w:hAnsi="Inter"/>
+                <w:color w:val="1A1D21"/>
+                <w:sz w:val="19"/>
+                <w:szCs w:val="19"/>
+              </w:rPr>
+              <w:t xml:space="preserve">True if derived from open text rather than a direct rating (INV-4)</w:t>
             </w:r>
           </w:p>
         </w:tc>
@@ -7271,7 +7975,7 @@
           <w:sz w:val="20"/>
           <w:szCs w:val="20"/>
         </w:rPr>
-        <w:t xml:space="preserve">  — a computed rollup for a brand over a period and filter (O-4, O-9, O-11)</w:t>
+        <w:t xml:space="preserve">  — a computed rollup for a brand over a period and filter (O-4, O-9, O-11, O-12)</w:t>
       </w:r>
     </w:p>
     <w:tbl>
@@ -7450,7 +8154,7 @@
                 <w:sz w:val="19"/>
                 <w:szCs w:val="19"/>
               </w:rPr>
-              <w:t xml:space="preserve">avg_rating · nps · csat · brand_love_index · neg_sentiment_share · response_rate · completion_rate</w:t>
+              <w:t xml:space="preserve">avg_rating · nps · csat · brand_love_index · trust_index (v3) · trust_&lt;driver&gt; (v3) · neg_sentiment_share · response_rate · completion_rate</w:t>
             </w:r>
           </w:p>
         </w:tc>
@@ -7512,31 +8216,6 @@
       <w:pPr>
         <w:spacing w:before="200"/>
       </w:pPr>
-    </w:p>
-    <w:p>
-      <w:pPr>
-        <w:spacing w:after="140" w:line="300"/>
-      </w:pPr>
-      <w:r>
-        <w:rPr>
-          <w:rFonts w:ascii="Inter" w:cs="Inter" w:eastAsia="Inter" w:hAnsi="Inter"/>
-          <w:b/>
-          <w:bCs/>
-          <w:color w:val="1A1D21"/>
-          <w:sz w:val="21"/>
-          <w:szCs w:val="21"/>
-        </w:rPr>
-        <w:t xml:space="preserve">Supporting records: </w:t>
-      </w:r>
-      <w:r>
-        <w:rPr>
-          <w:rFonts w:ascii="Inter" w:cs="Inter" w:eastAsia="Inter" w:hAnsi="Inter"/>
-          <w:color w:val="1A1D21"/>
-          <w:sz w:val="21"/>
-          <w:szCs w:val="21"/>
-        </w:rPr>
-        <w:t xml:space="preserve">Survey/Campaign (config, status, owning brand), Segment (the named filter the unified-customer view aggregates by), Alert (signal + threshold + brand scope), and Account/User/Role (tenancy and permissions).</w:t>
-      </w:r>
     </w:p>
     <w:tbl>
       <w:tblPr>
@@ -7578,7 +8257,7 @@
                 <w:sz w:val="20"/>
                 <w:szCs w:val="20"/>
               </w:rPr>
-              <w:t xml:space="preserve">On the "unified customer" view (R-26, INV-9)</w:t>
+              <w:t xml:space="preserve">Love × Trust segment (v3)  &amp;  the "unified customer" view</w:t>
             </w:r>
           </w:p>
           <w:p>
@@ -7592,7 +8271,7 @@
                 <w:sz w:val="20"/>
                 <w:szCs w:val="20"/>
               </w:rPr>
-              <w:t xml:space="preserve">There is deliberately NO individual-Customer entity holding a person’s identity across records.</w:t>
+              <w:t xml:space="preserve">Love × Trust segment — computed from the Brand Love and Trust metrics for a brand/segment; each respondent or segment falls in one quadrant (Devoted / Infatuated / Dependable / At-risk) with counts and shares (O-13).</w:t>
             </w:r>
           </w:p>
           <w:p>
@@ -7606,7 +8285,7 @@
                 <w:sz w:val="20"/>
                 <w:szCs w:val="20"/>
               </w:rPr>
-              <w:t xml:space="preserve">The unified view is produced by aggregating FeedbackRecords for an own brand across all sources and time, grouped by Segment — a population read, not a person read.</w:t>
+              <w:t xml:space="preserve">Unified customer view — there is deliberately NO individual-Customer entity. It aggregates FeedbackRecords for an own brand across all sources and time, grouped by Segment — a population read, not a person read (R-26, INV-9).</w:t>
             </w:r>
           </w:p>
         </w:tc>
@@ -7732,7 +8411,7 @@
                 <w:sz w:val="20"/>
                 <w:szCs w:val="20"/>
               </w:rPr>
-              <w:t xml:space="preserve">• Survey builder: core types + Brand Love scale + conditional logic (R-1, R-3, R-30)  •  AI-drafted survey (R-2)</w:t>
+              <w:t xml:space="preserve">• Survey builder: core types + Brand Love scale + Trust battery + conditional logic (R-1, R-3, R-30, R-31)  •  AI-drafted survey (R-2)</w:t>
             </w:r>
           </w:p>
           <w:p>
@@ -7788,7 +8467,7 @@
                 <w:sz w:val="20"/>
                 <w:szCs w:val="20"/>
               </w:rPr>
-              <w:t xml:space="preserve">• AI theme + sentiment + Brand Love with traceability (R-14–R-16, R-30)</w:t>
+              <w:t xml:space="preserve">• AI theme + sentiment + Brand Love + Trust with traceability (R-14–R-16, R-30, R-32)</w:t>
             </w:r>
           </w:p>
           <w:p>
@@ -7802,7 +8481,7 @@
                 <w:sz w:val="20"/>
                 <w:szCs w:val="20"/>
               </w:rPr>
-              <w:t xml:space="preserve">• Core metrics incl. NPS/CSAT + Brand Love Index (R-19, O-11)  •  Insight report with ranked actions (R-18, R-22)</w:t>
+              <w:t xml:space="preserve">• Core metrics incl. NPS/CSAT + Brand Love Index + Trust Index (R-19, O-11, O-12)</w:t>
             </w:r>
           </w:p>
           <w:p>
@@ -7816,7 +8495,21 @@
                 <w:sz w:val="20"/>
                 <w:szCs w:val="20"/>
               </w:rPr>
-              <w:t xml:space="preserve">• Two roles, account isolation, data export/delete (R-21, R-23, INV-6, INV-7)</w:t>
+              <w:t xml:space="preserve">• Love × Trust segmentation with recommended actions (R-33, O-13)</w:t>
+            </w:r>
+          </w:p>
+          <w:p>
+            <w:pPr>
+              <w:spacing w:after="40" w:line="276"/>
+            </w:pPr>
+            <w:r>
+              <w:rPr>
+                <w:rFonts w:ascii="Inter" w:cs="Inter" w:eastAsia="Inter" w:hAnsi="Inter"/>
+                <w:color w:val="1A1D21"/>
+                <w:sz w:val="20"/>
+                <w:szCs w:val="20"/>
+              </w:rPr>
+              <w:t xml:space="preserve">• Insight report with ranked actions (R-18, R-22)  •  Two roles, account isolation, data export/delete (R-21, R-23)</w:t>
             </w:r>
           </w:p>
         </w:tc>
@@ -7826,117 +8519,6 @@
       <w:pPr>
         <w:spacing w:after="60"/>
       </w:pPr>
-    </w:p>
-    <w:p>
-      <w:pPr>
-        <w:spacing w:after="90" w:before="200"/>
-      </w:pPr>
-      <w:r>
-        <w:rPr>
-          <w:rFonts w:ascii="Inter" w:cs="Inter" w:eastAsia="Inter" w:hAnsi="Inter"/>
-          <w:b/>
-          <w:bCs/>
-          <w:color w:val="1A1D21"/>
-          <w:sz w:val="22"/>
-          <w:szCs w:val="22"/>
-        </w:rPr>
-        <w:t xml:space="preserve">Phase 1 — Competitive insight &amp; distribution</w:t>
-      </w:r>
-    </w:p>
-    <w:p>
-      <w:pPr>
-        <w:pStyle w:val="ListParagraph"/>
-        <w:numPr>
-          <w:ilvl w:val="0"/>
-          <w:numId w:val="2"/>
-        </w:numPr>
-        <w:spacing w:after="90" w:line="288"/>
-      </w:pPr>
-      <w:r>
-        <w:rPr>
-          <w:rFonts w:ascii="Inter" w:cs="Inter" w:eastAsia="Inter" w:hAnsi="Inter"/>
-          <w:color w:val="1A1D21"/>
-          <w:sz w:val="21"/>
-          <w:szCs w:val="21"/>
-        </w:rPr>
-        <w:t xml:space="preserve">Competitor configuration and benchmarking (own vs competitors) on ratings, Brand Love, sentiment, themes (R-24, R-27, O-9) — CSV / licensed-provider / API sources first.</w:t>
-      </w:r>
-    </w:p>
-    <w:p>
-      <w:pPr>
-        <w:pStyle w:val="ListParagraph"/>
-        <w:numPr>
-          <w:ilvl w:val="0"/>
-          <w:numId w:val="2"/>
-        </w:numPr>
-        <w:spacing w:after="90" w:line="288"/>
-      </w:pPr>
-      <w:r>
-        <w:rPr>
-          <w:rFonts w:ascii="Inter" w:cs="Inter" w:eastAsia="Inter" w:hAnsi="Inter"/>
-          <w:color w:val="1A1D21"/>
-          <w:sz w:val="21"/>
-          <w:szCs w:val="21"/>
-        </w:rPr>
-        <w:t xml:space="preserve">Live web collection (R-25, DPS-7) — enabled only after the client’s legal review and sign-off; until then, competitor data flows through CSV/API/provider.</w:t>
-      </w:r>
-    </w:p>
-    <w:p>
-      <w:pPr>
-        <w:pStyle w:val="ListParagraph"/>
-        <w:numPr>
-          <w:ilvl w:val="0"/>
-          <w:numId w:val="2"/>
-        </w:numPr>
-        <w:spacing w:after="90" w:line="288"/>
-      </w:pPr>
-      <w:r>
-        <w:rPr>
-          <w:rFonts w:ascii="Inter" w:cs="Inter" w:eastAsia="Inter" w:hAnsi="Inter"/>
-          <w:color w:val="1A1D21"/>
-          <w:sz w:val="21"/>
-          <w:szCs w:val="21"/>
-        </w:rPr>
-        <w:t xml:space="preserve">Per-competitor deep-dive (R-28, O-10).</w:t>
-      </w:r>
-    </w:p>
-    <w:p>
-      <w:pPr>
-        <w:pStyle w:val="ListParagraph"/>
-        <w:numPr>
-          <w:ilvl w:val="0"/>
-          <w:numId w:val="2"/>
-        </w:numPr>
-        <w:spacing w:after="90" w:line="288"/>
-      </w:pPr>
-      <w:r>
-        <w:rPr>
-          <w:rFonts w:ascii="Inter" w:cs="Inter" w:eastAsia="Inter" w:hAnsi="Inter"/>
-          <w:color w:val="1A1D21"/>
-          <w:sz w:val="21"/>
-          <w:szCs w:val="21"/>
-        </w:rPr>
-        <w:t xml:space="preserve">Natural-language "ask your data" query with citations (R-17, O-6).</w:t>
-      </w:r>
-    </w:p>
-    <w:p>
-      <w:pPr>
-        <w:pStyle w:val="ListParagraph"/>
-        <w:numPr>
-          <w:ilvl w:val="0"/>
-          <w:numId w:val="2"/>
-        </w:numPr>
-        <w:spacing w:after="90" w:line="288"/>
-      </w:pPr>
-      <w:r>
-        <w:rPr>
-          <w:rFonts w:ascii="Inter" w:cs="Inter" w:eastAsia="Inter" w:hAnsi="Inter"/>
-          <w:color w:val="1A1D21"/>
-          <w:sz w:val="21"/>
-          <w:szCs w:val="21"/>
-        </w:rPr>
-        <w:t xml:space="preserve">Email distribution + reminders (R-4 email); configurable alerts (R-20); slides export.</w:t>
-      </w:r>
     </w:p>
     <w:tbl>
       <w:tblPr>
@@ -7978,7 +8560,7 @@
                 <w:sz w:val="20"/>
                 <w:szCs w:val="20"/>
               </w:rPr>
-              <w:t xml:space="preserve">Advisory note — scope &amp; risk</w:t>
+              <w:t xml:space="preserve">MVP note on Trust depth</w:t>
             </w:r>
           </w:p>
           <w:p>
@@ -7992,35 +8574,7 @@
                 <w:sz w:val="20"/>
                 <w:szCs w:val="20"/>
               </w:rPr>
-              <w:t xml:space="preserve">Competitive intelligence and web collection are the biggest additions in v2 and materially expand the build.</w:t>
-            </w:r>
-          </w:p>
-          <w:p>
-            <w:pPr>
-              <w:spacing w:after="40" w:line="276"/>
-            </w:pPr>
-            <w:r>
-              <w:rPr>
-                <w:rFonts w:ascii="Inter" w:cs="Inter" w:eastAsia="Inter" w:hAnsi="Inter"/>
-                <w:color w:val="1A1D21"/>
-                <w:sz w:val="20"/>
-                <w:szCs w:val="20"/>
-              </w:rPr>
-              <w:t xml:space="preserve">The MVP delivers the aggregate unified-customer view and the data model that holds competitor brands; standing up compliant collection (legal review, source integrations, matching/normalization, freshness) is Phase 1 so the MVP is not gated on it.</w:t>
-            </w:r>
-          </w:p>
-          <w:p>
-            <w:pPr>
-              <w:spacing w:after="40" w:line="276"/>
-            </w:pPr>
-            <w:r>
-              <w:rPr>
-                <w:rFonts w:ascii="Inter" w:cs="Inter" w:eastAsia="Inter" w:hAnsi="Inter"/>
-                <w:color w:val="1A1D21"/>
-                <w:sz w:val="20"/>
-                <w:szCs w:val="20"/>
-              </w:rPr>
-              <w:t xml:space="preserve">This sequencing is a recommendation — say the word and we’ll re-weight.</w:t>
+              <w:t xml:space="preserve">The MVP can ship with a single-item trust rating plus inferred trust from open text; the full multi-item driver battery (reliability/integrity/benevolence/security) can be a fast-follow if it risks the MVP timeline. See Q-14.</w:t>
             </w:r>
           </w:p>
         </w:tc>
@@ -8028,6 +8582,11 @@
     </w:tbl>
     <w:p>
       <w:pPr>
+        <w:spacing w:after="60"/>
+      </w:pPr>
+    </w:p>
+    <w:p>
+      <w:pPr>
         <w:spacing w:after="90" w:before="200"/>
       </w:pPr>
       <w:r>
@@ -8039,26 +8598,83 @@
           <w:sz w:val="22"/>
           <w:szCs w:val="22"/>
         </w:rPr>
-        <w:t xml:space="preserve">Phase 2 — Connectors &amp; scale</w:t>
-      </w:r>
-    </w:p>
-    <w:p>
-      <w:pPr>
-        <w:pStyle w:val="ListParagraph"/>
-        <w:numPr>
-          <w:ilvl w:val="0"/>
-          <w:numId w:val="2"/>
-        </w:numPr>
-        <w:spacing w:after="90" w:line="288"/>
-      </w:pPr>
-      <w:r>
-        <w:rPr>
-          <w:rFonts w:ascii="Inter" w:cs="Inter" w:eastAsia="Inter" w:hAnsi="Inter"/>
-          <w:color w:val="1A1D21"/>
-          <w:sz w:val="21"/>
-          <w:szCs w:val="21"/>
-        </w:rPr>
-        <w:t xml:space="preserve">Additional sanctioned connectors; larger-volume background processing (NFR-5); multi-language expansion (Q-4); team collaboration (shared workspaces, comments, saved views).</w:t>
+        <w:t xml:space="preserve">Phase 1 — Competitive insight &amp; distribution</w:t>
+      </w:r>
+    </w:p>
+    <w:p>
+      <w:pPr>
+        <w:pStyle w:val="ListParagraph"/>
+        <w:numPr>
+          <w:ilvl w:val="0"/>
+          <w:numId w:val="2"/>
+        </w:numPr>
+        <w:spacing w:after="90" w:line="288"/>
+      </w:pPr>
+      <w:r>
+        <w:rPr>
+          <w:rFonts w:ascii="Inter" w:cs="Inter" w:eastAsia="Inter" w:hAnsi="Inter"/>
+          <w:color w:val="1A1D21"/>
+          <w:sz w:val="21"/>
+          <w:szCs w:val="21"/>
+        </w:rPr>
+        <w:t xml:space="preserve">Competitor configuration and benchmarking (own vs competitors) on ratings, Brand Love, Trust, sentiment, themes (R-24, R-27, O-9) — CSV / licensed-provider / API sources first.</w:t>
+      </w:r>
+    </w:p>
+    <w:p>
+      <w:pPr>
+        <w:pStyle w:val="ListParagraph"/>
+        <w:numPr>
+          <w:ilvl w:val="0"/>
+          <w:numId w:val="2"/>
+        </w:numPr>
+        <w:spacing w:after="90" w:line="288"/>
+      </w:pPr>
+      <w:r>
+        <w:rPr>
+          <w:rFonts w:ascii="Inter" w:cs="Inter" w:eastAsia="Inter" w:hAnsi="Inter"/>
+          <w:color w:val="1A1D21"/>
+          <w:sz w:val="21"/>
+          <w:szCs w:val="21"/>
+        </w:rPr>
+        <w:t xml:space="preserve">Live web collection (R-25, DPS-7) — enabled only after the client’s legal review and sign-off.</w:t>
+      </w:r>
+    </w:p>
+    <w:p>
+      <w:pPr>
+        <w:pStyle w:val="ListParagraph"/>
+        <w:numPr>
+          <w:ilvl w:val="0"/>
+          <w:numId w:val="2"/>
+        </w:numPr>
+        <w:spacing w:after="90" w:line="288"/>
+      </w:pPr>
+      <w:r>
+        <w:rPr>
+          <w:rFonts w:ascii="Inter" w:cs="Inter" w:eastAsia="Inter" w:hAnsi="Inter"/>
+          <w:color w:val="1A1D21"/>
+          <w:sz w:val="21"/>
+          <w:szCs w:val="21"/>
+        </w:rPr>
+        <w:t xml:space="preserve">Per-competitor deep-dive (R-28, O-10).</w:t>
+      </w:r>
+    </w:p>
+    <w:p>
+      <w:pPr>
+        <w:pStyle w:val="ListParagraph"/>
+        <w:numPr>
+          <w:ilvl w:val="0"/>
+          <w:numId w:val="2"/>
+        </w:numPr>
+        <w:spacing w:after="90" w:line="288"/>
+      </w:pPr>
+      <w:r>
+        <w:rPr>
+          <w:rFonts w:ascii="Inter" w:cs="Inter" w:eastAsia="Inter" w:hAnsi="Inter"/>
+          <w:color w:val="1A1D21"/>
+          <w:sz w:val="21"/>
+          <w:szCs w:val="21"/>
+        </w:rPr>
+        <w:t xml:space="preserve">Natural-language "ask your data" query (R-17, O-6); email distribution (R-4 email); alerts (R-20); slides export.</w:t>
       </w:r>
     </w:p>
     <w:p>
@@ -8074,6 +8690,41 @@
           <w:sz w:val="22"/>
           <w:szCs w:val="22"/>
         </w:rPr>
+        <w:t xml:space="preserve">Phase 2 — Connectors &amp; scale</w:t>
+      </w:r>
+    </w:p>
+    <w:p>
+      <w:pPr>
+        <w:pStyle w:val="ListParagraph"/>
+        <w:numPr>
+          <w:ilvl w:val="0"/>
+          <w:numId w:val="2"/>
+        </w:numPr>
+        <w:spacing w:after="90" w:line="288"/>
+      </w:pPr>
+      <w:r>
+        <w:rPr>
+          <w:rFonts w:ascii="Inter" w:cs="Inter" w:eastAsia="Inter" w:hAnsi="Inter"/>
+          <w:color w:val="1A1D21"/>
+          <w:sz w:val="21"/>
+          <w:szCs w:val="21"/>
+        </w:rPr>
+        <w:t xml:space="preserve">Additional sanctioned connectors; larger-volume background processing (NFR-5); multi-language expansion (Q-4); team collaboration.</w:t>
+      </w:r>
+    </w:p>
+    <w:p>
+      <w:pPr>
+        <w:spacing w:after="90" w:before="200"/>
+      </w:pPr>
+      <w:r>
+        <w:rPr>
+          <w:rFonts w:ascii="Inter" w:cs="Inter" w:eastAsia="Inter" w:hAnsi="Inter"/>
+          <w:b/>
+          <w:bCs/>
+          <w:color w:val="1A1D21"/>
+          <w:sz w:val="22"/>
+          <w:szCs w:val="22"/>
+        </w:rPr>
         <w:t xml:space="preserve">Phase 3 — Advanced insight</w:t>
       </w:r>
     </w:p>
@@ -8093,7 +8744,7 @@
           <w:sz w:val="21"/>
           <w:szCs w:val="21"/>
         </w:rPr>
-        <w:t xml:space="preserve">Driver analysis (what most influences rating / Brand Love); benchmarking against prior periods and optional, opt-in, anonymized peer norms; a research assistant that proposes surveys from the gaps it finds.</w:t>
+        <w:t xml:space="preserve">Driver analysis — what most influences Brand Love and Trust; the love-type distinction (passion vs. intimacy/loyalty, per Nobre 2011) and a resilience measure (does sentiment/repurchase hold after a negative event); benchmarking vs prior periods and optional, opt-in, anonymized peer norms; a research assistant that proposes surveys from the gaps it finds.</w:t>
       </w:r>
     </w:p>
     <w:p>
@@ -8219,7 +8870,7 @@
           <w:sz w:val="21"/>
           <w:szCs w:val="21"/>
         </w:rPr>
-        <w:t xml:space="preserve">Build vs. buy the survey engine — build collection natively, or wrap an existing component and focus the build on the AI/analysis layer?</w:t>
+        <w:t xml:space="preserve">Build vs. buy the survey engine — build collection natively, or wrap an existing component?</w:t>
       </w:r>
     </w:p>
     <w:p>
@@ -8429,7 +9080,7 @@
           <w:sz w:val="21"/>
           <w:szCs w:val="21"/>
         </w:rPr>
-        <w:t xml:space="preserve">Brand-love framework — resolved: Brand Love is a first-class scale and lens. Remaining: ground it in a published framework (e.g., Ahuvia) for the inferred-from-text read and Index formula? Is "Ambiguity" the final middle label (vs. "Ambivalence"/"Neutral")?</w:t>
+        <w:t xml:space="preserve">Brand-love framework — resolved: grounded in Batra/Ahuvia/Bagozzi (2012). Confirm "Ambiguity" as the middle label (vs. "Ambivalence"/"Neutral").</w:t>
       </w:r>
     </w:p>
     <w:p>
@@ -8459,7 +9110,7 @@
           <w:sz w:val="21"/>
           <w:szCs w:val="21"/>
         </w:rPr>
-        <w:t xml:space="preserve">Competitors &amp; sources — which competitors to track first, and which review sources (sites/APIs/providers) matter most in your market?</w:t>
+        <w:t xml:space="preserve">Competitors &amp; sources — which competitors to track first, and which review sources matter most?</w:t>
       </w:r>
     </w:p>
     <w:p>
@@ -8489,7 +9140,7 @@
           <w:sz w:val="21"/>
           <w:szCs w:val="21"/>
         </w:rPr>
-        <w:t xml:space="preserve">Collection method &amp; legal sign-off — confirm the API / licensed-provider / public-web mix, and who provides the legal review that gates live web collection (DPS-7). Recommendation: start on APIs/licensed data; add public-web after counsel sign-off.</w:t>
+        <w:t xml:space="preserve">Collection method &amp; legal sign-off — confirm the API / licensed-provider / public-web mix, and who provides the legal review that gates live web collection (DPS-7).</w:t>
       </w:r>
     </w:p>
     <w:p>
@@ -8550,6 +9201,66 @@
           <w:szCs w:val="21"/>
         </w:rPr>
         <w:t xml:space="preserve">Collected-data retention — how long should collected competitor/web data be retained?</w:t>
+      </w:r>
+    </w:p>
+    <w:p>
+      <w:pPr>
+        <w:pStyle w:val="ListParagraph"/>
+        <w:numPr>
+          <w:ilvl w:val="0"/>
+          <w:numId w:val="2"/>
+        </w:numPr>
+        <w:spacing w:after="90" w:line="288"/>
+      </w:pPr>
+      <w:r>
+        <w:rPr>
+          <w:rFonts w:ascii="JetBrains Mono" w:cs="JetBrains Mono" w:eastAsia="JetBrains Mono" w:hAnsi="JetBrains Mono"/>
+          <w:b/>
+          <w:bCs/>
+          <w:color w:val="D9763A"/>
+          <w:sz w:val="20"/>
+          <w:szCs w:val="20"/>
+        </w:rPr>
+        <w:t xml:space="preserve">Q-14  </w:t>
+      </w:r>
+      <w:r>
+        <w:rPr>
+          <w:rFonts w:ascii="Inter" w:cs="Inter" w:eastAsia="Inter" w:hAnsi="Inter"/>
+          <w:color w:val="1A1D21"/>
+          <w:sz w:val="21"/>
+          <w:szCs w:val="21"/>
+        </w:rPr>
+        <w:t xml:space="preserve">Trust depth for v1 — single-item trust rating plus inference, or the full multi-item driver battery? (Recommendation: single-item + inference in the MVP; driver battery as a fast-follow.)</w:t>
+      </w:r>
+    </w:p>
+    <w:p>
+      <w:pPr>
+        <w:pStyle w:val="ListParagraph"/>
+        <w:numPr>
+          <w:ilvl w:val="0"/>
+          <w:numId w:val="2"/>
+        </w:numPr>
+        <w:spacing w:after="90" w:line="288"/>
+      </w:pPr>
+      <w:r>
+        <w:rPr>
+          <w:rFonts w:ascii="JetBrains Mono" w:cs="JetBrains Mono" w:eastAsia="JetBrains Mono" w:hAnsi="JetBrains Mono"/>
+          <w:b/>
+          <w:bCs/>
+          <w:color w:val="D9763A"/>
+          <w:sz w:val="20"/>
+          <w:szCs w:val="20"/>
+        </w:rPr>
+        <w:t xml:space="preserve">Q-15  </w:t>
+      </w:r>
+      <w:r>
+        <w:rPr>
+          <w:rFonts w:ascii="Inter" w:cs="Inter" w:eastAsia="Inter" w:hAnsi="Inter"/>
+          <w:color w:val="1A1D21"/>
+          <w:sz w:val="21"/>
+          <w:szCs w:val="21"/>
+        </w:rPr>
+        <w:t xml:space="preserve">Trust driver taxonomy — confirm reliability / integrity / benevolence / security-privacy as the drivers, and the Trust Index formula (proposed net: %positive-trust − %negative-trust on the normalized scale).</w:t>
       </w:r>
     </w:p>
     <w:p>

</xml_diff>

<commit_message>
Requirements v5: Closed-Loop / Service Recovery pillar
</commit_message>
<xml_diff>
--- a/AAA_Insights_PRD.docx
+++ b/AAA_Insights_PRD.docx
@@ -133,7 +133,7 @@
           <w:sz w:val="18"/>
           <w:szCs w:val="18"/>
         </w:rPr>
-        <w:t xml:space="preserve">v3 — Draft (Trust extension)</w:t>
+        <w:t xml:space="preserve">v5 — Draft (Closed-Loop / Service Recovery pillar added)</w:t>
       </w:r>
     </w:p>
     <w:p>
@@ -156,7 +156,7 @@
           <w:sz w:val="18"/>
           <w:szCs w:val="18"/>
         </w:rPr>
-        <w:t xml:space="preserve">2026-07-14</w:t>
+        <w:t xml:space="preserve">2026-07-27</w:t>
       </w:r>
     </w:p>
     <w:p>
@@ -273,7 +273,7 @@
           <w:sz w:val="17"/>
           <w:szCs w:val="17"/>
         </w:rPr>
-        <w:t xml:space="preserve">WHAT CHANGED IN V3</w:t>
+        <w:t xml:space="preserve">WHAT CHANGED IN V5</w:t>
       </w:r>
     </w:p>
     <w:p>
@@ -332,7 +332,7 @@
                 <w:sz w:val="20"/>
                 <w:szCs w:val="20"/>
               </w:rPr>
-              <w:t xml:space="preserve">Revised 2026-07-14 — Trust extension</w:t>
+              <w:t xml:space="preserve">Revised 2026-07-27 — Closed-Loop / Service Recovery pillar</w:t>
             </w:r>
           </w:p>
           <w:p>
@@ -346,7 +346,7 @@
                 <w:sz w:val="20"/>
                 <w:szCs w:val="20"/>
               </w:rPr>
-              <w:t xml:space="preserve">• Brand Trust added as a first-class indicator that complements Brand Love (love is the emotional pull; trust is confidence the brand is reliable, honest, and acts in your interest).</w:t>
+              <w:t xml:space="preserve">• Added the shift from measuring sentiment to actively managing it: opt-in respondent contactability, signal-driven triggers, and a first-class RecoveryCase with a status lifecycle.</w:t>
             </w:r>
           </w:p>
           <w:p>
@@ -360,7 +360,7 @@
                 <w:sz w:val="20"/>
                 <w:szCs w:val="20"/>
               </w:rPr>
-              <w:t xml:space="preserve">• A Trust question type (single-item + optional driver battery: reliability, integrity, benevolence, security/privacy), a Trust Index, and trust inferred from open text.</w:t>
+              <w:t xml:space="preserve">• Hand-off to the tools a company already uses (helpdesk / CRM / email) via connectors, plus recovery measurement — did Brand Love / Trust actually rebuild? — and reinforcement plays for satisfied customers.</w:t>
             </w:r>
           </w:p>
           <w:p>
@@ -374,7 +374,7 @@
                 <w:sz w:val="20"/>
                 <w:szCs w:val="20"/>
               </w:rPr>
-              <w:t xml:space="preserve">• A Love × Trust segmentation — Devoted / Infatuated (fragile) / Dependable / At-risk — with a recommended action per quadrant.</w:t>
+              <w:t xml:space="preserve">• Delivered as posture #2 (orchestrate + measure), architected for #3 (native workflow) — the RecoveryCase and its measurement are owned internally, so #3 is an evolution, not a rewrite.</w:t>
             </w:r>
           </w:p>
           <w:p>
@@ -388,7 +388,7 @@
                 <w:sz w:val="20"/>
                 <w:szCs w:val="20"/>
               </w:rPr>
-              <w:t xml:space="preserve">• Grounded in the library: Wardani &amp; Gustia (2016) — trust bridges satisfaction to attachment; Nobre (2011) — passion-love without trust is fragile.</w:t>
+              <w:t xml:space="preserve">• Grounded in the service-recovery paradox: a well-resolved complaint can leave a customer more loyal than if nothing had gone wrong.</w:t>
             </w:r>
           </w:p>
           <w:p>
@@ -402,7 +402,7 @@
                 <w:sz w:val="20"/>
                 <w:szCs w:val="20"/>
               </w:rPr>
-              <w:t xml:space="preserve">  (v2 added: aggregate unified-customer view, competitors, lawful collection under DPS-7, the Brand Love scale, and the data model.)</w:t>
+              <w:t xml:space="preserve">  (v4 resolved all 15 open questions; v3 added Brand Trust; v2 added the unified-customer view, competitors, lawful collection, Brand Love, and the data model.)</w:t>
             </w:r>
           </w:p>
         </w:tc>
@@ -923,7 +923,7 @@
           <w:sz w:val="22"/>
           <w:szCs w:val="22"/>
         </w:rPr>
-        <w:t xml:space="preserve">Open questions</w:t>
+        <w:t xml:space="preserve">Decisions (resolved)</w:t>
       </w:r>
       <w:ptab w:alignment="right" w:relativeTo="margin" w:leader="dot"/>
       <w:r>
@@ -1509,7 +1509,7 @@
           <w:sz w:val="26"/>
           <w:szCs w:val="26"/>
         </w:rPr>
-        <w:t xml:space="preserve">Seven commitments that shape every design decision.</w:t>
+        <w:t xml:space="preserve">Eight commitments that shape every design decision.</w:t>
       </w:r>
     </w:p>
     <w:p>
@@ -1605,7 +1605,7 @@
           <w:sz w:val="21"/>
           <w:szCs w:val="21"/>
         </w:rPr>
-        <w:t xml:space="preserve">Survey definition — built by an admin or AI-generated. Question types include single-select, multi-select, rating/scale, open text, the Brand Love scale (Love / Like / Ambiguity / Dislike / Hate), and the Trust battery (a single-item trust rating and/or a short driver battery: reliability, integrity, benevolence, security/privacy).</w:t>
+        <w:t xml:space="preserve">Survey definition — built by an admin or AI-generated. Question types include single-select, multi-select, rating/scale, open text, the Brand Love scale (Love / Like / Ambivalence / Dislike / Hate), and the Trust battery (a single-item trust rating and/or a short driver battery: reliability, integrity, benevolence, security/privacy).</w:t>
       </w:r>
     </w:p>
     <w:p>
@@ -1846,6 +1846,66 @@
           <w:szCs w:val="21"/>
         </w:rPr>
         <w:t xml:space="preserve">Externally-collected feedback — reviews/ratings/comments about the own brand and tracked competitors from public web pages, review-site APIs, or a licensed provider (source URL, capture date, brand, rating, text).</w:t>
+      </w:r>
+    </w:p>
+    <w:p>
+      <w:pPr>
+        <w:pStyle w:val="ListParagraph"/>
+        <w:numPr>
+          <w:ilvl w:val="0"/>
+          <w:numId w:val="2"/>
+        </w:numPr>
+        <w:spacing w:after="90" w:line="288"/>
+      </w:pPr>
+      <w:r>
+        <w:rPr>
+          <w:rFonts w:ascii="JetBrains Mono" w:cs="JetBrains Mono" w:eastAsia="JetBrains Mono" w:hAnsi="JetBrains Mono"/>
+          <w:b/>
+          <w:bCs/>
+          <w:color w:val="D9763A"/>
+          <w:sz w:val="20"/>
+          <w:szCs w:val="20"/>
+        </w:rPr>
+        <w:t xml:space="preserve">I-10  </w:t>
+      </w:r>
+      <w:r>
+        <w:rPr>
+          <w:rFonts w:ascii="Inter" w:cs="Inter" w:eastAsia="Inter" w:hAnsi="Inter"/>
+          <w:color w:val="1A1D21"/>
+          <w:sz w:val="21"/>
+          <w:szCs w:val="21"/>
+        </w:rPr>
+        <w:t xml:space="preserve">(v5) Respondent contact &amp; consent — optional, opt-in contact details a respondent provides so the company may follow up (e.g., email). Anonymous-by-default is preserved (INV-5, INV-13).</w:t>
+      </w:r>
+    </w:p>
+    <w:p>
+      <w:pPr>
+        <w:pStyle w:val="ListParagraph"/>
+        <w:numPr>
+          <w:ilvl w:val="0"/>
+          <w:numId w:val="2"/>
+        </w:numPr>
+        <w:spacing w:after="90" w:line="288"/>
+      </w:pPr>
+      <w:r>
+        <w:rPr>
+          <w:rFonts w:ascii="JetBrains Mono" w:cs="JetBrains Mono" w:eastAsia="JetBrains Mono" w:hAnsi="JetBrains Mono"/>
+          <w:b/>
+          <w:bCs/>
+          <w:color w:val="D9763A"/>
+          <w:sz w:val="20"/>
+          <w:szCs w:val="20"/>
+        </w:rPr>
+        <w:t xml:space="preserve">I-11  </w:t>
+      </w:r>
+      <w:r>
+        <w:rPr>
+          <w:rFonts w:ascii="Inter" w:cs="Inter" w:eastAsia="Inter" w:hAnsi="Inter"/>
+          <w:color w:val="1A1D21"/>
+          <w:sz w:val="21"/>
+          <w:szCs w:val="21"/>
+        </w:rPr>
+        <w:t xml:space="preserve">(v5) Recovery rules &amp; routing config — admin-defined triggers (which signals open a case) and routing (which owner/queue or external tool a case is handed to).</w:t>
       </w:r>
     </w:p>
     <w:p>
@@ -2241,7 +2301,7 @@
           <w:sz w:val="21"/>
           <w:szCs w:val="21"/>
         </w:rPr>
-        <w:t xml:space="preserve">Brand Love read — the distribution across Love / Like / Ambiguity / Dislike / Hate and a Brand Love Index (share of Love+Like minus share of Dislike+Hate), per company and competitor, over time.</w:t>
+        <w:t xml:space="preserve">Brand Love read — the distribution across Love / Like / Ambivalence / Dislike / Hate and a Brand Love Index (share of Love+Like minus share of Dislike+Hate), per company and competitor, over time.</w:t>
       </w:r>
     </w:p>
     <w:p>
@@ -2592,6 +2652,96 @@
     </w:tbl>
     <w:p>
       <w:pPr>
+        <w:pStyle w:val="ListParagraph"/>
+        <w:numPr>
+          <w:ilvl w:val="0"/>
+          <w:numId w:val="2"/>
+        </w:numPr>
+        <w:spacing w:after="90" w:line="288"/>
+      </w:pPr>
+      <w:r>
+        <w:rPr>
+          <w:rFonts w:ascii="JetBrains Mono" w:cs="JetBrains Mono" w:eastAsia="JetBrains Mono" w:hAnsi="JetBrains Mono"/>
+          <w:b/>
+          <w:bCs/>
+          <w:color w:val="D9763A"/>
+          <w:sz w:val="20"/>
+          <w:szCs w:val="20"/>
+        </w:rPr>
+        <w:t xml:space="preserve">O-14  </w:t>
+      </w:r>
+      <w:r>
+        <w:rPr>
+          <w:rFonts w:ascii="Inter" w:cs="Inter" w:eastAsia="Inter" w:hAnsi="Inter"/>
+          <w:color w:val="1A1D21"/>
+          <w:sz w:val="21"/>
+          <w:szCs w:val="21"/>
+        </w:rPr>
+        <w:t xml:space="preserve">(v5) Recovery case — a tracked case opened from a dissatisfaction signal: the linked feedback, contact (if consented), owner, status (open → in-progress → resolved), and resolution notes.</w:t>
+      </w:r>
+    </w:p>
+    <w:p>
+      <w:pPr>
+        <w:pStyle w:val="ListParagraph"/>
+        <w:numPr>
+          <w:ilvl w:val="0"/>
+          <w:numId w:val="2"/>
+        </w:numPr>
+        <w:spacing w:after="90" w:line="288"/>
+      </w:pPr>
+      <w:r>
+        <w:rPr>
+          <w:rFonts w:ascii="JetBrains Mono" w:cs="JetBrains Mono" w:eastAsia="JetBrains Mono" w:hAnsi="JetBrains Mono"/>
+          <w:b/>
+          <w:bCs/>
+          <w:color w:val="D9763A"/>
+          <w:sz w:val="20"/>
+          <w:szCs w:val="20"/>
+        </w:rPr>
+        <w:t xml:space="preserve">O-15  </w:t>
+      </w:r>
+      <w:r>
+        <w:rPr>
+          <w:rFonts w:ascii="Inter" w:cs="Inter" w:eastAsia="Inter" w:hAnsi="Inter"/>
+          <w:color w:val="1A1D21"/>
+          <w:sz w:val="21"/>
+          <w:szCs w:val="21"/>
+        </w:rPr>
+        <w:t xml:space="preserve">(v5) Recovery metrics — recovery rate, time-to-resolve, and the change in Brand Love / Trust before vs. after resolution (the service-recovery outcome).</w:t>
+      </w:r>
+    </w:p>
+    <w:p>
+      <w:pPr>
+        <w:pStyle w:val="ListParagraph"/>
+        <w:numPr>
+          <w:ilvl w:val="0"/>
+          <w:numId w:val="2"/>
+        </w:numPr>
+        <w:spacing w:after="90" w:line="288"/>
+      </w:pPr>
+      <w:r>
+        <w:rPr>
+          <w:rFonts w:ascii="JetBrains Mono" w:cs="JetBrains Mono" w:eastAsia="JetBrains Mono" w:hAnsi="JetBrains Mono"/>
+          <w:b/>
+          <w:bCs/>
+          <w:color w:val="D9763A"/>
+          <w:sz w:val="20"/>
+          <w:szCs w:val="20"/>
+        </w:rPr>
+        <w:t xml:space="preserve">O-16  </w:t>
+      </w:r>
+      <w:r>
+        <w:rPr>
+          <w:rFonts w:ascii="Inter" w:cs="Inter" w:eastAsia="Inter" w:hAnsi="Inter"/>
+          <w:color w:val="1A1D21"/>
+          <w:sz w:val="21"/>
+          <w:szCs w:val="21"/>
+        </w:rPr>
+        <w:t xml:space="preserve">(v5) Reinforcement prompts — for satisfied/loved customers, opt-in prompts to review, refer, or advocate.</w:t>
+      </w:r>
+    </w:p>
+    <w:p>
+      <w:pPr>
         <w:spacing w:after="80" w:before="360"/>
       </w:pPr>
       <w:r>
@@ -3529,6 +3679,232 @@
           <w:sz w:val="22"/>
           <w:szCs w:val="22"/>
         </w:rPr>
+        <w:t xml:space="preserve">Closed-loop &amp; service recovery  (v5 — posture #2, architected for #3)</w:t>
+      </w:r>
+    </w:p>
+    <w:p>
+      <w:pPr>
+        <w:pStyle w:val="ListParagraph"/>
+        <w:numPr>
+          <w:ilvl w:val="0"/>
+          <w:numId w:val="2"/>
+        </w:numPr>
+        <w:spacing w:after="90" w:line="288"/>
+      </w:pPr>
+      <w:r>
+        <w:rPr>
+          <w:rFonts w:ascii="JetBrains Mono" w:cs="JetBrains Mono" w:eastAsia="JetBrains Mono" w:hAnsi="JetBrains Mono"/>
+          <w:b/>
+          <w:bCs/>
+          <w:color w:val="D9763A"/>
+          <w:sz w:val="20"/>
+          <w:szCs w:val="20"/>
+        </w:rPr>
+        <w:t xml:space="preserve">R-34  </w:t>
+      </w:r>
+      <w:r>
+        <w:rPr>
+          <w:rFonts w:ascii="Inter" w:cs="Inter" w:eastAsia="Inter" w:hAnsi="Inter"/>
+          <w:color w:val="1A1D21"/>
+          <w:sz w:val="21"/>
+          <w:szCs w:val="21"/>
+        </w:rPr>
+        <w:t xml:space="preserve">Let a respondent opt in to be contacted for follow-up (e.g., leave an email); contact is never required and is stored under consent (INV-5, INV-13, DPS-10).</w:t>
+      </w:r>
+    </w:p>
+    <w:p>
+      <w:pPr>
+        <w:pStyle w:val="ListParagraph"/>
+        <w:numPr>
+          <w:ilvl w:val="0"/>
+          <w:numId w:val="2"/>
+        </w:numPr>
+        <w:spacing w:after="90" w:line="288"/>
+      </w:pPr>
+      <w:r>
+        <w:rPr>
+          <w:rFonts w:ascii="JetBrains Mono" w:cs="JetBrains Mono" w:eastAsia="JetBrains Mono" w:hAnsi="JetBrains Mono"/>
+          <w:b/>
+          <w:bCs/>
+          <w:color w:val="D9763A"/>
+          <w:sz w:val="20"/>
+          <w:szCs w:val="20"/>
+        </w:rPr>
+        <w:t xml:space="preserve">R-35  </w:t>
+      </w:r>
+      <w:r>
+        <w:rPr>
+          <w:rFonts w:ascii="Inter" w:cs="Inter" w:eastAsia="Inter" w:hAnsi="Inter"/>
+          <w:color w:val="1A1D21"/>
+          <w:sz w:val="21"/>
+          <w:szCs w:val="21"/>
+        </w:rPr>
+        <w:t xml:space="preserve">Configurable triggers — a dissatisfaction signal (Dislike/Hate, low Trust, At-risk quadrant, negative-sentiment spike, rating below a floor) opens a RecoveryCase in near-real-time.</w:t>
+      </w:r>
+    </w:p>
+    <w:p>
+      <w:pPr>
+        <w:pStyle w:val="ListParagraph"/>
+        <w:numPr>
+          <w:ilvl w:val="0"/>
+          <w:numId w:val="2"/>
+        </w:numPr>
+        <w:spacing w:after="90" w:line="288"/>
+      </w:pPr>
+      <w:r>
+        <w:rPr>
+          <w:rFonts w:ascii="JetBrains Mono" w:cs="JetBrains Mono" w:eastAsia="JetBrains Mono" w:hAnsi="JetBrains Mono"/>
+          <w:b/>
+          <w:bCs/>
+          <w:color w:val="D9763A"/>
+          <w:sz w:val="20"/>
+          <w:szCs w:val="20"/>
+        </w:rPr>
+        <w:t xml:space="preserve">R-36  </w:t>
+      </w:r>
+      <w:r>
+        <w:rPr>
+          <w:rFonts w:ascii="Inter" w:cs="Inter" w:eastAsia="Inter" w:hAnsi="Inter"/>
+          <w:color w:val="1A1D21"/>
+          <w:sz w:val="21"/>
+          <w:szCs w:val="21"/>
+        </w:rPr>
+        <w:t xml:space="preserve">A RecoveryCase carries the linked feedback, contact (if consented), an owner, a status lifecycle (open → in-progress → resolved), and resolution notes. The case and its lifecycle are owned internally — this is what makes native workflow (#3) an evolution, not a rewrite.</w:t>
+      </w:r>
+    </w:p>
+    <w:p>
+      <w:pPr>
+        <w:pStyle w:val="ListParagraph"/>
+        <w:numPr>
+          <w:ilvl w:val="0"/>
+          <w:numId w:val="2"/>
+        </w:numPr>
+        <w:spacing w:after="90" w:line="288"/>
+      </w:pPr>
+      <w:r>
+        <w:rPr>
+          <w:rFonts w:ascii="JetBrains Mono" w:cs="JetBrains Mono" w:eastAsia="JetBrains Mono" w:hAnsi="JetBrains Mono"/>
+          <w:b/>
+          <w:bCs/>
+          <w:color w:val="D9763A"/>
+          <w:sz w:val="20"/>
+          <w:szCs w:val="20"/>
+        </w:rPr>
+        <w:t xml:space="preserve">R-37  </w:t>
+      </w:r>
+      <w:r>
+        <w:rPr>
+          <w:rFonts w:ascii="Inter" w:cs="Inter" w:eastAsia="Inter" w:hAnsi="Inter"/>
+          <w:color w:val="1A1D21"/>
+          <w:sz w:val="21"/>
+          <w:szCs w:val="21"/>
+        </w:rPr>
+        <w:t xml:space="preserve">Hand off / integrate — dispatch a case or action to an external tool the company already uses (helpdesk, CRM, email) via a connector; status changes round-trip back to the RecoveryCase.</w:t>
+      </w:r>
+    </w:p>
+    <w:p>
+      <w:pPr>
+        <w:pStyle w:val="ListParagraph"/>
+        <w:numPr>
+          <w:ilvl w:val="0"/>
+          <w:numId w:val="2"/>
+        </w:numPr>
+        <w:spacing w:after="90" w:line="288"/>
+      </w:pPr>
+      <w:r>
+        <w:rPr>
+          <w:rFonts w:ascii="JetBrains Mono" w:cs="JetBrains Mono" w:eastAsia="JetBrains Mono" w:hAnsi="JetBrains Mono"/>
+          <w:b/>
+          <w:bCs/>
+          <w:color w:val="D9763A"/>
+          <w:sz w:val="20"/>
+          <w:szCs w:val="20"/>
+        </w:rPr>
+        <w:t xml:space="preserve">R-38  </w:t>
+      </w:r>
+      <w:r>
+        <w:rPr>
+          <w:rFonts w:ascii="Inter" w:cs="Inter" w:eastAsia="Inter" w:hAnsi="Inter"/>
+          <w:color w:val="1A1D21"/>
+          <w:sz w:val="21"/>
+          <w:szCs w:val="21"/>
+        </w:rPr>
+        <w:t xml:space="preserve">Measure recovery — after resolution, re-measure sentiment / Brand Love / Trust for that customer or segment and compute a recovery rate and time-to-resolve (O-15).</w:t>
+      </w:r>
+    </w:p>
+    <w:p>
+      <w:pPr>
+        <w:pStyle w:val="ListParagraph"/>
+        <w:numPr>
+          <w:ilvl w:val="0"/>
+          <w:numId w:val="2"/>
+        </w:numPr>
+        <w:spacing w:after="90" w:line="288"/>
+      </w:pPr>
+      <w:r>
+        <w:rPr>
+          <w:rFonts w:ascii="JetBrains Mono" w:cs="JetBrains Mono" w:eastAsia="JetBrains Mono" w:hAnsi="JetBrains Mono"/>
+          <w:b/>
+          <w:bCs/>
+          <w:color w:val="D9763A"/>
+          <w:sz w:val="20"/>
+          <w:szCs w:val="20"/>
+        </w:rPr>
+        <w:t xml:space="preserve">R-39  </w:t>
+      </w:r>
+      <w:r>
+        <w:rPr>
+          <w:rFonts w:ascii="Inter" w:cs="Inter" w:eastAsia="Inter" w:hAnsi="Inter"/>
+          <w:color w:val="1A1D21"/>
+          <w:sz w:val="21"/>
+          <w:szCs w:val="21"/>
+        </w:rPr>
+        <w:t xml:space="preserve">Reinforce the satisfied — for Devoted/loved customers, generate opt-in prompts to review, refer, or advocate (O-16).</w:t>
+      </w:r>
+    </w:p>
+    <w:p>
+      <w:pPr>
+        <w:pStyle w:val="ListParagraph"/>
+        <w:numPr>
+          <w:ilvl w:val="0"/>
+          <w:numId w:val="2"/>
+        </w:numPr>
+        <w:spacing w:after="90" w:line="288"/>
+      </w:pPr>
+      <w:r>
+        <w:rPr>
+          <w:rFonts w:ascii="JetBrains Mono" w:cs="JetBrains Mono" w:eastAsia="JetBrains Mono" w:hAnsi="JetBrains Mono"/>
+          <w:b/>
+          <w:bCs/>
+          <w:color w:val="D9763A"/>
+          <w:sz w:val="20"/>
+          <w:szCs w:val="20"/>
+        </w:rPr>
+        <w:t xml:space="preserve">R-40  </w:t>
+      </w:r>
+      <w:r>
+        <w:rPr>
+          <w:rFonts w:ascii="Inter" w:cs="Inter" w:eastAsia="Inter" w:hAnsi="Inter"/>
+          <w:color w:val="1A1D21"/>
+          <w:sz w:val="21"/>
+          <w:szCs w:val="21"/>
+        </w:rPr>
+        <w:t xml:space="preserve">Prioritize open dissatisfaction cases by predicted value/risk (Love × Trust quadrant, trust drivers, volume) so the highest-leverage recoveries surface first.</w:t>
+      </w:r>
+    </w:p>
+    <w:p>
+      <w:pPr>
+        <w:spacing w:after="90" w:before="200"/>
+      </w:pPr>
+      <w:r>
+        <w:rPr>
+          <w:rFonts w:ascii="Inter" w:cs="Inter" w:eastAsia="Inter" w:hAnsi="Inter"/>
+          <w:b/>
+          <w:bCs/>
+          <w:color w:val="1A1D21"/>
+          <w:sz w:val="22"/>
+          <w:szCs w:val="22"/>
+        </w:rPr>
         <w:t xml:space="preserve">AI analysis, accounts, roles, export</w:t>
       </w:r>
     </w:p>
@@ -4170,6 +4546,36 @@
     </w:p>
     <w:p>
       <w:pPr>
+        <w:pStyle w:val="ListParagraph"/>
+        <w:numPr>
+          <w:ilvl w:val="0"/>
+          <w:numId w:val="2"/>
+        </w:numPr>
+        <w:spacing w:after="90" w:line="288"/>
+      </w:pPr>
+      <w:r>
+        <w:rPr>
+          <w:rFonts w:ascii="JetBrains Mono" w:cs="JetBrains Mono" w:eastAsia="JetBrains Mono" w:hAnsi="JetBrains Mono"/>
+          <w:b/>
+          <w:bCs/>
+          <w:color w:val="D9763A"/>
+          <w:sz w:val="20"/>
+          <w:szCs w:val="20"/>
+        </w:rPr>
+        <w:t xml:space="preserve">INV-13  </w:t>
+      </w:r>
+      <w:r>
+        <w:rPr>
+          <w:rFonts w:ascii="Inter" w:cs="Inter" w:eastAsia="Inter" w:hAnsi="Inter"/>
+          <w:color w:val="1A1D21"/>
+          <w:sz w:val="21"/>
+          <w:szCs w:val="21"/>
+        </w:rPr>
+        <w:t xml:space="preserve">(v5) Follow-up is consent-gated. The system contacts a respondent only when they have opted in; anonymous-by-default is preserved (INV-5). Recovery-case data and contact details fall under the same PII protections (INV-8, DPS-10), and a respondent can withdraw consent at any time.</w:t>
+      </w:r>
+    </w:p>
+    <w:p>
+      <w:pPr>
         <w:spacing w:after="80" w:before="360"/>
       </w:pPr>
       <w:r>
@@ -4351,7 +4757,7 @@
           <w:sz w:val="21"/>
           <w:szCs w:val="21"/>
         </w:rPr>
-        <w:t xml:space="preserve">Non-English / mixed-language — language detected and analyzed accordingly (Q-4).</w:t>
+        <w:t xml:space="preserve">Non-English / mixed-language — the MVP is English-only (D-4); non-English responses are detected, tagged, and set aside with an honest note until multilingual analysis lands in Phase 2.</w:t>
       </w:r>
     </w:p>
     <w:p>
@@ -4712,6 +5118,126 @@
           <w:szCs w:val="21"/>
         </w:rPr>
         <w:t xml:space="preserve">Category-relative trust — the Trust Index is read relative to category and prior period, not as an absolute (a bank’s trust bar differs from a snack brand’s). Cross-category trust comparisons are flagged as context-dependent.</w:t>
+      </w:r>
+    </w:p>
+    <w:p>
+      <w:pPr>
+        <w:pStyle w:val="ListParagraph"/>
+        <w:numPr>
+          <w:ilvl w:val="0"/>
+          <w:numId w:val="2"/>
+        </w:numPr>
+        <w:spacing w:after="90" w:line="288"/>
+      </w:pPr>
+      <w:r>
+        <w:rPr>
+          <w:rFonts w:ascii="JetBrains Mono" w:cs="JetBrains Mono" w:eastAsia="JetBrains Mono" w:hAnsi="JetBrains Mono"/>
+          <w:b/>
+          <w:bCs/>
+          <w:color w:val="D9763A"/>
+          <w:sz w:val="20"/>
+          <w:szCs w:val="20"/>
+        </w:rPr>
+        <w:t xml:space="preserve">E-17  </w:t>
+      </w:r>
+      <w:r>
+        <w:rPr>
+          <w:rFonts w:ascii="Inter" w:cs="Inter" w:eastAsia="Inter" w:hAnsi="Inter"/>
+          <w:color w:val="1A1D21"/>
+          <w:sz w:val="21"/>
+          <w:szCs w:val="21"/>
+        </w:rPr>
+        <w:t xml:space="preserve">(v5) Consent withdrawn — a respondent who opted in later opts out; their contact is purged and any open case is closed/anonymized, honoring the withdrawal (INV-13).</w:t>
+      </w:r>
+    </w:p>
+    <w:p>
+      <w:pPr>
+        <w:pStyle w:val="ListParagraph"/>
+        <w:numPr>
+          <w:ilvl w:val="0"/>
+          <w:numId w:val="2"/>
+        </w:numPr>
+        <w:spacing w:after="90" w:line="288"/>
+      </w:pPr>
+      <w:r>
+        <w:rPr>
+          <w:rFonts w:ascii="JetBrains Mono" w:cs="JetBrains Mono" w:eastAsia="JetBrains Mono" w:hAnsi="JetBrains Mono"/>
+          <w:b/>
+          <w:bCs/>
+          <w:color w:val="D9763A"/>
+          <w:sz w:val="20"/>
+          <w:szCs w:val="20"/>
+        </w:rPr>
+        <w:t xml:space="preserve">E-18  </w:t>
+      </w:r>
+      <w:r>
+        <w:rPr>
+          <w:rFonts w:ascii="Inter" w:cs="Inter" w:eastAsia="Inter" w:hAnsi="Inter"/>
+          <w:color w:val="1A1D21"/>
+          <w:sz w:val="21"/>
+          <w:szCs w:val="21"/>
+        </w:rPr>
+        <w:t xml:space="preserve">(v5) Integration/sync failure — if the external helpdesk/CRM is unreachable, the RecoveryCase stays authoritative internally, the gap is recorded, and it re-syncs when the tool returns — never silently dropping a case.</w:t>
+      </w:r>
+    </w:p>
+    <w:p>
+      <w:pPr>
+        <w:pStyle w:val="ListParagraph"/>
+        <w:numPr>
+          <w:ilvl w:val="0"/>
+          <w:numId w:val="2"/>
+        </w:numPr>
+        <w:spacing w:after="90" w:line="288"/>
+      </w:pPr>
+      <w:r>
+        <w:rPr>
+          <w:rFonts w:ascii="JetBrains Mono" w:cs="JetBrains Mono" w:eastAsia="JetBrains Mono" w:hAnsi="JetBrains Mono"/>
+          <w:b/>
+          <w:bCs/>
+          <w:color w:val="D9763A"/>
+          <w:sz w:val="20"/>
+          <w:szCs w:val="20"/>
+        </w:rPr>
+        <w:t xml:space="preserve">E-19  </w:t>
+      </w:r>
+      <w:r>
+        <w:rPr>
+          <w:rFonts w:ascii="Inter" w:cs="Inter" w:eastAsia="Inter" w:hAnsi="Inter"/>
+          <w:color w:val="1A1D21"/>
+          <w:sz w:val="21"/>
+          <w:szCs w:val="21"/>
+        </w:rPr>
+        <w:t xml:space="preserve">(v5) Unowned / stale case — a case with no owner, or one past its follow-up window, is surfaced and escalated rather than left to rot.</w:t>
+      </w:r>
+    </w:p>
+    <w:p>
+      <w:pPr>
+        <w:pStyle w:val="ListParagraph"/>
+        <w:numPr>
+          <w:ilvl w:val="0"/>
+          <w:numId w:val="2"/>
+        </w:numPr>
+        <w:spacing w:after="90" w:line="288"/>
+      </w:pPr>
+      <w:r>
+        <w:rPr>
+          <w:rFonts w:ascii="JetBrains Mono" w:cs="JetBrains Mono" w:eastAsia="JetBrains Mono" w:hAnsi="JetBrains Mono"/>
+          <w:b/>
+          <w:bCs/>
+          <w:color w:val="D9763A"/>
+          <w:sz w:val="20"/>
+          <w:szCs w:val="20"/>
+        </w:rPr>
+        <w:t xml:space="preserve">E-20  </w:t>
+      </w:r>
+      <w:r>
+        <w:rPr>
+          <w:rFonts w:ascii="Inter" w:cs="Inter" w:eastAsia="Inter" w:hAnsi="Inter"/>
+          <w:color w:val="1A1D21"/>
+          <w:sz w:val="21"/>
+          <w:szCs w:val="21"/>
+        </w:rPr>
+        <w:t xml:space="preserve">(v5) Recovery sample too small — where too few responses exist to re-measure reliably, recovery is reported as "not yet measurable," not a fabricated improvement (E-1 applies).</w:t>
       </w:r>
     </w:p>
     <w:p>
@@ -4837,7 +5363,7 @@
           <w:sz w:val="21"/>
           <w:szCs w:val="21"/>
         </w:rPr>
-        <w:t xml:space="preserve">No two-way case management / ticketing; closing the loop in v1 is export/notification.</w:t>
+        <w:t xml:space="preserve">(v5, revised) v1 does NOT ship a full native case-management workbench (agent queues, SLAs, macros) — that is posture #3, an explicit later horizon. v1 delivers posture #2: opening and owning a RecoveryCase internally and executing through the company’s existing tools via integrations, plus recovery measurement.</w:t>
       </w:r>
     </w:p>
     <w:p>
@@ -5368,6 +5894,180 @@
         </w:tc>
       </w:tr>
     </w:tbl>
+    <w:p>
+      <w:pPr>
+        <w:pStyle w:val="ListParagraph"/>
+        <w:numPr>
+          <w:ilvl w:val="0"/>
+          <w:numId w:val="2"/>
+        </w:numPr>
+        <w:spacing w:after="90" w:line="288"/>
+      </w:pPr>
+      <w:r>
+        <w:rPr>
+          <w:rFonts w:ascii="JetBrains Mono" w:cs="JetBrains Mono" w:eastAsia="JetBrains Mono" w:hAnsi="JetBrains Mono"/>
+          <w:b/>
+          <w:bCs/>
+          <w:color w:val="D9763A"/>
+          <w:sz w:val="20"/>
+          <w:szCs w:val="20"/>
+        </w:rPr>
+        <w:t xml:space="preserve">DPS-8  </w:t>
+      </w:r>
+      <w:r>
+        <w:rPr>
+          <w:rFonts w:ascii="Inter" w:cs="Inter" w:eastAsia="Inter" w:hAnsi="Inter"/>
+          <w:i/>
+          <w:iCs/>
+          <w:color w:val="1A1D21"/>
+          <w:sz w:val="21"/>
+          <w:szCs w:val="21"/>
+        </w:rPr>
+        <w:t xml:space="preserve">(v4) </w:t>
+      </w:r>
+      <w:r>
+        <w:rPr>
+          <w:rFonts w:ascii="Inter" w:cs="Inter" w:eastAsia="Inter" w:hAnsi="Inter"/>
+          <w:color w:val="1A1D21"/>
+          <w:sz w:val="21"/>
+          <w:szCs w:val="21"/>
+        </w:rPr>
+        <w:t xml:space="preserve">v1 targets </w:t>
+      </w:r>
+      <w:r>
+        <w:rPr>
+          <w:rFonts w:ascii="Inter" w:cs="Inter" w:eastAsia="Inter" w:hAnsi="Inter"/>
+          <w:b/>
+          <w:bCs/>
+          <w:color w:val="1A1D21"/>
+          <w:sz w:val="21"/>
+          <w:szCs w:val="21"/>
+        </w:rPr>
+        <w:t xml:space="preserve">GDPR and CCPA</w:t>
+      </w:r>
+      <w:r>
+        <w:rPr>
+          <w:rFonts w:ascii="Inter" w:cs="Inter" w:eastAsia="Inter" w:hAnsi="Inter"/>
+          <w:color w:val="1A1D21"/>
+          <w:sz w:val="21"/>
+          <w:szCs w:val="21"/>
+        </w:rPr>
+        <w:t xml:space="preserve"> compliance; SOC 2 is a roadmap item for later enterprise sales.</w:t>
+      </w:r>
+    </w:p>
+    <w:p>
+      <w:pPr>
+        <w:pStyle w:val="ListParagraph"/>
+        <w:numPr>
+          <w:ilvl w:val="0"/>
+          <w:numId w:val="2"/>
+        </w:numPr>
+        <w:spacing w:after="90" w:line="288"/>
+      </w:pPr>
+      <w:r>
+        <w:rPr>
+          <w:rFonts w:ascii="JetBrains Mono" w:cs="JetBrains Mono" w:eastAsia="JetBrains Mono" w:hAnsi="JetBrains Mono"/>
+          <w:b/>
+          <w:bCs/>
+          <w:color w:val="D9763A"/>
+          <w:sz w:val="20"/>
+          <w:szCs w:val="20"/>
+        </w:rPr>
+        <w:t xml:space="preserve">DPS-9  </w:t>
+      </w:r>
+      <w:r>
+        <w:rPr>
+          <w:rFonts w:ascii="Inter" w:cs="Inter" w:eastAsia="Inter" w:hAnsi="Inter"/>
+          <w:i/>
+          <w:iCs/>
+          <w:color w:val="1A1D21"/>
+          <w:sz w:val="21"/>
+          <w:szCs w:val="21"/>
+        </w:rPr>
+        <w:t xml:space="preserve">(v4) </w:t>
+      </w:r>
+      <w:r>
+        <w:rPr>
+          <w:rFonts w:ascii="Inter" w:cs="Inter" w:eastAsia="Inter" w:hAnsi="Inter"/>
+          <w:color w:val="1A1D21"/>
+          <w:sz w:val="21"/>
+          <w:szCs w:val="21"/>
+        </w:rPr>
+        <w:t xml:space="preserve">AI model/hosting is </w:t>
+      </w:r>
+      <w:r>
+        <w:rPr>
+          <w:rFonts w:ascii="Inter" w:cs="Inter" w:eastAsia="Inter" w:hAnsi="Inter"/>
+          <w:b/>
+          <w:bCs/>
+          <w:color w:val="1A1D21"/>
+          <w:sz w:val="21"/>
+          <w:szCs w:val="21"/>
+        </w:rPr>
+        <w:t xml:space="preserve">provider-abstracted</w:t>
+      </w:r>
+      <w:r>
+        <w:rPr>
+          <w:rFonts w:ascii="Inter" w:cs="Inter" w:eastAsia="Inter" w:hAnsi="Inter"/>
+          <w:color w:val="1A1D21"/>
+          <w:sz w:val="21"/>
+          <w:szCs w:val="21"/>
+        </w:rPr>
+        <w:t xml:space="preserve"> — best-available models, US data residency available, no single-vendor lock-in; account data never trains shared models (DPS-4).</w:t>
+      </w:r>
+    </w:p>
+    <w:p>
+      <w:pPr>
+        <w:pStyle w:val="ListParagraph"/>
+        <w:numPr>
+          <w:ilvl w:val="0"/>
+          <w:numId w:val="2"/>
+        </w:numPr>
+        <w:spacing w:after="90" w:line="288"/>
+      </w:pPr>
+      <w:r>
+        <w:rPr>
+          <w:rFonts w:ascii="JetBrains Mono" w:cs="JetBrains Mono" w:eastAsia="JetBrains Mono" w:hAnsi="JetBrains Mono"/>
+          <w:b/>
+          <w:bCs/>
+          <w:color w:val="D9763A"/>
+          <w:sz w:val="20"/>
+          <w:szCs w:val="20"/>
+        </w:rPr>
+        <w:t xml:space="preserve">DPS-10  </w:t>
+      </w:r>
+      <w:r>
+        <w:rPr>
+          <w:rFonts w:ascii="Inter" w:cs="Inter" w:eastAsia="Inter" w:hAnsi="Inter"/>
+          <w:i/>
+          <w:iCs/>
+          <w:color w:val="1A1D21"/>
+          <w:sz w:val="21"/>
+          <w:szCs w:val="21"/>
+        </w:rPr>
+        <w:t xml:space="preserve">(v5) </w:t>
+      </w:r>
+      <w:r>
+        <w:rPr>
+          <w:rFonts w:ascii="Inter" w:cs="Inter" w:eastAsia="Inter" w:hAnsi="Inter"/>
+          <w:b/>
+          <w:bCs/>
+          <w:color w:val="1A1D21"/>
+          <w:sz w:val="21"/>
+          <w:szCs w:val="21"/>
+        </w:rPr>
+        <w:t xml:space="preserve">Contact &amp; consent handling.</w:t>
+      </w:r>
+      <w:r>
+        <w:rPr>
+          <w:rFonts w:ascii="Inter" w:cs="Inter" w:eastAsia="Inter" w:hAnsi="Inter"/>
+          <w:color w:val="1A1D21"/>
+          <w:sz w:val="21"/>
+          <w:szCs w:val="21"/>
+        </w:rPr>
+        <w:t xml:space="preserve"> Respondent contact details are collected only on opt-in, minimized, encrypted, access-controlled, used solely for the follow-up the respondent consented to, and deletable on withdrawal (INV-13). Consent scope and lawful basis are tracked per contact (GDPR/CCPA).</w:t>
+      </w:r>
+    </w:p>
     <w:p>
       <w:pPr>
         <w:spacing w:after="80" w:before="360"/>
@@ -6903,7 +7603,7 @@
                 <w:sz w:val="19"/>
                 <w:szCs w:val="19"/>
               </w:rPr>
-              <w:t xml:space="preserve">Love / Like / Ambiguity / Dislike / Hate, if applicable — ordinal 5→1</w:t>
+              <w:t xml:space="preserve">Love / Like / Ambivalence / Dislike / Hate, if applicable — ordinal 5→1</w:t>
             </w:r>
           </w:p>
         </w:tc>
@@ -7953,6 +8653,56 @@
     </w:tbl>
     <w:p>
       <w:pPr>
+        <w:spacing w:after="140" w:line="300"/>
+      </w:pPr>
+      <w:r>
+        <w:rPr>
+          <w:rFonts w:ascii="Inter" w:cs="Inter" w:eastAsia="Inter" w:hAnsi="Inter"/>
+          <w:b/>
+          <w:bCs/>
+          <w:color w:val="1A1D21"/>
+          <w:sz w:val="21"/>
+          <w:szCs w:val="21"/>
+        </w:rPr>
+        <w:t xml:space="preserve">Contact (v5)</w:t>
+      </w:r>
+      <w:r>
+        <w:rPr>
+          <w:rFonts w:ascii="Inter" w:cs="Inter" w:eastAsia="Inter" w:hAnsi="Inter"/>
+          <w:color w:val="1A1D21"/>
+          <w:sz w:val="21"/>
+          <w:szCs w:val="21"/>
+        </w:rPr>
+        <w:t xml:space="preserve"> — an opt-in contact for a respondent (INV-13): contact_id, respondent_ref, channel/value (email), consent_scope, consent_at, withdrawn_at; kept separate and under DPS-10.</w:t>
+      </w:r>
+    </w:p>
+    <w:p>
+      <w:pPr>
+        <w:spacing w:after="140" w:line="300"/>
+      </w:pPr>
+      <w:r>
+        <w:rPr>
+          <w:rFonts w:ascii="Inter" w:cs="Inter" w:eastAsia="Inter" w:hAnsi="Inter"/>
+          <w:b/>
+          <w:bCs/>
+          <w:color w:val="1A1D21"/>
+          <w:sz w:val="21"/>
+          <w:szCs w:val="21"/>
+        </w:rPr>
+        <w:t xml:space="preserve">Trigger / Rule (v5)</w:t>
+      </w:r>
+      <w:r>
+        <w:rPr>
+          <w:rFonts w:ascii="Inter" w:cs="Inter" w:eastAsia="Inter" w:hAnsi="Inter"/>
+          <w:color w:val="1A1D21"/>
+          <w:sz w:val="21"/>
+          <w:szCs w:val="21"/>
+        </w:rPr>
+        <w:t xml:space="preserve"> — signal → action: rule_id, condition (brand_love ≤ Dislike, trust_index &lt; x, quadrant = At-risk, rating &lt; floor), action (open case, route to connector/owner), enabled.</w:t>
+      </w:r>
+    </w:p>
+    <w:p>
+      <w:pPr>
         <w:spacing w:after="40" w:before="220"/>
       </w:pPr>
       <w:r>
@@ -7964,7 +8714,7 @@
           <w:sz w:val="22"/>
           <w:szCs w:val="22"/>
         </w:rPr>
-        <w:t xml:space="preserve">MetricSnapshot</w:t>
+        <w:t xml:space="preserve">RecoveryCase  (v5)</w:t>
       </w:r>
       <w:r>
         <w:rPr>
@@ -7975,7 +8725,7 @@
           <w:sz w:val="20"/>
           <w:szCs w:val="20"/>
         </w:rPr>
-        <w:t xml:space="preserve">  — a computed rollup for a brand over a period and filter (O-4, O-9, O-11, O-12)</w:t>
+        <w:t xml:space="preserve">  — the internally-owned loop record (design-for-#3)</w:t>
       </w:r>
     </w:p>
     <w:tbl>
@@ -8077,7 +8827,7 @@
                 <w:sz w:val="19"/>
                 <w:szCs w:val="19"/>
               </w:rPr>
-              <w:t xml:space="preserve">brand_id / period</w:t>
+              <w:t xml:space="preserve">case_id</w:t>
             </w:r>
           </w:p>
         </w:tc>
@@ -8102,7 +8852,7 @@
                 <w:sz w:val="19"/>
                 <w:szCs w:val="19"/>
               </w:rPr>
-              <w:t xml:space="preserve">Brand and time window</w:t>
+              <w:t xml:space="preserve">Unique id</w:t>
             </w:r>
           </w:p>
         </w:tc>
@@ -8129,6 +8879,656 @@
                 <w:sz w:val="19"/>
                 <w:szCs w:val="19"/>
               </w:rPr>
+              <w:t xml:space="preserve">account_id</w:t>
+            </w:r>
+          </w:p>
+        </w:tc>
+        <w:tc>
+          <w:tcPr>
+            <w:tcW w:type="dxa" w:w="6660"/>
+            <w:tcMar>
+              <w:top w:type="dxa" w:w="70"/>
+              <w:left w:type="dxa" w:w="130"/>
+              <w:bottom w:type="dxa" w:w="70"/>
+              <w:right w:type="dxa" w:w="130"/>
+            </w:tcMar>
+          </w:tcPr>
+          <w:p>
+            <w:pPr>
+              <w:spacing w:after="0" w:line="250"/>
+            </w:pPr>
+            <w:r>
+              <w:rPr>
+                <w:rFonts w:ascii="Inter" w:cs="Inter" w:eastAsia="Inter" w:hAnsi="Inter"/>
+                <w:color w:val="1A1D21"/>
+                <w:sz w:val="19"/>
+                <w:szCs w:val="19"/>
+              </w:rPr>
+              <w:t xml:space="preserve">Owning tenant (INV-6)</w:t>
+            </w:r>
+          </w:p>
+        </w:tc>
+      </w:tr>
+      <w:tr>
+        <w:tc>
+          <w:tcPr>
+            <w:tcW w:type="dxa" w:w="2700"/>
+            <w:tcMar>
+              <w:top w:type="dxa" w:w="70"/>
+              <w:left w:type="dxa" w:w="130"/>
+              <w:bottom w:type="dxa" w:w="70"/>
+              <w:right w:type="dxa" w:w="130"/>
+            </w:tcMar>
+          </w:tcPr>
+          <w:p>
+            <w:pPr>
+              <w:spacing w:after="0" w:line="250"/>
+            </w:pPr>
+            <w:r>
+              <w:rPr>
+                <w:rFonts w:ascii="JetBrains Mono" w:cs="JetBrains Mono" w:eastAsia="JetBrains Mono" w:hAnsi="JetBrains Mono"/>
+                <w:color w:val="1A1D21"/>
+                <w:sz w:val="19"/>
+                <w:szCs w:val="19"/>
+              </w:rPr>
+              <w:t xml:space="preserve">record_ids</w:t>
+            </w:r>
+          </w:p>
+        </w:tc>
+        <w:tc>
+          <w:tcPr>
+            <w:tcW w:type="dxa" w:w="6660"/>
+            <w:tcMar>
+              <w:top w:type="dxa" w:w="70"/>
+              <w:left w:type="dxa" w:w="130"/>
+              <w:bottom w:type="dxa" w:w="70"/>
+              <w:right w:type="dxa" w:w="130"/>
+            </w:tcMar>
+          </w:tcPr>
+          <w:p>
+            <w:pPr>
+              <w:spacing w:after="0" w:line="250"/>
+            </w:pPr>
+            <w:r>
+              <w:rPr>
+                <w:rFonts w:ascii="Inter" w:cs="Inter" w:eastAsia="Inter" w:hAnsi="Inter"/>
+                <w:color w:val="1A1D21"/>
+                <w:sz w:val="19"/>
+                <w:szCs w:val="19"/>
+              </w:rPr>
+              <w:t xml:space="preserve">The feedback that opened / relates to the case</w:t>
+            </w:r>
+          </w:p>
+        </w:tc>
+      </w:tr>
+      <w:tr>
+        <w:tc>
+          <w:tcPr>
+            <w:tcW w:type="dxa" w:w="2700"/>
+            <w:tcMar>
+              <w:top w:type="dxa" w:w="70"/>
+              <w:left w:type="dxa" w:w="130"/>
+              <w:bottom w:type="dxa" w:w="70"/>
+              <w:right w:type="dxa" w:w="130"/>
+            </w:tcMar>
+          </w:tcPr>
+          <w:p>
+            <w:pPr>
+              <w:spacing w:after="0" w:line="250"/>
+            </w:pPr>
+            <w:r>
+              <w:rPr>
+                <w:rFonts w:ascii="JetBrains Mono" w:cs="JetBrains Mono" w:eastAsia="JetBrains Mono" w:hAnsi="JetBrains Mono"/>
+                <w:color w:val="1A1D21"/>
+                <w:sz w:val="19"/>
+                <w:szCs w:val="19"/>
+              </w:rPr>
+              <w:t xml:space="preserve">contact_id</w:t>
+            </w:r>
+          </w:p>
+        </w:tc>
+        <w:tc>
+          <w:tcPr>
+            <w:tcW w:type="dxa" w:w="6660"/>
+            <w:tcMar>
+              <w:top w:type="dxa" w:w="70"/>
+              <w:left w:type="dxa" w:w="130"/>
+              <w:bottom w:type="dxa" w:w="70"/>
+              <w:right w:type="dxa" w:w="130"/>
+            </w:tcMar>
+          </w:tcPr>
+          <w:p>
+            <w:pPr>
+              <w:spacing w:after="0" w:line="250"/>
+            </w:pPr>
+            <w:r>
+              <w:rPr>
+                <w:rFonts w:ascii="Inter" w:cs="Inter" w:eastAsia="Inter" w:hAnsi="Inter"/>
+                <w:color w:val="1A1D21"/>
+                <w:sz w:val="19"/>
+                <w:szCs w:val="19"/>
+              </w:rPr>
+              <w:t xml:space="preserve">Linked opt-in contact, if any (INV-13)</w:t>
+            </w:r>
+          </w:p>
+        </w:tc>
+      </w:tr>
+      <w:tr>
+        <w:tc>
+          <w:tcPr>
+            <w:tcW w:type="dxa" w:w="2700"/>
+            <w:tcMar>
+              <w:top w:type="dxa" w:w="70"/>
+              <w:left w:type="dxa" w:w="130"/>
+              <w:bottom w:type="dxa" w:w="70"/>
+              <w:right w:type="dxa" w:w="130"/>
+            </w:tcMar>
+          </w:tcPr>
+          <w:p>
+            <w:pPr>
+              <w:spacing w:after="0" w:line="250"/>
+            </w:pPr>
+            <w:r>
+              <w:rPr>
+                <w:rFonts w:ascii="JetBrains Mono" w:cs="JetBrains Mono" w:eastAsia="JetBrains Mono" w:hAnsi="JetBrains Mono"/>
+                <w:color w:val="1A1D21"/>
+                <w:sz w:val="19"/>
+                <w:szCs w:val="19"/>
+              </w:rPr>
+              <w:t xml:space="preserve">owner</w:t>
+            </w:r>
+          </w:p>
+        </w:tc>
+        <w:tc>
+          <w:tcPr>
+            <w:tcW w:type="dxa" w:w="6660"/>
+            <w:tcMar>
+              <w:top w:type="dxa" w:w="70"/>
+              <w:left w:type="dxa" w:w="130"/>
+              <w:bottom w:type="dxa" w:w="70"/>
+              <w:right w:type="dxa" w:w="130"/>
+            </w:tcMar>
+          </w:tcPr>
+          <w:p>
+            <w:pPr>
+              <w:spacing w:after="0" w:line="250"/>
+            </w:pPr>
+            <w:r>
+              <w:rPr>
+                <w:rFonts w:ascii="Inter" w:cs="Inter" w:eastAsia="Inter" w:hAnsi="Inter"/>
+                <w:color w:val="1A1D21"/>
+                <w:sz w:val="19"/>
+                <w:szCs w:val="19"/>
+              </w:rPr>
+              <w:t xml:space="preserve">Assigned owner / queue</w:t>
+            </w:r>
+          </w:p>
+        </w:tc>
+      </w:tr>
+      <w:tr>
+        <w:tc>
+          <w:tcPr>
+            <w:tcW w:type="dxa" w:w="2700"/>
+            <w:tcMar>
+              <w:top w:type="dxa" w:w="70"/>
+              <w:left w:type="dxa" w:w="130"/>
+              <w:bottom w:type="dxa" w:w="70"/>
+              <w:right w:type="dxa" w:w="130"/>
+            </w:tcMar>
+          </w:tcPr>
+          <w:p>
+            <w:pPr>
+              <w:spacing w:after="0" w:line="250"/>
+            </w:pPr>
+            <w:r>
+              <w:rPr>
+                <w:rFonts w:ascii="JetBrains Mono" w:cs="JetBrains Mono" w:eastAsia="JetBrains Mono" w:hAnsi="JetBrains Mono"/>
+                <w:color w:val="1A1D21"/>
+                <w:sz w:val="19"/>
+                <w:szCs w:val="19"/>
+              </w:rPr>
+              <w:t xml:space="preserve">status</w:t>
+            </w:r>
+          </w:p>
+        </w:tc>
+        <w:tc>
+          <w:tcPr>
+            <w:tcW w:type="dxa" w:w="6660"/>
+            <w:tcMar>
+              <w:top w:type="dxa" w:w="70"/>
+              <w:left w:type="dxa" w:w="130"/>
+              <w:bottom w:type="dxa" w:w="70"/>
+              <w:right w:type="dxa" w:w="130"/>
+            </w:tcMar>
+          </w:tcPr>
+          <w:p>
+            <w:pPr>
+              <w:spacing w:after="0" w:line="250"/>
+            </w:pPr>
+            <w:r>
+              <w:rPr>
+                <w:rFonts w:ascii="Inter" w:cs="Inter" w:eastAsia="Inter" w:hAnsi="Inter"/>
+                <w:color w:val="1A1D21"/>
+                <w:sz w:val="19"/>
+                <w:szCs w:val="19"/>
+              </w:rPr>
+              <w:t xml:space="preserve">open · in_progress · resolved · closed</w:t>
+            </w:r>
+          </w:p>
+        </w:tc>
+      </w:tr>
+      <w:tr>
+        <w:tc>
+          <w:tcPr>
+            <w:tcW w:type="dxa" w:w="2700"/>
+            <w:tcMar>
+              <w:top w:type="dxa" w:w="70"/>
+              <w:left w:type="dxa" w:w="130"/>
+              <w:bottom w:type="dxa" w:w="70"/>
+              <w:right w:type="dxa" w:w="130"/>
+            </w:tcMar>
+          </w:tcPr>
+          <w:p>
+            <w:pPr>
+              <w:spacing w:after="0" w:line="250"/>
+            </w:pPr>
+            <w:r>
+              <w:rPr>
+                <w:rFonts w:ascii="JetBrains Mono" w:cs="JetBrains Mono" w:eastAsia="JetBrains Mono" w:hAnsi="JetBrains Mono"/>
+                <w:color w:val="1A1D21"/>
+                <w:sz w:val="19"/>
+                <w:szCs w:val="19"/>
+              </w:rPr>
+              <w:t xml:space="preserve">external_ref</w:t>
+            </w:r>
+          </w:p>
+        </w:tc>
+        <w:tc>
+          <w:tcPr>
+            <w:tcW w:type="dxa" w:w="6660"/>
+            <w:tcMar>
+              <w:top w:type="dxa" w:w="70"/>
+              <w:left w:type="dxa" w:w="130"/>
+              <w:bottom w:type="dxa" w:w="70"/>
+              <w:right w:type="dxa" w:w="130"/>
+            </w:tcMar>
+          </w:tcPr>
+          <w:p>
+            <w:pPr>
+              <w:spacing w:after="0" w:line="250"/>
+            </w:pPr>
+            <w:r>
+              <w:rPr>
+                <w:rFonts w:ascii="Inter" w:cs="Inter" w:eastAsia="Inter" w:hAnsi="Inter"/>
+                <w:color w:val="1A1D21"/>
+                <w:sz w:val="19"/>
+                <w:szCs w:val="19"/>
+              </w:rPr>
+              <w:t xml:space="preserve">The linked item in the company’s helpdesk/CRM, if integrated (R-37)</w:t>
+            </w:r>
+          </w:p>
+        </w:tc>
+      </w:tr>
+      <w:tr>
+        <w:tc>
+          <w:tcPr>
+            <w:tcW w:type="dxa" w:w="2700"/>
+            <w:tcMar>
+              <w:top w:type="dxa" w:w="70"/>
+              <w:left w:type="dxa" w:w="130"/>
+              <w:bottom w:type="dxa" w:w="70"/>
+              <w:right w:type="dxa" w:w="130"/>
+            </w:tcMar>
+          </w:tcPr>
+          <w:p>
+            <w:pPr>
+              <w:spacing w:after="0" w:line="250"/>
+            </w:pPr>
+            <w:r>
+              <w:rPr>
+                <w:rFonts w:ascii="JetBrains Mono" w:cs="JetBrains Mono" w:eastAsia="JetBrains Mono" w:hAnsi="JetBrains Mono"/>
+                <w:color w:val="1A1D21"/>
+                <w:sz w:val="19"/>
+                <w:szCs w:val="19"/>
+              </w:rPr>
+              <w:t xml:space="preserve">opened_at / resolved_at</w:t>
+            </w:r>
+          </w:p>
+        </w:tc>
+        <w:tc>
+          <w:tcPr>
+            <w:tcW w:type="dxa" w:w="6660"/>
+            <w:tcMar>
+              <w:top w:type="dxa" w:w="70"/>
+              <w:left w:type="dxa" w:w="130"/>
+              <w:bottom w:type="dxa" w:w="70"/>
+              <w:right w:type="dxa" w:w="130"/>
+            </w:tcMar>
+          </w:tcPr>
+          <w:p>
+            <w:pPr>
+              <w:spacing w:after="0" w:line="250"/>
+            </w:pPr>
+            <w:r>
+              <w:rPr>
+                <w:rFonts w:ascii="Inter" w:cs="Inter" w:eastAsia="Inter" w:hAnsi="Inter"/>
+                <w:color w:val="1A1D21"/>
+                <w:sz w:val="19"/>
+                <w:szCs w:val="19"/>
+              </w:rPr>
+              <w:t xml:space="preserve">Timestamps → time-to-resolve (O-15)</w:t>
+            </w:r>
+          </w:p>
+        </w:tc>
+      </w:tr>
+      <w:tr>
+        <w:tc>
+          <w:tcPr>
+            <w:tcW w:type="dxa" w:w="2700"/>
+            <w:tcMar>
+              <w:top w:type="dxa" w:w="70"/>
+              <w:left w:type="dxa" w:w="130"/>
+              <w:bottom w:type="dxa" w:w="70"/>
+              <w:right w:type="dxa" w:w="130"/>
+            </w:tcMar>
+          </w:tcPr>
+          <w:p>
+            <w:pPr>
+              <w:spacing w:after="0" w:line="250"/>
+            </w:pPr>
+            <w:r>
+              <w:rPr>
+                <w:rFonts w:ascii="JetBrains Mono" w:cs="JetBrains Mono" w:eastAsia="JetBrains Mono" w:hAnsi="JetBrains Mono"/>
+                <w:color w:val="1A1D21"/>
+                <w:sz w:val="19"/>
+                <w:szCs w:val="19"/>
+              </w:rPr>
+              <w:t xml:space="preserve">recovery_delta</w:t>
+            </w:r>
+          </w:p>
+        </w:tc>
+        <w:tc>
+          <w:tcPr>
+            <w:tcW w:type="dxa" w:w="6660"/>
+            <w:tcMar>
+              <w:top w:type="dxa" w:w="70"/>
+              <w:left w:type="dxa" w:w="130"/>
+              <w:bottom w:type="dxa" w:w="70"/>
+              <w:right w:type="dxa" w:w="130"/>
+            </w:tcMar>
+          </w:tcPr>
+          <w:p>
+            <w:pPr>
+              <w:spacing w:after="0" w:line="250"/>
+            </w:pPr>
+            <w:r>
+              <w:rPr>
+                <w:rFonts w:ascii="Inter" w:cs="Inter" w:eastAsia="Inter" w:hAnsi="Inter"/>
+                <w:color w:val="1A1D21"/>
+                <w:sz w:val="19"/>
+                <w:szCs w:val="19"/>
+              </w:rPr>
+              <w:t xml:space="preserve">Change in Brand Love / Trust before vs. after resolution (O-15)</w:t>
+            </w:r>
+          </w:p>
+        </w:tc>
+      </w:tr>
+      <w:tr>
+        <w:tc>
+          <w:tcPr>
+            <w:tcW w:type="dxa" w:w="2700"/>
+            <w:tcMar>
+              <w:top w:type="dxa" w:w="70"/>
+              <w:left w:type="dxa" w:w="130"/>
+              <w:bottom w:type="dxa" w:w="70"/>
+              <w:right w:type="dxa" w:w="130"/>
+            </w:tcMar>
+          </w:tcPr>
+          <w:p>
+            <w:pPr>
+              <w:spacing w:after="0" w:line="250"/>
+            </w:pPr>
+            <w:r>
+              <w:rPr>
+                <w:rFonts w:ascii="JetBrains Mono" w:cs="JetBrains Mono" w:eastAsia="JetBrains Mono" w:hAnsi="JetBrains Mono"/>
+                <w:color w:val="1A1D21"/>
+                <w:sz w:val="19"/>
+                <w:szCs w:val="19"/>
+              </w:rPr>
+              <w:t xml:space="preserve">resolution_notes</w:t>
+            </w:r>
+          </w:p>
+        </w:tc>
+        <w:tc>
+          <w:tcPr>
+            <w:tcW w:type="dxa" w:w="6660"/>
+            <w:tcMar>
+              <w:top w:type="dxa" w:w="70"/>
+              <w:left w:type="dxa" w:w="130"/>
+              <w:bottom w:type="dxa" w:w="70"/>
+              <w:right w:type="dxa" w:w="130"/>
+            </w:tcMar>
+          </w:tcPr>
+          <w:p>
+            <w:pPr>
+              <w:spacing w:after="0" w:line="250"/>
+            </w:pPr>
+            <w:r>
+              <w:rPr>
+                <w:rFonts w:ascii="Inter" w:cs="Inter" w:eastAsia="Inter" w:hAnsi="Inter"/>
+                <w:color w:val="1A1D21"/>
+                <w:sz w:val="19"/>
+                <w:szCs w:val="19"/>
+              </w:rPr>
+              <w:t xml:space="preserve">What was done</w:t>
+            </w:r>
+          </w:p>
+        </w:tc>
+      </w:tr>
+    </w:tbl>
+    <w:p>
+      <w:pPr>
+        <w:spacing w:after="140" w:line="300"/>
+      </w:pPr>
+      <w:r>
+        <w:rPr>
+          <w:rFonts w:ascii="Inter" w:cs="Inter" w:eastAsia="Inter" w:hAnsi="Inter"/>
+          <w:b/>
+          <w:bCs/>
+          <w:color w:val="1A1D21"/>
+          <w:sz w:val="21"/>
+          <w:szCs w:val="21"/>
+        </w:rPr>
+        <w:t xml:space="preserve">Connector (v5)</w:t>
+      </w:r>
+      <w:r>
+        <w:rPr>
+          <w:rFonts w:ascii="Inter" w:cs="Inter" w:eastAsia="Inter" w:hAnsi="Inter"/>
+          <w:color w:val="1A1D21"/>
+          <w:sz w:val="21"/>
+          <w:szCs w:val="21"/>
+        </w:rPr>
+        <w:t xml:space="preserve"> — an integration to an external tool: connector_id, type (helpdesk / CRM / email), config / credentials-ref (secrets kept out of the model — DPS-6), scope.</w:t>
+      </w:r>
+    </w:p>
+    <w:p>
+      <w:pPr>
+        <w:spacing w:after="40" w:before="220"/>
+      </w:pPr>
+      <w:r>
+        <w:rPr>
+          <w:rFonts w:ascii="Inter" w:cs="Inter" w:eastAsia="Inter" w:hAnsi="Inter"/>
+          <w:b/>
+          <w:bCs/>
+          <w:color w:val="1A1D21"/>
+          <w:sz w:val="22"/>
+          <w:szCs w:val="22"/>
+        </w:rPr>
+        <w:t xml:space="preserve">MetricSnapshot</w:t>
+      </w:r>
+      <w:r>
+        <w:rPr>
+          <w:rFonts w:ascii="Inter" w:cs="Inter" w:eastAsia="Inter" w:hAnsi="Inter"/>
+          <w:i/>
+          <w:iCs/>
+          <w:color w:val="6B6F76"/>
+          <w:sz w:val="20"/>
+          <w:szCs w:val="20"/>
+        </w:rPr>
+        <w:t xml:space="preserve">  — a computed rollup for a brand over a period and filter (O-4, O-9, O-11, O-12, O-15)</w:t>
+      </w:r>
+    </w:p>
+    <w:tbl>
+      <w:tblPr>
+        <w:tblW w:type="dxa" w:w="9360"/>
+        <w:tblBorders>
+          <w:top w:val="single" w:color="1A1D21" w:sz="12"/>
+          <w:left w:val="none" w:color="auto" w:sz="0"/>
+          <w:bottom w:val="single" w:color="1A1D21" w:sz="12"/>
+          <w:right w:val="none" w:color="auto" w:sz="0"/>
+          <w:insideH w:val="single" w:color="E5E2DA" w:sz="8"/>
+          <w:insideV w:val="none" w:color="auto" w:sz="0"/>
+        </w:tblBorders>
+      </w:tblPr>
+      <w:tblGrid>
+        <w:gridCol w:w="2700"/>
+        <w:gridCol w:w="6660"/>
+      </w:tblGrid>
+      <w:tr>
+        <w:trPr>
+          <w:tblHeader/>
+        </w:trPr>
+        <w:tc>
+          <w:tcPr>
+            <w:tcW w:type="dxa" w:w="2700"/>
+            <w:shd w:fill="E5E2DA" w:color="auto" w:val="clear"/>
+            <w:tcMar>
+              <w:top w:type="dxa" w:w="70"/>
+              <w:left w:type="dxa" w:w="130"/>
+              <w:bottom w:type="dxa" w:w="70"/>
+              <w:right w:type="dxa" w:w="130"/>
+            </w:tcMar>
+          </w:tcPr>
+          <w:p>
+            <w:pPr>
+              <w:spacing w:after="0" w:line="250"/>
+            </w:pPr>
+            <w:r>
+              <w:rPr>
+                <w:rFonts w:ascii="Inter" w:cs="Inter" w:eastAsia="Inter" w:hAnsi="Inter"/>
+                <w:b/>
+                <w:bCs/>
+                <w:color w:val="1A1D21"/>
+                <w:sz w:val="18"/>
+                <w:szCs w:val="18"/>
+              </w:rPr>
+              <w:t xml:space="preserve">Field</w:t>
+            </w:r>
+          </w:p>
+        </w:tc>
+        <w:tc>
+          <w:tcPr>
+            <w:tcW w:type="dxa" w:w="6660"/>
+            <w:shd w:fill="E5E2DA" w:color="auto" w:val="clear"/>
+            <w:tcMar>
+              <w:top w:type="dxa" w:w="70"/>
+              <w:left w:type="dxa" w:w="130"/>
+              <w:bottom w:type="dxa" w:w="70"/>
+              <w:right w:type="dxa" w:w="130"/>
+            </w:tcMar>
+          </w:tcPr>
+          <w:p>
+            <w:pPr>
+              <w:spacing w:after="0" w:line="250"/>
+            </w:pPr>
+            <w:r>
+              <w:rPr>
+                <w:rFonts w:ascii="Inter" w:cs="Inter" w:eastAsia="Inter" w:hAnsi="Inter"/>
+                <w:b/>
+                <w:bCs/>
+                <w:color w:val="1A1D21"/>
+                <w:sz w:val="18"/>
+                <w:szCs w:val="18"/>
+              </w:rPr>
+              <w:t xml:space="preserve">Meaning</w:t>
+            </w:r>
+          </w:p>
+        </w:tc>
+      </w:tr>
+      <w:tr>
+        <w:tc>
+          <w:tcPr>
+            <w:tcW w:type="dxa" w:w="2700"/>
+            <w:tcMar>
+              <w:top w:type="dxa" w:w="70"/>
+              <w:left w:type="dxa" w:w="130"/>
+              <w:bottom w:type="dxa" w:w="70"/>
+              <w:right w:type="dxa" w:w="130"/>
+            </w:tcMar>
+          </w:tcPr>
+          <w:p>
+            <w:pPr>
+              <w:spacing w:after="0" w:line="250"/>
+            </w:pPr>
+            <w:r>
+              <w:rPr>
+                <w:rFonts w:ascii="JetBrains Mono" w:cs="JetBrains Mono" w:eastAsia="JetBrains Mono" w:hAnsi="JetBrains Mono"/>
+                <w:color w:val="1A1D21"/>
+                <w:sz w:val="19"/>
+                <w:szCs w:val="19"/>
+              </w:rPr>
+              <w:t xml:space="preserve">brand_id / period</w:t>
+            </w:r>
+          </w:p>
+        </w:tc>
+        <w:tc>
+          <w:tcPr>
+            <w:tcW w:type="dxa" w:w="6660"/>
+            <w:tcMar>
+              <w:top w:type="dxa" w:w="70"/>
+              <w:left w:type="dxa" w:w="130"/>
+              <w:bottom w:type="dxa" w:w="70"/>
+              <w:right w:type="dxa" w:w="130"/>
+            </w:tcMar>
+          </w:tcPr>
+          <w:p>
+            <w:pPr>
+              <w:spacing w:after="0" w:line="250"/>
+            </w:pPr>
+            <w:r>
+              <w:rPr>
+                <w:rFonts w:ascii="Inter" w:cs="Inter" w:eastAsia="Inter" w:hAnsi="Inter"/>
+                <w:color w:val="1A1D21"/>
+                <w:sz w:val="19"/>
+                <w:szCs w:val="19"/>
+              </w:rPr>
+              <w:t xml:space="preserve">Brand and time window</w:t>
+            </w:r>
+          </w:p>
+        </w:tc>
+      </w:tr>
+      <w:tr>
+        <w:tc>
+          <w:tcPr>
+            <w:tcW w:type="dxa" w:w="2700"/>
+            <w:tcMar>
+              <w:top w:type="dxa" w:w="70"/>
+              <w:left w:type="dxa" w:w="130"/>
+              <w:bottom w:type="dxa" w:w="70"/>
+              <w:right w:type="dxa" w:w="130"/>
+            </w:tcMar>
+          </w:tcPr>
+          <w:p>
+            <w:pPr>
+              <w:spacing w:after="0" w:line="250"/>
+            </w:pPr>
+            <w:r>
+              <w:rPr>
+                <w:rFonts w:ascii="JetBrains Mono" w:cs="JetBrains Mono" w:eastAsia="JetBrains Mono" w:hAnsi="JetBrains Mono"/>
+                <w:color w:val="1A1D21"/>
+                <w:sz w:val="19"/>
+                <w:szCs w:val="19"/>
+              </w:rPr>
               <w:t xml:space="preserve">metric</w:t>
             </w:r>
           </w:p>
@@ -8154,7 +9554,7 @@
                 <w:sz w:val="19"/>
                 <w:szCs w:val="19"/>
               </w:rPr>
-              <w:t xml:space="preserve">avg_rating · nps · csat · brand_love_index · trust_index (v3) · trust_&lt;driver&gt; (v3) · neg_sentiment_share · response_rate · completion_rate</w:t>
+              <w:t xml:space="preserve">avg_rating · nps · csat · brand_love_index · trust_index (v3) · trust_&lt;driver&gt; (v3) · recovery_rate (v5) · avg_time_to_resolve (v5) · neg_sentiment_share · response_rate · completion_rate</w:t>
             </w:r>
           </w:p>
         </w:tc>
@@ -8288,6 +9688,20 @@
               <w:t xml:space="preserve">Unified customer view — there is deliberately NO individual-Customer entity. It aggregates FeedbackRecords for an own brand across all sources and time, grouped by Segment — a population read, not a person read (R-26, INV-9).</w:t>
             </w:r>
           </w:p>
+          <w:p>
+            <w:pPr>
+              <w:spacing w:after="40" w:line="276"/>
+            </w:pPr>
+            <w:r>
+              <w:rPr>
+                <w:rFonts w:ascii="Inter" w:cs="Inter" w:eastAsia="Inter" w:hAnsi="Inter"/>
+                <w:color w:val="1A1D21"/>
+                <w:sz w:val="20"/>
+                <w:szCs w:val="20"/>
+              </w:rPr>
+              <w:t xml:space="preserve">Closed loop (v5) — the RecoveryCase, its status lifecycle, and its recovery measurement live in AAA Insights’ own data model even when the workflow runs in an external tool; that is what makes native workflow (#3) an additive evolution, not a rewrite.</w:t>
+            </w:r>
+          </w:p>
         </w:tc>
       </w:tr>
     </w:tbl>
@@ -8512,6 +9926,20 @@
               <w:t xml:space="preserve">• Insight report with ranked actions (R-18, R-22)  •  Two roles, account isolation, data export/delete (R-21, R-23)</w:t>
             </w:r>
           </w:p>
+          <w:p>
+            <w:pPr>
+              <w:spacing w:after="40" w:line="276"/>
+            </w:pPr>
+            <w:r>
+              <w:rPr>
+                <w:rFonts w:ascii="Inter" w:cs="Inter" w:eastAsia="Inter" w:hAnsi="Inter"/>
+                <w:color w:val="1A1D21"/>
+                <w:sz w:val="20"/>
+                <w:szCs w:val="20"/>
+              </w:rPr>
+              <w:t xml:space="preserve">• Closed-loop (starter): detect + prioritize dissatisfaction, open RecoveryCases, opt-in follow-up contact (R-34–R-36, R-40) — architected for the full loop and #3.</w:t>
+            </w:r>
+          </w:p>
         </w:tc>
       </w:tr>
     </w:tbl>
@@ -8574,7 +10002,7 @@
                 <w:sz w:val="20"/>
                 <w:szCs w:val="20"/>
               </w:rPr>
-              <w:t xml:space="preserve">The MVP can ship with a single-item trust rating plus inferred trust from open text; the full multi-item driver battery (reliability/integrity/benevolence/security) can be a fast-follow if it risks the MVP timeline. See Q-14.</w:t>
+              <w:t xml:space="preserve">The MVP can ship with a single-item trust rating plus inferred trust from open text; the full multi-item driver battery (reliability/integrity/benevolence/security) can be a fast-follow if it risks the MVP timeline. See D-14.</w:t>
             </w:r>
           </w:p>
         </w:tc>
@@ -8679,6 +10107,25 @@
     </w:p>
     <w:p>
       <w:pPr>
+        <w:pStyle w:val="ListParagraph"/>
+        <w:numPr>
+          <w:ilvl w:val="0"/>
+          <w:numId w:val="2"/>
+        </w:numPr>
+        <w:spacing w:after="90" w:line="288"/>
+      </w:pPr>
+      <w:r>
+        <w:rPr>
+          <w:rFonts w:ascii="Inter" w:cs="Inter" w:eastAsia="Inter" w:hAnsi="Inter"/>
+          <w:color w:val="1A1D21"/>
+          <w:sz w:val="21"/>
+          <w:szCs w:val="21"/>
+        </w:rPr>
+        <w:t xml:space="preserve">Full closed loop (#2): integrations / hand-off to helpdesk / CRM / email (R-37), recovery measurement (R-38, O-15), and reinforcement plays for satisfied customers (R-39).</w:t>
+      </w:r>
+    </w:p>
+    <w:p>
+      <w:pPr>
         <w:spacing w:after="90" w:before="200"/>
       </w:pPr>
       <w:r>
@@ -8690,26 +10137,45 @@
           <w:sz w:val="22"/>
           <w:szCs w:val="22"/>
         </w:rPr>
-        <w:t xml:space="preserve">Phase 2 — Connectors &amp; scale</w:t>
-      </w:r>
-    </w:p>
-    <w:p>
-      <w:pPr>
-        <w:pStyle w:val="ListParagraph"/>
-        <w:numPr>
-          <w:ilvl w:val="0"/>
-          <w:numId w:val="2"/>
-        </w:numPr>
-        <w:spacing w:after="90" w:line="288"/>
-      </w:pPr>
-      <w:r>
-        <w:rPr>
-          <w:rFonts w:ascii="Inter" w:cs="Inter" w:eastAsia="Inter" w:hAnsi="Inter"/>
-          <w:color w:val="1A1D21"/>
-          <w:sz w:val="21"/>
-          <w:szCs w:val="21"/>
-        </w:rPr>
-        <w:t xml:space="preserve">Additional sanctioned connectors; larger-volume background processing (NFR-5); multi-language expansion (Q-4); team collaboration.</w:t>
+        <w:t xml:space="preserve">Phase 2 — Connectors, scale &amp; native workflow horizon</w:t>
+      </w:r>
+    </w:p>
+    <w:p>
+      <w:pPr>
+        <w:pStyle w:val="ListParagraph"/>
+        <w:numPr>
+          <w:ilvl w:val="0"/>
+          <w:numId w:val="2"/>
+        </w:numPr>
+        <w:spacing w:after="90" w:line="288"/>
+      </w:pPr>
+      <w:r>
+        <w:rPr>
+          <w:rFonts w:ascii="Inter" w:cs="Inter" w:eastAsia="Inter" w:hAnsi="Inter"/>
+          <w:color w:val="1A1D21"/>
+          <w:sz w:val="21"/>
+          <w:szCs w:val="21"/>
+        </w:rPr>
+        <w:t xml:space="preserve">Additional sanctioned connectors; larger-volume background processing (NFR-5); multi-language expansion (D-4); team collaboration.</w:t>
+      </w:r>
+    </w:p>
+    <w:p>
+      <w:pPr>
+        <w:pStyle w:val="ListParagraph"/>
+        <w:numPr>
+          <w:ilvl w:val="0"/>
+          <w:numId w:val="2"/>
+        </w:numPr>
+        <w:spacing w:after="90" w:line="288"/>
+      </w:pPr>
+      <w:r>
+        <w:rPr>
+          <w:rFonts w:ascii="Inter" w:cs="Inter" w:eastAsia="Inter" w:hAnsi="Inter"/>
+          <w:color w:val="1A1D21"/>
+          <w:sz w:val="21"/>
+          <w:szCs w:val="21"/>
+        </w:rPr>
+        <w:t xml:space="preserve">Native closed-loop workbench (posture #3) — agent queues, SLAs, and macros brought in-house, reusing the RecoveryCase, triggers, connectors, consent, and recovery metrics built for #2. Pursued when demand from #2 justifies it (a real decision, made from evidence — it changes the buyer and the pricing).</w:t>
       </w:r>
     </w:p>
     <w:p>
@@ -8794,7 +10260,7 @@
           <w:sz w:val="40"/>
           <w:szCs w:val="40"/>
         </w:rPr>
-        <w:t xml:space="preserve">Open questions</w:t>
+        <w:t xml:space="preserve">Decisions (resolved in v4)</w:t>
       </w:r>
     </w:p>
     <w:p>
@@ -8810,457 +10276,1406 @@
           <w:sz w:val="26"/>
           <w:szCs w:val="26"/>
         </w:rPr>
-        <w:t xml:space="preserve">Decisions we need from you before proceeding to CHALLENGE (Phase 2).</w:t>
-      </w:r>
-    </w:p>
-    <w:p>
-      <w:pPr>
-        <w:pStyle w:val="ListParagraph"/>
-        <w:numPr>
-          <w:ilvl w:val="0"/>
-          <w:numId w:val="2"/>
-        </w:numPr>
-        <w:spacing w:after="90" w:line="288"/>
-      </w:pPr>
-      <w:r>
-        <w:rPr>
-          <w:rFonts w:ascii="JetBrains Mono" w:cs="JetBrains Mono" w:eastAsia="JetBrains Mono" w:hAnsi="JetBrains Mono"/>
-          <w:b/>
-          <w:bCs/>
-          <w:color w:val="D9763A"/>
-          <w:sz w:val="20"/>
-          <w:szCs w:val="20"/>
-        </w:rPr>
-        <w:t xml:space="preserve">Q-1  </w:t>
-      </w:r>
-      <w:r>
-        <w:rPr>
-          <w:rFonts w:ascii="Inter" w:cs="Inter" w:eastAsia="Inter" w:hAnsi="Inter"/>
-          <w:color w:val="1A1D21"/>
-          <w:sz w:val="21"/>
-          <w:szCs w:val="21"/>
-        </w:rPr>
-        <w:t xml:space="preserve">Product name — is "AAA Insights" the intended name or a working title?</w:t>
-      </w:r>
-    </w:p>
-    <w:p>
-      <w:pPr>
-        <w:pStyle w:val="ListParagraph"/>
-        <w:numPr>
-          <w:ilvl w:val="0"/>
-          <w:numId w:val="2"/>
-        </w:numPr>
-        <w:spacing w:after="90" w:line="288"/>
-      </w:pPr>
-      <w:r>
-        <w:rPr>
-          <w:rFonts w:ascii="JetBrains Mono" w:cs="JetBrains Mono" w:eastAsia="JetBrains Mono" w:hAnsi="JetBrains Mono"/>
-          <w:b/>
-          <w:bCs/>
-          <w:color w:val="D9763A"/>
-          <w:sz w:val="20"/>
-          <w:szCs w:val="20"/>
-        </w:rPr>
-        <w:t xml:space="preserve">Q-2  </w:t>
-      </w:r>
-      <w:r>
-        <w:rPr>
-          <w:rFonts w:ascii="Inter" w:cs="Inter" w:eastAsia="Inter" w:hAnsi="Inter"/>
-          <w:color w:val="1A1D21"/>
-          <w:sz w:val="21"/>
-          <w:szCs w:val="21"/>
-        </w:rPr>
-        <w:t xml:space="preserve">Build vs. buy the survey engine — build collection natively, or wrap an existing component?</w:t>
-      </w:r>
-    </w:p>
-    <w:p>
-      <w:pPr>
-        <w:pStyle w:val="ListParagraph"/>
-        <w:numPr>
-          <w:ilvl w:val="0"/>
-          <w:numId w:val="2"/>
-        </w:numPr>
-        <w:spacing w:after="90" w:line="288"/>
-      </w:pPr>
-      <w:r>
-        <w:rPr>
-          <w:rFonts w:ascii="JetBrains Mono" w:cs="JetBrains Mono" w:eastAsia="JetBrains Mono" w:hAnsi="JetBrains Mono"/>
-          <w:b/>
-          <w:bCs/>
-          <w:color w:val="D9763A"/>
-          <w:sz w:val="20"/>
-          <w:szCs w:val="20"/>
-        </w:rPr>
-        <w:t xml:space="preserve">Q-3  </w:t>
-      </w:r>
-      <w:r>
-        <w:rPr>
-          <w:rFonts w:ascii="Inter" w:cs="Inter" w:eastAsia="Inter" w:hAnsi="Inter"/>
-          <w:color w:val="1A1D21"/>
-          <w:sz w:val="21"/>
-          <w:szCs w:val="21"/>
-        </w:rPr>
-        <w:t xml:space="preserve">AI models / hosting — any constraints on model provider or data residency?</w:t>
-      </w:r>
-    </w:p>
-    <w:p>
-      <w:pPr>
-        <w:pStyle w:val="ListParagraph"/>
-        <w:numPr>
-          <w:ilvl w:val="0"/>
-          <w:numId w:val="2"/>
-        </w:numPr>
-        <w:spacing w:after="90" w:line="288"/>
-      </w:pPr>
-      <w:r>
-        <w:rPr>
-          <w:rFonts w:ascii="JetBrains Mono" w:cs="JetBrains Mono" w:eastAsia="JetBrains Mono" w:hAnsi="JetBrains Mono"/>
-          <w:b/>
-          <w:bCs/>
-          <w:color w:val="D9763A"/>
-          <w:sz w:val="20"/>
-          <w:szCs w:val="20"/>
-        </w:rPr>
-        <w:t xml:space="preserve">Q-4  </w:t>
-      </w:r>
-      <w:r>
-        <w:rPr>
-          <w:rFonts w:ascii="Inter" w:cs="Inter" w:eastAsia="Inter" w:hAnsi="Inter"/>
-          <w:color w:val="1A1D21"/>
-          <w:sz w:val="21"/>
-          <w:szCs w:val="21"/>
-        </w:rPr>
-        <w:t xml:space="preserve">Language coverage for v1 — English-only, or which additional languages at launch?</w:t>
-      </w:r>
-    </w:p>
-    <w:p>
-      <w:pPr>
-        <w:pStyle w:val="ListParagraph"/>
-        <w:numPr>
-          <w:ilvl w:val="0"/>
-          <w:numId w:val="2"/>
-        </w:numPr>
-        <w:spacing w:after="90" w:line="288"/>
-      </w:pPr>
-      <w:r>
-        <w:rPr>
-          <w:rFonts w:ascii="JetBrains Mono" w:cs="JetBrains Mono" w:eastAsia="JetBrains Mono" w:hAnsi="JetBrains Mono"/>
-          <w:b/>
-          <w:bCs/>
-          <w:color w:val="D9763A"/>
-          <w:sz w:val="20"/>
-          <w:szCs w:val="20"/>
-        </w:rPr>
-        <w:t xml:space="preserve">Q-5  </w:t>
-      </w:r>
-      <w:r>
-        <w:rPr>
-          <w:rFonts w:ascii="Inter" w:cs="Inter" w:eastAsia="Inter" w:hAnsi="Inter"/>
-          <w:color w:val="1A1D21"/>
-          <w:sz w:val="21"/>
-          <w:szCs w:val="21"/>
-        </w:rPr>
-        <w:t xml:space="preserve">Compliance targets — which regimes must v1 satisfy (GDPR, CCPA, SOC 2 roadmap)?</w:t>
-      </w:r>
-    </w:p>
-    <w:p>
-      <w:pPr>
-        <w:pStyle w:val="ListParagraph"/>
-        <w:numPr>
-          <w:ilvl w:val="0"/>
-          <w:numId w:val="2"/>
-        </w:numPr>
-        <w:spacing w:after="90" w:line="288"/>
-      </w:pPr>
-      <w:r>
-        <w:rPr>
-          <w:rFonts w:ascii="JetBrains Mono" w:cs="JetBrains Mono" w:eastAsia="JetBrains Mono" w:hAnsi="JetBrains Mono"/>
-          <w:b/>
-          <w:bCs/>
-          <w:color w:val="D9763A"/>
-          <w:sz w:val="20"/>
-          <w:szCs w:val="20"/>
-        </w:rPr>
-        <w:t xml:space="preserve">Q-6  </w:t>
-      </w:r>
-      <w:r>
-        <w:rPr>
-          <w:rFonts w:ascii="Inter" w:cs="Inter" w:eastAsia="Inter" w:hAnsi="Inter"/>
-          <w:color w:val="1A1D21"/>
-          <w:sz w:val="21"/>
-          <w:szCs w:val="21"/>
-        </w:rPr>
-        <w:t xml:space="preserve">MVP volume target — what item volume must the MVP handle comfortably?</w:t>
-      </w:r>
-    </w:p>
-    <w:p>
-      <w:pPr>
-        <w:pStyle w:val="ListParagraph"/>
-        <w:numPr>
-          <w:ilvl w:val="0"/>
-          <w:numId w:val="2"/>
-        </w:numPr>
-        <w:spacing w:after="90" w:line="288"/>
-      </w:pPr>
-      <w:r>
-        <w:rPr>
-          <w:rFonts w:ascii="JetBrains Mono" w:cs="JetBrains Mono" w:eastAsia="JetBrains Mono" w:hAnsi="JetBrains Mono"/>
-          <w:b/>
-          <w:bCs/>
-          <w:color w:val="D9763A"/>
-          <w:sz w:val="20"/>
-          <w:szCs w:val="20"/>
-        </w:rPr>
-        <w:t xml:space="preserve">Q-7  </w:t>
-      </w:r>
-      <w:r>
-        <w:rPr>
-          <w:rFonts w:ascii="Inter" w:cs="Inter" w:eastAsia="Inter" w:hAnsi="Inter"/>
-          <w:color w:val="1A1D21"/>
-          <w:sz w:val="21"/>
-          <w:szCs w:val="21"/>
-        </w:rPr>
-        <w:t xml:space="preserve">Commercial model — per-seat, per-response, per-survey, per-competitor, or tiered?</w:t>
-      </w:r>
-    </w:p>
-    <w:p>
-      <w:pPr>
-        <w:pStyle w:val="ListParagraph"/>
-        <w:numPr>
-          <w:ilvl w:val="0"/>
-          <w:numId w:val="2"/>
-        </w:numPr>
-        <w:spacing w:after="90" w:line="288"/>
-      </w:pPr>
-      <w:r>
-        <w:rPr>
-          <w:rFonts w:ascii="JetBrains Mono" w:cs="JetBrains Mono" w:eastAsia="JetBrains Mono" w:hAnsi="JetBrains Mono"/>
-          <w:b/>
-          <w:bCs/>
-          <w:color w:val="D9763A"/>
-          <w:sz w:val="20"/>
-          <w:szCs w:val="20"/>
-        </w:rPr>
-        <w:t xml:space="preserve">Q-8  </w:t>
-      </w:r>
-      <w:r>
-        <w:rPr>
-          <w:rFonts w:ascii="Inter" w:cs="Inter" w:eastAsia="Inter" w:hAnsi="Inter"/>
-          <w:color w:val="1A1D21"/>
-          <w:sz w:val="21"/>
-          <w:szCs w:val="21"/>
-        </w:rPr>
-        <w:t xml:space="preserve">First design partner — a specific first customer/segment to anchor the MVP?</w:t>
-      </w:r>
-    </w:p>
-    <w:p>
-      <w:pPr>
-        <w:pStyle w:val="ListParagraph"/>
-        <w:numPr>
-          <w:ilvl w:val="0"/>
-          <w:numId w:val="2"/>
-        </w:numPr>
-        <w:spacing w:after="90" w:line="288"/>
-      </w:pPr>
-      <w:r>
-        <w:rPr>
-          <w:rFonts w:ascii="JetBrains Mono" w:cs="JetBrains Mono" w:eastAsia="JetBrains Mono" w:hAnsi="JetBrains Mono"/>
-          <w:b/>
-          <w:bCs/>
-          <w:color w:val="D9763A"/>
-          <w:sz w:val="20"/>
-          <w:szCs w:val="20"/>
-        </w:rPr>
-        <w:t xml:space="preserve">Q-9  </w:t>
-      </w:r>
-      <w:r>
-        <w:rPr>
-          <w:rFonts w:ascii="Inter" w:cs="Inter" w:eastAsia="Inter" w:hAnsi="Inter"/>
-          <w:color w:val="1A1D21"/>
-          <w:sz w:val="21"/>
-          <w:szCs w:val="21"/>
-        </w:rPr>
-        <w:t xml:space="preserve">Brand-love framework — resolved: grounded in Batra/Ahuvia/Bagozzi (2012). Confirm "Ambiguity" as the middle label (vs. "Ambivalence"/"Neutral").</w:t>
-      </w:r>
-    </w:p>
-    <w:p>
-      <w:pPr>
-        <w:pStyle w:val="ListParagraph"/>
-        <w:numPr>
-          <w:ilvl w:val="0"/>
-          <w:numId w:val="2"/>
-        </w:numPr>
-        <w:spacing w:after="90" w:line="288"/>
-      </w:pPr>
-      <w:r>
-        <w:rPr>
-          <w:rFonts w:ascii="JetBrains Mono" w:cs="JetBrains Mono" w:eastAsia="JetBrains Mono" w:hAnsi="JetBrains Mono"/>
-          <w:b/>
-          <w:bCs/>
-          <w:color w:val="D9763A"/>
-          <w:sz w:val="20"/>
-          <w:szCs w:val="20"/>
-        </w:rPr>
-        <w:t xml:space="preserve">Q-10  </w:t>
-      </w:r>
-      <w:r>
-        <w:rPr>
-          <w:rFonts w:ascii="Inter" w:cs="Inter" w:eastAsia="Inter" w:hAnsi="Inter"/>
-          <w:color w:val="1A1D21"/>
-          <w:sz w:val="21"/>
-          <w:szCs w:val="21"/>
-        </w:rPr>
-        <w:t xml:space="preserve">Competitors &amp; sources — which competitors to track first, and which review sources matter most?</w:t>
-      </w:r>
-    </w:p>
-    <w:p>
-      <w:pPr>
-        <w:pStyle w:val="ListParagraph"/>
-        <w:numPr>
-          <w:ilvl w:val="0"/>
-          <w:numId w:val="2"/>
-        </w:numPr>
-        <w:spacing w:after="90" w:line="288"/>
-      </w:pPr>
-      <w:r>
-        <w:rPr>
-          <w:rFonts w:ascii="JetBrains Mono" w:cs="JetBrains Mono" w:eastAsia="JetBrains Mono" w:hAnsi="JetBrains Mono"/>
-          <w:b/>
-          <w:bCs/>
-          <w:color w:val="D9763A"/>
-          <w:sz w:val="20"/>
-          <w:szCs w:val="20"/>
-        </w:rPr>
-        <w:t xml:space="preserve">Q-11  </w:t>
-      </w:r>
-      <w:r>
-        <w:rPr>
-          <w:rFonts w:ascii="Inter" w:cs="Inter" w:eastAsia="Inter" w:hAnsi="Inter"/>
-          <w:color w:val="1A1D21"/>
-          <w:sz w:val="21"/>
-          <w:szCs w:val="21"/>
-        </w:rPr>
-        <w:t xml:space="preserve">Collection method &amp; legal sign-off — confirm the API / licensed-provider / public-web mix, and who provides the legal review that gates live web collection (DPS-7).</w:t>
-      </w:r>
-    </w:p>
-    <w:p>
-      <w:pPr>
-        <w:pStyle w:val="ListParagraph"/>
-        <w:numPr>
-          <w:ilvl w:val="0"/>
-          <w:numId w:val="2"/>
-        </w:numPr>
-        <w:spacing w:after="90" w:line="288"/>
-      </w:pPr>
-      <w:r>
-        <w:rPr>
-          <w:rFonts w:ascii="JetBrains Mono" w:cs="JetBrains Mono" w:eastAsia="JetBrains Mono" w:hAnsi="JetBrains Mono"/>
-          <w:b/>
-          <w:bCs/>
-          <w:color w:val="D9763A"/>
-          <w:sz w:val="20"/>
-          <w:szCs w:val="20"/>
-        </w:rPr>
-        <w:t xml:space="preserve">Q-12  </w:t>
-      </w:r>
-      <w:r>
-        <w:rPr>
-          <w:rFonts w:ascii="Inter" w:cs="Inter" w:eastAsia="Inter" w:hAnsi="Inter"/>
-          <w:color w:val="1A1D21"/>
-          <w:sz w:val="21"/>
-          <w:szCs w:val="21"/>
-        </w:rPr>
-        <w:t xml:space="preserve">Rating normalization — confirm the common scale (proposed 1–5) and the Brand Love Index formula (proposed: %(Love+Like) − %(Dislike+Hate)).</w:t>
-      </w:r>
-    </w:p>
-    <w:p>
-      <w:pPr>
-        <w:pStyle w:val="ListParagraph"/>
-        <w:numPr>
-          <w:ilvl w:val="0"/>
-          <w:numId w:val="2"/>
-        </w:numPr>
-        <w:spacing w:after="90" w:line="288"/>
-      </w:pPr>
-      <w:r>
-        <w:rPr>
-          <w:rFonts w:ascii="JetBrains Mono" w:cs="JetBrains Mono" w:eastAsia="JetBrains Mono" w:hAnsi="JetBrains Mono"/>
-          <w:b/>
-          <w:bCs/>
-          <w:color w:val="D9763A"/>
-          <w:sz w:val="20"/>
-          <w:szCs w:val="20"/>
-        </w:rPr>
-        <w:t xml:space="preserve">Q-13  </w:t>
-      </w:r>
-      <w:r>
-        <w:rPr>
-          <w:rFonts w:ascii="Inter" w:cs="Inter" w:eastAsia="Inter" w:hAnsi="Inter"/>
-          <w:color w:val="1A1D21"/>
-          <w:sz w:val="21"/>
-          <w:szCs w:val="21"/>
-        </w:rPr>
-        <w:t xml:space="preserve">Collected-data retention — how long should collected competitor/web data be retained?</w:t>
-      </w:r>
-    </w:p>
-    <w:p>
-      <w:pPr>
-        <w:pStyle w:val="ListParagraph"/>
-        <w:numPr>
-          <w:ilvl w:val="0"/>
-          <w:numId w:val="2"/>
-        </w:numPr>
-        <w:spacing w:after="90" w:line="288"/>
-      </w:pPr>
-      <w:r>
-        <w:rPr>
-          <w:rFonts w:ascii="JetBrains Mono" w:cs="JetBrains Mono" w:eastAsia="JetBrains Mono" w:hAnsi="JetBrains Mono"/>
-          <w:b/>
-          <w:bCs/>
-          <w:color w:val="D9763A"/>
-          <w:sz w:val="20"/>
-          <w:szCs w:val="20"/>
-        </w:rPr>
-        <w:t xml:space="preserve">Q-14  </w:t>
-      </w:r>
-      <w:r>
-        <w:rPr>
-          <w:rFonts w:ascii="Inter" w:cs="Inter" w:eastAsia="Inter" w:hAnsi="Inter"/>
-          <w:color w:val="1A1D21"/>
-          <w:sz w:val="21"/>
-          <w:szCs w:val="21"/>
-        </w:rPr>
-        <w:t xml:space="preserve">Trust depth for v1 — single-item trust rating plus inference, or the full multi-item driver battery? (Recommendation: single-item + inference in the MVP; driver battery as a fast-follow.)</w:t>
-      </w:r>
-    </w:p>
-    <w:p>
-      <w:pPr>
-        <w:pStyle w:val="ListParagraph"/>
-        <w:numPr>
-          <w:ilvl w:val="0"/>
-          <w:numId w:val="2"/>
-        </w:numPr>
-        <w:spacing w:after="90" w:line="288"/>
-      </w:pPr>
-      <w:r>
-        <w:rPr>
-          <w:rFonts w:ascii="JetBrains Mono" w:cs="JetBrains Mono" w:eastAsia="JetBrains Mono" w:hAnsi="JetBrains Mono"/>
-          <w:b/>
-          <w:bCs/>
-          <w:color w:val="D9763A"/>
-          <w:sz w:val="20"/>
-          <w:szCs w:val="20"/>
-        </w:rPr>
-        <w:t xml:space="preserve">Q-15  </w:t>
-      </w:r>
-      <w:r>
-        <w:rPr>
-          <w:rFonts w:ascii="Inter" w:cs="Inter" w:eastAsia="Inter" w:hAnsi="Inter"/>
-          <w:color w:val="1A1D21"/>
-          <w:sz w:val="21"/>
-          <w:szCs w:val="21"/>
-        </w:rPr>
-        <w:t xml:space="preserve">Trust driver taxonomy — confirm reliability / integrity / benevolence / security-privacy as the drivers, and the Trust Index formula (proposed net: %positive-trust − %negative-trust on the normalized scale).</w:t>
+        <w:t xml:space="preserve">All fifteen prior open questions are now decided (client direction, 2026-07-27). Two items remain pending but non-blocking.</w:t>
+      </w:r>
+    </w:p>
+    <w:tbl>
+      <w:tblPr>
+        <w:tblW w:type="dxa" w:w="9360"/>
+        <w:tblBorders>
+          <w:top w:val="single" w:color="1A1D21" w:sz="12"/>
+          <w:left w:val="none" w:color="auto" w:sz="0"/>
+          <w:bottom w:val="single" w:color="1A1D21" w:sz="12"/>
+          <w:right w:val="none" w:color="auto" w:sz="0"/>
+          <w:insideH w:val="single" w:color="E5E2DA" w:sz="8"/>
+          <w:insideV w:val="none" w:color="auto" w:sz="0"/>
+        </w:tblBorders>
+      </w:tblPr>
+      <w:tblGrid>
+        <w:gridCol w:w="900"/>
+        <w:gridCol w:w="2500"/>
+        <w:gridCol w:w="5960"/>
+      </w:tblGrid>
+      <w:tr>
+        <w:trPr>
+          <w:tblHeader/>
+        </w:trPr>
+        <w:tc>
+          <w:tcPr>
+            <w:tcW w:type="dxa" w:w="900"/>
+            <w:shd w:fill="E5E2DA" w:color="auto" w:val="clear"/>
+            <w:tcMar>
+              <w:top w:type="dxa" w:w="70"/>
+              <w:left w:type="dxa" w:w="130"/>
+              <w:bottom w:type="dxa" w:w="70"/>
+              <w:right w:type="dxa" w:w="130"/>
+            </w:tcMar>
+          </w:tcPr>
+          <w:p>
+            <w:pPr>
+              <w:spacing w:after="0" w:line="250"/>
+            </w:pPr>
+            <w:r>
+              <w:rPr>
+                <w:rFonts w:ascii="Inter" w:cs="Inter" w:eastAsia="Inter" w:hAnsi="Inter"/>
+                <w:b/>
+                <w:bCs/>
+                <w:color w:val="1A1D21"/>
+                <w:sz w:val="18"/>
+                <w:szCs w:val="18"/>
+              </w:rPr>
+              <w:t xml:space="preserve">#</w:t>
+            </w:r>
+          </w:p>
+        </w:tc>
+        <w:tc>
+          <w:tcPr>
+            <w:tcW w:type="dxa" w:w="2500"/>
+            <w:shd w:fill="E5E2DA" w:color="auto" w:val="clear"/>
+            <w:tcMar>
+              <w:top w:type="dxa" w:w="70"/>
+              <w:left w:type="dxa" w:w="130"/>
+              <w:bottom w:type="dxa" w:w="70"/>
+              <w:right w:type="dxa" w:w="130"/>
+            </w:tcMar>
+          </w:tcPr>
+          <w:p>
+            <w:pPr>
+              <w:spacing w:after="0" w:line="250"/>
+            </w:pPr>
+            <w:r>
+              <w:rPr>
+                <w:rFonts w:ascii="Inter" w:cs="Inter" w:eastAsia="Inter" w:hAnsi="Inter"/>
+                <w:b/>
+                <w:bCs/>
+                <w:color w:val="1A1D21"/>
+                <w:sz w:val="18"/>
+                <w:szCs w:val="18"/>
+              </w:rPr>
+              <w:t xml:space="preserve">Decision</w:t>
+            </w:r>
+          </w:p>
+        </w:tc>
+        <w:tc>
+          <w:tcPr>
+            <w:tcW w:type="dxa" w:w="5960"/>
+            <w:shd w:fill="E5E2DA" w:color="auto" w:val="clear"/>
+            <w:tcMar>
+              <w:top w:type="dxa" w:w="70"/>
+              <w:left w:type="dxa" w:w="130"/>
+              <w:bottom w:type="dxa" w:w="70"/>
+              <w:right w:type="dxa" w:w="130"/>
+            </w:tcMar>
+          </w:tcPr>
+          <w:p>
+            <w:pPr>
+              <w:spacing w:after="0" w:line="250"/>
+            </w:pPr>
+            <w:r>
+              <w:rPr>
+                <w:rFonts w:ascii="Inter" w:cs="Inter" w:eastAsia="Inter" w:hAnsi="Inter"/>
+                <w:b/>
+                <w:bCs/>
+                <w:color w:val="1A1D21"/>
+                <w:sz w:val="18"/>
+                <w:szCs w:val="18"/>
+              </w:rPr>
+              <w:t xml:space="preserve">Resolution</w:t>
+            </w:r>
+          </w:p>
+        </w:tc>
+      </w:tr>
+      <w:tr>
+        <w:tc>
+          <w:tcPr>
+            <w:tcW w:type="dxa" w:w="900"/>
+            <w:tcMar>
+              <w:top w:type="dxa" w:w="70"/>
+              <w:left w:type="dxa" w:w="130"/>
+              <w:bottom w:type="dxa" w:w="70"/>
+              <w:right w:type="dxa" w:w="130"/>
+            </w:tcMar>
+          </w:tcPr>
+          <w:p>
+            <w:pPr>
+              <w:spacing w:after="0" w:line="250"/>
+            </w:pPr>
+            <w:r>
+              <w:rPr>
+                <w:rFonts w:ascii="Inter" w:cs="Inter" w:eastAsia="Inter" w:hAnsi="Inter"/>
+                <w:color w:val="1A1D21"/>
+                <w:sz w:val="19"/>
+                <w:szCs w:val="19"/>
+              </w:rPr>
+              <w:t xml:space="preserve">D-1</w:t>
+            </w:r>
+          </w:p>
+        </w:tc>
+        <w:tc>
+          <w:tcPr>
+            <w:tcW w:type="dxa" w:w="2500"/>
+            <w:tcMar>
+              <w:top w:type="dxa" w:w="70"/>
+              <w:left w:type="dxa" w:w="130"/>
+              <w:bottom w:type="dxa" w:w="70"/>
+              <w:right w:type="dxa" w:w="130"/>
+            </w:tcMar>
+          </w:tcPr>
+          <w:p>
+            <w:pPr>
+              <w:spacing w:after="0" w:line="250"/>
+            </w:pPr>
+            <w:r>
+              <w:rPr>
+                <w:rFonts w:ascii="Inter" w:cs="Inter" w:eastAsia="Inter" w:hAnsi="Inter"/>
+                <w:color w:val="1A1D21"/>
+                <w:sz w:val="19"/>
+                <w:szCs w:val="19"/>
+              </w:rPr>
+              <w:t xml:space="preserve">Product name</w:t>
+            </w:r>
+          </w:p>
+        </w:tc>
+        <w:tc>
+          <w:tcPr>
+            <w:tcW w:type="dxa" w:w="5960"/>
+            <w:tcMar>
+              <w:top w:type="dxa" w:w="70"/>
+              <w:left w:type="dxa" w:w="130"/>
+              <w:bottom w:type="dxa" w:w="70"/>
+              <w:right w:type="dxa" w:w="130"/>
+            </w:tcMar>
+          </w:tcPr>
+          <w:p>
+            <w:pPr>
+              <w:spacing w:after="0" w:line="250"/>
+            </w:pPr>
+            <w:r>
+              <w:rPr>
+                <w:rFonts w:ascii="Inter" w:cs="Inter" w:eastAsia="Inter" w:hAnsi="Inter"/>
+                <w:color w:val="1A1D21"/>
+                <w:sz w:val="19"/>
+                <w:szCs w:val="19"/>
+              </w:rPr>
+              <w:t xml:space="preserve">Keep "AAA Insights" as the working title (note overlap with the existing Active Pulse sentiment monitor; revisit branding later).</w:t>
+            </w:r>
+          </w:p>
+        </w:tc>
+      </w:tr>
+      <w:tr>
+        <w:tc>
+          <w:tcPr>
+            <w:tcW w:type="dxa" w:w="900"/>
+            <w:tcMar>
+              <w:top w:type="dxa" w:w="70"/>
+              <w:left w:type="dxa" w:w="130"/>
+              <w:bottom w:type="dxa" w:w="70"/>
+              <w:right w:type="dxa" w:w="130"/>
+            </w:tcMar>
+          </w:tcPr>
+          <w:p>
+            <w:pPr>
+              <w:spacing w:after="0" w:line="250"/>
+            </w:pPr>
+            <w:r>
+              <w:rPr>
+                <w:rFonts w:ascii="Inter" w:cs="Inter" w:eastAsia="Inter" w:hAnsi="Inter"/>
+                <w:color w:val="1A1D21"/>
+                <w:sz w:val="19"/>
+                <w:szCs w:val="19"/>
+              </w:rPr>
+              <w:t xml:space="preserve">D-2</w:t>
+            </w:r>
+          </w:p>
+        </w:tc>
+        <w:tc>
+          <w:tcPr>
+            <w:tcW w:type="dxa" w:w="2500"/>
+            <w:tcMar>
+              <w:top w:type="dxa" w:w="70"/>
+              <w:left w:type="dxa" w:w="130"/>
+              <w:bottom w:type="dxa" w:w="70"/>
+              <w:right w:type="dxa" w:w="130"/>
+            </w:tcMar>
+          </w:tcPr>
+          <w:p>
+            <w:pPr>
+              <w:spacing w:after="0" w:line="250"/>
+            </w:pPr>
+            <w:r>
+              <w:rPr>
+                <w:rFonts w:ascii="Inter" w:cs="Inter" w:eastAsia="Inter" w:hAnsi="Inter"/>
+                <w:color w:val="1A1D21"/>
+                <w:sz w:val="19"/>
+                <w:szCs w:val="19"/>
+              </w:rPr>
+              <w:t xml:space="preserve">Build vs. buy survey engine</w:t>
+            </w:r>
+          </w:p>
+        </w:tc>
+        <w:tc>
+          <w:tcPr>
+            <w:tcW w:type="dxa" w:w="5960"/>
+            <w:tcMar>
+              <w:top w:type="dxa" w:w="70"/>
+              <w:left w:type="dxa" w:w="130"/>
+              <w:bottom w:type="dxa" w:w="70"/>
+              <w:right w:type="dxa" w:w="130"/>
+            </w:tcMar>
+          </w:tcPr>
+          <w:p>
+            <w:pPr>
+              <w:spacing w:after="0" w:line="250"/>
+            </w:pPr>
+            <w:r>
+              <w:rPr>
+                <w:rFonts w:ascii="Inter" w:cs="Inter" w:eastAsia="Inter" w:hAnsi="Inter"/>
+                <w:color w:val="1A1D21"/>
+                <w:sz w:val="19"/>
+                <w:szCs w:val="19"/>
+              </w:rPr>
+              <w:t xml:space="preserve">Build survey collection natively — full control of the survey, conversational, and data experience.</w:t>
+            </w:r>
+          </w:p>
+        </w:tc>
+      </w:tr>
+      <w:tr>
+        <w:tc>
+          <w:tcPr>
+            <w:tcW w:type="dxa" w:w="900"/>
+            <w:tcMar>
+              <w:top w:type="dxa" w:w="70"/>
+              <w:left w:type="dxa" w:w="130"/>
+              <w:bottom w:type="dxa" w:w="70"/>
+              <w:right w:type="dxa" w:w="130"/>
+            </w:tcMar>
+          </w:tcPr>
+          <w:p>
+            <w:pPr>
+              <w:spacing w:after="0" w:line="250"/>
+            </w:pPr>
+            <w:r>
+              <w:rPr>
+                <w:rFonts w:ascii="Inter" w:cs="Inter" w:eastAsia="Inter" w:hAnsi="Inter"/>
+                <w:color w:val="1A1D21"/>
+                <w:sz w:val="19"/>
+                <w:szCs w:val="19"/>
+              </w:rPr>
+              <w:t xml:space="preserve">D-3</w:t>
+            </w:r>
+          </w:p>
+        </w:tc>
+        <w:tc>
+          <w:tcPr>
+            <w:tcW w:type="dxa" w:w="2500"/>
+            <w:tcMar>
+              <w:top w:type="dxa" w:w="70"/>
+              <w:left w:type="dxa" w:w="130"/>
+              <w:bottom w:type="dxa" w:w="70"/>
+              <w:right w:type="dxa" w:w="130"/>
+            </w:tcMar>
+          </w:tcPr>
+          <w:p>
+            <w:pPr>
+              <w:spacing w:after="0" w:line="250"/>
+            </w:pPr>
+            <w:r>
+              <w:rPr>
+                <w:rFonts w:ascii="Inter" w:cs="Inter" w:eastAsia="Inter" w:hAnsi="Inter"/>
+                <w:color w:val="1A1D21"/>
+                <w:sz w:val="19"/>
+                <w:szCs w:val="19"/>
+              </w:rPr>
+              <w:t xml:space="preserve">AI models / hosting</w:t>
+            </w:r>
+          </w:p>
+        </w:tc>
+        <w:tc>
+          <w:tcPr>
+            <w:tcW w:type="dxa" w:w="5960"/>
+            <w:tcMar>
+              <w:top w:type="dxa" w:w="70"/>
+              <w:left w:type="dxa" w:w="130"/>
+              <w:bottom w:type="dxa" w:w="70"/>
+              <w:right w:type="dxa" w:w="130"/>
+            </w:tcMar>
+          </w:tcPr>
+          <w:p>
+            <w:pPr>
+              <w:spacing w:after="0" w:line="250"/>
+            </w:pPr>
+            <w:r>
+              <w:rPr>
+                <w:rFonts w:ascii="Inter" w:cs="Inter" w:eastAsia="Inter" w:hAnsi="Inter"/>
+                <w:color w:val="1A1D21"/>
+                <w:sz w:val="19"/>
+                <w:szCs w:val="19"/>
+              </w:rPr>
+              <w:t xml:space="preserve">Provider-abstracted: best-available models, US data residency available, no lock-in; account data never trains shared models (DPS-9).</w:t>
+            </w:r>
+          </w:p>
+        </w:tc>
+      </w:tr>
+      <w:tr>
+        <w:tc>
+          <w:tcPr>
+            <w:tcW w:type="dxa" w:w="900"/>
+            <w:tcMar>
+              <w:top w:type="dxa" w:w="70"/>
+              <w:left w:type="dxa" w:w="130"/>
+              <w:bottom w:type="dxa" w:w="70"/>
+              <w:right w:type="dxa" w:w="130"/>
+            </w:tcMar>
+          </w:tcPr>
+          <w:p>
+            <w:pPr>
+              <w:spacing w:after="0" w:line="250"/>
+            </w:pPr>
+            <w:r>
+              <w:rPr>
+                <w:rFonts w:ascii="Inter" w:cs="Inter" w:eastAsia="Inter" w:hAnsi="Inter"/>
+                <w:color w:val="1A1D21"/>
+                <w:sz w:val="19"/>
+                <w:szCs w:val="19"/>
+              </w:rPr>
+              <w:t xml:space="preserve">D-4</w:t>
+            </w:r>
+          </w:p>
+        </w:tc>
+        <w:tc>
+          <w:tcPr>
+            <w:tcW w:type="dxa" w:w="2500"/>
+            <w:tcMar>
+              <w:top w:type="dxa" w:w="70"/>
+              <w:left w:type="dxa" w:w="130"/>
+              <w:bottom w:type="dxa" w:w="70"/>
+              <w:right w:type="dxa" w:w="130"/>
+            </w:tcMar>
+          </w:tcPr>
+          <w:p>
+            <w:pPr>
+              <w:spacing w:after="0" w:line="250"/>
+            </w:pPr>
+            <w:r>
+              <w:rPr>
+                <w:rFonts w:ascii="Inter" w:cs="Inter" w:eastAsia="Inter" w:hAnsi="Inter"/>
+                <w:color w:val="1A1D21"/>
+                <w:sz w:val="19"/>
+                <w:szCs w:val="19"/>
+              </w:rPr>
+              <w:t xml:space="preserve">Language coverage</w:t>
+            </w:r>
+          </w:p>
+        </w:tc>
+        <w:tc>
+          <w:tcPr>
+            <w:tcW w:type="dxa" w:w="5960"/>
+            <w:tcMar>
+              <w:top w:type="dxa" w:w="70"/>
+              <w:left w:type="dxa" w:w="130"/>
+              <w:bottom w:type="dxa" w:w="70"/>
+              <w:right w:type="dxa" w:w="130"/>
+            </w:tcMar>
+          </w:tcPr>
+          <w:p>
+            <w:pPr>
+              <w:spacing w:after="0" w:line="250"/>
+            </w:pPr>
+            <w:r>
+              <w:rPr>
+                <w:rFonts w:ascii="Inter" w:cs="Inter" w:eastAsia="Inter" w:hAnsi="Inter"/>
+                <w:color w:val="1A1D21"/>
+                <w:sz w:val="19"/>
+                <w:szCs w:val="19"/>
+              </w:rPr>
+              <w:t xml:space="preserve">English-only MVP; multilingual analysis in Phase 2 (E-4).</w:t>
+            </w:r>
+          </w:p>
+        </w:tc>
+      </w:tr>
+      <w:tr>
+        <w:tc>
+          <w:tcPr>
+            <w:tcW w:type="dxa" w:w="900"/>
+            <w:tcMar>
+              <w:top w:type="dxa" w:w="70"/>
+              <w:left w:type="dxa" w:w="130"/>
+              <w:bottom w:type="dxa" w:w="70"/>
+              <w:right w:type="dxa" w:w="130"/>
+            </w:tcMar>
+          </w:tcPr>
+          <w:p>
+            <w:pPr>
+              <w:spacing w:after="0" w:line="250"/>
+            </w:pPr>
+            <w:r>
+              <w:rPr>
+                <w:rFonts w:ascii="Inter" w:cs="Inter" w:eastAsia="Inter" w:hAnsi="Inter"/>
+                <w:color w:val="1A1D21"/>
+                <w:sz w:val="19"/>
+                <w:szCs w:val="19"/>
+              </w:rPr>
+              <w:t xml:space="preserve">D-5</w:t>
+            </w:r>
+          </w:p>
+        </w:tc>
+        <w:tc>
+          <w:tcPr>
+            <w:tcW w:type="dxa" w:w="2500"/>
+            <w:tcMar>
+              <w:top w:type="dxa" w:w="70"/>
+              <w:left w:type="dxa" w:w="130"/>
+              <w:bottom w:type="dxa" w:w="70"/>
+              <w:right w:type="dxa" w:w="130"/>
+            </w:tcMar>
+          </w:tcPr>
+          <w:p>
+            <w:pPr>
+              <w:spacing w:after="0" w:line="250"/>
+            </w:pPr>
+            <w:r>
+              <w:rPr>
+                <w:rFonts w:ascii="Inter" w:cs="Inter" w:eastAsia="Inter" w:hAnsi="Inter"/>
+                <w:color w:val="1A1D21"/>
+                <w:sz w:val="19"/>
+                <w:szCs w:val="19"/>
+              </w:rPr>
+              <w:t xml:space="preserve">Compliance targets</w:t>
+            </w:r>
+          </w:p>
+        </w:tc>
+        <w:tc>
+          <w:tcPr>
+            <w:tcW w:type="dxa" w:w="5960"/>
+            <w:tcMar>
+              <w:top w:type="dxa" w:w="70"/>
+              <w:left w:type="dxa" w:w="130"/>
+              <w:bottom w:type="dxa" w:w="70"/>
+              <w:right w:type="dxa" w:w="130"/>
+            </w:tcMar>
+          </w:tcPr>
+          <w:p>
+            <w:pPr>
+              <w:spacing w:after="0" w:line="250"/>
+            </w:pPr>
+            <w:r>
+              <w:rPr>
+                <w:rFonts w:ascii="Inter" w:cs="Inter" w:eastAsia="Inter" w:hAnsi="Inter"/>
+                <w:color w:val="1A1D21"/>
+                <w:sz w:val="19"/>
+                <w:szCs w:val="19"/>
+              </w:rPr>
+              <w:t xml:space="preserve">GDPR + CCPA for v1; SOC 2 on the roadmap (DPS-8).</w:t>
+            </w:r>
+          </w:p>
+        </w:tc>
+      </w:tr>
+      <w:tr>
+        <w:tc>
+          <w:tcPr>
+            <w:tcW w:type="dxa" w:w="900"/>
+            <w:tcMar>
+              <w:top w:type="dxa" w:w="70"/>
+              <w:left w:type="dxa" w:w="130"/>
+              <w:bottom w:type="dxa" w:w="70"/>
+              <w:right w:type="dxa" w:w="130"/>
+            </w:tcMar>
+          </w:tcPr>
+          <w:p>
+            <w:pPr>
+              <w:spacing w:after="0" w:line="250"/>
+            </w:pPr>
+            <w:r>
+              <w:rPr>
+                <w:rFonts w:ascii="Inter" w:cs="Inter" w:eastAsia="Inter" w:hAnsi="Inter"/>
+                <w:color w:val="1A1D21"/>
+                <w:sz w:val="19"/>
+                <w:szCs w:val="19"/>
+              </w:rPr>
+              <w:t xml:space="preserve">D-6</w:t>
+            </w:r>
+          </w:p>
+        </w:tc>
+        <w:tc>
+          <w:tcPr>
+            <w:tcW w:type="dxa" w:w="2500"/>
+            <w:tcMar>
+              <w:top w:type="dxa" w:w="70"/>
+              <w:left w:type="dxa" w:w="130"/>
+              <w:bottom w:type="dxa" w:w="70"/>
+              <w:right w:type="dxa" w:w="130"/>
+            </w:tcMar>
+          </w:tcPr>
+          <w:p>
+            <w:pPr>
+              <w:spacing w:after="0" w:line="250"/>
+            </w:pPr>
+            <w:r>
+              <w:rPr>
+                <w:rFonts w:ascii="Inter" w:cs="Inter" w:eastAsia="Inter" w:hAnsi="Inter"/>
+                <w:color w:val="1A1D21"/>
+                <w:sz w:val="19"/>
+                <w:szCs w:val="19"/>
+              </w:rPr>
+              <w:t xml:space="preserve">MVP volume</w:t>
+            </w:r>
+          </w:p>
+        </w:tc>
+        <w:tc>
+          <w:tcPr>
+            <w:tcW w:type="dxa" w:w="5960"/>
+            <w:tcMar>
+              <w:top w:type="dxa" w:w="70"/>
+              <w:left w:type="dxa" w:w="130"/>
+              <w:bottom w:type="dxa" w:w="70"/>
+              <w:right w:type="dxa" w:w="130"/>
+            </w:tcMar>
+          </w:tcPr>
+          <w:p>
+            <w:pPr>
+              <w:spacing w:after="0" w:line="250"/>
+            </w:pPr>
+            <w:r>
+              <w:rPr>
+                <w:rFonts w:ascii="Inter" w:cs="Inter" w:eastAsia="Inter" w:hAnsi="Inter"/>
+                <w:color w:val="1A1D21"/>
+                <w:sz w:val="19"/>
+                <w:szCs w:val="19"/>
+              </w:rPr>
+              <w:t xml:space="preserve">~5,000 responses handled comfortably (NFR-2).</w:t>
+            </w:r>
+          </w:p>
+        </w:tc>
+      </w:tr>
+      <w:tr>
+        <w:tc>
+          <w:tcPr>
+            <w:tcW w:type="dxa" w:w="900"/>
+            <w:tcMar>
+              <w:top w:type="dxa" w:w="70"/>
+              <w:left w:type="dxa" w:w="130"/>
+              <w:bottom w:type="dxa" w:w="70"/>
+              <w:right w:type="dxa" w:w="130"/>
+            </w:tcMar>
+          </w:tcPr>
+          <w:p>
+            <w:pPr>
+              <w:spacing w:after="0" w:line="250"/>
+            </w:pPr>
+            <w:r>
+              <w:rPr>
+                <w:rFonts w:ascii="Inter" w:cs="Inter" w:eastAsia="Inter" w:hAnsi="Inter"/>
+                <w:color w:val="1A1D21"/>
+                <w:sz w:val="19"/>
+                <w:szCs w:val="19"/>
+              </w:rPr>
+              <w:t xml:space="preserve">D-7</w:t>
+            </w:r>
+          </w:p>
+        </w:tc>
+        <w:tc>
+          <w:tcPr>
+            <w:tcW w:type="dxa" w:w="2500"/>
+            <w:tcMar>
+              <w:top w:type="dxa" w:w="70"/>
+              <w:left w:type="dxa" w:w="130"/>
+              <w:bottom w:type="dxa" w:w="70"/>
+              <w:right w:type="dxa" w:w="130"/>
+            </w:tcMar>
+          </w:tcPr>
+          <w:p>
+            <w:pPr>
+              <w:spacing w:after="0" w:line="250"/>
+            </w:pPr>
+            <w:r>
+              <w:rPr>
+                <w:rFonts w:ascii="Inter" w:cs="Inter" w:eastAsia="Inter" w:hAnsi="Inter"/>
+                <w:color w:val="1A1D21"/>
+                <w:sz w:val="19"/>
+                <w:szCs w:val="19"/>
+              </w:rPr>
+              <w:t xml:space="preserve">Commercial model</w:t>
+            </w:r>
+          </w:p>
+        </w:tc>
+        <w:tc>
+          <w:tcPr>
+            <w:tcW w:type="dxa" w:w="5960"/>
+            <w:tcMar>
+              <w:top w:type="dxa" w:w="70"/>
+              <w:left w:type="dxa" w:w="130"/>
+              <w:bottom w:type="dxa" w:w="70"/>
+              <w:right w:type="dxa" w:w="130"/>
+            </w:tcMar>
+          </w:tcPr>
+          <w:p>
+            <w:pPr>
+              <w:spacing w:after="0" w:line="250"/>
+            </w:pPr>
+            <w:r>
+              <w:rPr>
+                <w:rFonts w:ascii="Inter" w:cs="Inter" w:eastAsia="Inter" w:hAnsi="Inter"/>
+                <w:color w:val="1A1D21"/>
+                <w:sz w:val="19"/>
+                <w:szCs w:val="19"/>
+              </w:rPr>
+              <w:t xml:space="preserve">Hybrid: tiered subscription + usage (see note below).</w:t>
+            </w:r>
+          </w:p>
+        </w:tc>
+      </w:tr>
+      <w:tr>
+        <w:tc>
+          <w:tcPr>
+            <w:tcW w:type="dxa" w:w="900"/>
+            <w:tcMar>
+              <w:top w:type="dxa" w:w="70"/>
+              <w:left w:type="dxa" w:w="130"/>
+              <w:bottom w:type="dxa" w:w="70"/>
+              <w:right w:type="dxa" w:w="130"/>
+            </w:tcMar>
+          </w:tcPr>
+          <w:p>
+            <w:pPr>
+              <w:spacing w:after="0" w:line="250"/>
+            </w:pPr>
+            <w:r>
+              <w:rPr>
+                <w:rFonts w:ascii="Inter" w:cs="Inter" w:eastAsia="Inter" w:hAnsi="Inter"/>
+                <w:color w:val="1A1D21"/>
+                <w:sz w:val="19"/>
+                <w:szCs w:val="19"/>
+              </w:rPr>
+              <w:t xml:space="preserve">D-8</w:t>
+            </w:r>
+          </w:p>
+        </w:tc>
+        <w:tc>
+          <w:tcPr>
+            <w:tcW w:type="dxa" w:w="2500"/>
+            <w:tcMar>
+              <w:top w:type="dxa" w:w="70"/>
+              <w:left w:type="dxa" w:w="130"/>
+              <w:bottom w:type="dxa" w:w="70"/>
+              <w:right w:type="dxa" w:w="130"/>
+            </w:tcMar>
+          </w:tcPr>
+          <w:p>
+            <w:pPr>
+              <w:spacing w:after="0" w:line="250"/>
+            </w:pPr>
+            <w:r>
+              <w:rPr>
+                <w:rFonts w:ascii="Inter" w:cs="Inter" w:eastAsia="Inter" w:hAnsi="Inter"/>
+                <w:color w:val="1A1D21"/>
+                <w:sz w:val="19"/>
+                <w:szCs w:val="19"/>
+              </w:rPr>
+              <w:t xml:space="preserve">First design partner</w:t>
+            </w:r>
+          </w:p>
+        </w:tc>
+        <w:tc>
+          <w:tcPr>
+            <w:tcW w:type="dxa" w:w="5960"/>
+            <w:tcMar>
+              <w:top w:type="dxa" w:w="70"/>
+              <w:left w:type="dxa" w:w="130"/>
+              <w:bottom w:type="dxa" w:w="70"/>
+              <w:right w:type="dxa" w:w="130"/>
+            </w:tcMar>
+          </w:tcPr>
+          <w:p>
+            <w:pPr>
+              <w:spacing w:after="0" w:line="250"/>
+            </w:pPr>
+            <w:r>
+              <w:rPr>
+                <w:rFonts w:ascii="Inter" w:cs="Inter" w:eastAsia="Inter" w:hAnsi="Inter"/>
+                <w:color w:val="1A1D21"/>
+                <w:sz w:val="19"/>
+                <w:szCs w:val="19"/>
+              </w:rPr>
+              <w:t xml:space="preserve">None yet — build a generic MVP; find a partner in parallel (pending).</w:t>
+            </w:r>
+          </w:p>
+        </w:tc>
+      </w:tr>
+      <w:tr>
+        <w:tc>
+          <w:tcPr>
+            <w:tcW w:type="dxa" w:w="900"/>
+            <w:tcMar>
+              <w:top w:type="dxa" w:w="70"/>
+              <w:left w:type="dxa" w:w="130"/>
+              <w:bottom w:type="dxa" w:w="70"/>
+              <w:right w:type="dxa" w:w="130"/>
+            </w:tcMar>
+          </w:tcPr>
+          <w:p>
+            <w:pPr>
+              <w:spacing w:after="0" w:line="250"/>
+            </w:pPr>
+            <w:r>
+              <w:rPr>
+                <w:rFonts w:ascii="Inter" w:cs="Inter" w:eastAsia="Inter" w:hAnsi="Inter"/>
+                <w:color w:val="1A1D21"/>
+                <w:sz w:val="19"/>
+                <w:szCs w:val="19"/>
+              </w:rPr>
+              <w:t xml:space="preserve">D-9</w:t>
+            </w:r>
+          </w:p>
+        </w:tc>
+        <w:tc>
+          <w:tcPr>
+            <w:tcW w:type="dxa" w:w="2500"/>
+            <w:tcMar>
+              <w:top w:type="dxa" w:w="70"/>
+              <w:left w:type="dxa" w:w="130"/>
+              <w:bottom w:type="dxa" w:w="70"/>
+              <w:right w:type="dxa" w:w="130"/>
+            </w:tcMar>
+          </w:tcPr>
+          <w:p>
+            <w:pPr>
+              <w:spacing w:after="0" w:line="250"/>
+            </w:pPr>
+            <w:r>
+              <w:rPr>
+                <w:rFonts w:ascii="Inter" w:cs="Inter" w:eastAsia="Inter" w:hAnsi="Inter"/>
+                <w:color w:val="1A1D21"/>
+                <w:sz w:val="19"/>
+                <w:szCs w:val="19"/>
+              </w:rPr>
+              <w:t xml:space="preserve">Brand Love framework &amp; label</w:t>
+            </w:r>
+          </w:p>
+        </w:tc>
+        <w:tc>
+          <w:tcPr>
+            <w:tcW w:type="dxa" w:w="5960"/>
+            <w:tcMar>
+              <w:top w:type="dxa" w:w="70"/>
+              <w:left w:type="dxa" w:w="130"/>
+              <w:bottom w:type="dxa" w:w="70"/>
+              <w:right w:type="dxa" w:w="130"/>
+            </w:tcMar>
+          </w:tcPr>
+          <w:p>
+            <w:pPr>
+              <w:spacing w:after="0" w:line="250"/>
+            </w:pPr>
+            <w:r>
+              <w:rPr>
+                <w:rFonts w:ascii="Inter" w:cs="Inter" w:eastAsia="Inter" w:hAnsi="Inter"/>
+                <w:color w:val="1A1D21"/>
+                <w:sz w:val="19"/>
+                <w:szCs w:val="19"/>
+              </w:rPr>
+              <w:t xml:space="preserve">Grounded in Batra/Ahuvia/Bagozzi (2012). Middle label = "Ambivalence" (changed from "Ambiguity"). Scale: Love / Like / Ambivalence / Dislike / Hate.</w:t>
+            </w:r>
+          </w:p>
+        </w:tc>
+      </w:tr>
+      <w:tr>
+        <w:tc>
+          <w:tcPr>
+            <w:tcW w:type="dxa" w:w="900"/>
+            <w:tcMar>
+              <w:top w:type="dxa" w:w="70"/>
+              <w:left w:type="dxa" w:w="130"/>
+              <w:bottom w:type="dxa" w:w="70"/>
+              <w:right w:type="dxa" w:w="130"/>
+            </w:tcMar>
+          </w:tcPr>
+          <w:p>
+            <w:pPr>
+              <w:spacing w:after="0" w:line="250"/>
+            </w:pPr>
+            <w:r>
+              <w:rPr>
+                <w:rFonts w:ascii="Inter" w:cs="Inter" w:eastAsia="Inter" w:hAnsi="Inter"/>
+                <w:color w:val="1A1D21"/>
+                <w:sz w:val="19"/>
+                <w:szCs w:val="19"/>
+              </w:rPr>
+              <w:t xml:space="preserve">D-10</w:t>
+            </w:r>
+          </w:p>
+        </w:tc>
+        <w:tc>
+          <w:tcPr>
+            <w:tcW w:type="dxa" w:w="2500"/>
+            <w:tcMar>
+              <w:top w:type="dxa" w:w="70"/>
+              <w:left w:type="dxa" w:w="130"/>
+              <w:bottom w:type="dxa" w:w="70"/>
+              <w:right w:type="dxa" w:w="130"/>
+            </w:tcMar>
+          </w:tcPr>
+          <w:p>
+            <w:pPr>
+              <w:spacing w:after="0" w:line="250"/>
+            </w:pPr>
+            <w:r>
+              <w:rPr>
+                <w:rFonts w:ascii="Inter" w:cs="Inter" w:eastAsia="Inter" w:hAnsi="Inter"/>
+                <w:color w:val="1A1D21"/>
+                <w:sz w:val="19"/>
+                <w:szCs w:val="19"/>
+              </w:rPr>
+              <w:t xml:space="preserve">Competitors &amp; sources</w:t>
+            </w:r>
+          </w:p>
+        </w:tc>
+        <w:tc>
+          <w:tcPr>
+            <w:tcW w:type="dxa" w:w="5960"/>
+            <w:tcMar>
+              <w:top w:type="dxa" w:w="70"/>
+              <w:left w:type="dxa" w:w="130"/>
+              <w:bottom w:type="dxa" w:w="70"/>
+              <w:right w:type="dxa" w:w="130"/>
+            </w:tcMar>
+          </w:tcPr>
+          <w:p>
+            <w:pPr>
+              <w:spacing w:after="0" w:line="250"/>
+            </w:pPr>
+            <w:r>
+              <w:rPr>
+                <w:rFonts w:ascii="Inter" w:cs="Inter" w:eastAsia="Inter" w:hAnsi="Inter"/>
+                <w:color w:val="1A1D21"/>
+                <w:sz w:val="19"/>
+                <w:szCs w:val="19"/>
+              </w:rPr>
+              <w:t xml:space="preserve">Generic &amp; configurable — each account sets its own competitors and sources; no presets.</w:t>
+            </w:r>
+          </w:p>
+        </w:tc>
+      </w:tr>
+      <w:tr>
+        <w:tc>
+          <w:tcPr>
+            <w:tcW w:type="dxa" w:w="900"/>
+            <w:tcMar>
+              <w:top w:type="dxa" w:w="70"/>
+              <w:left w:type="dxa" w:w="130"/>
+              <w:bottom w:type="dxa" w:w="70"/>
+              <w:right w:type="dxa" w:w="130"/>
+            </w:tcMar>
+          </w:tcPr>
+          <w:p>
+            <w:pPr>
+              <w:spacing w:after="0" w:line="250"/>
+            </w:pPr>
+            <w:r>
+              <w:rPr>
+                <w:rFonts w:ascii="Inter" w:cs="Inter" w:eastAsia="Inter" w:hAnsi="Inter"/>
+                <w:color w:val="1A1D21"/>
+                <w:sz w:val="19"/>
+                <w:szCs w:val="19"/>
+              </w:rPr>
+              <w:t xml:space="preserve">D-11</w:t>
+            </w:r>
+          </w:p>
+        </w:tc>
+        <w:tc>
+          <w:tcPr>
+            <w:tcW w:type="dxa" w:w="2500"/>
+            <w:tcMar>
+              <w:top w:type="dxa" w:w="70"/>
+              <w:left w:type="dxa" w:w="130"/>
+              <w:bottom w:type="dxa" w:w="70"/>
+              <w:right w:type="dxa" w:w="130"/>
+            </w:tcMar>
+          </w:tcPr>
+          <w:p>
+            <w:pPr>
+              <w:spacing w:after="0" w:line="250"/>
+            </w:pPr>
+            <w:r>
+              <w:rPr>
+                <w:rFonts w:ascii="Inter" w:cs="Inter" w:eastAsia="Inter" w:hAnsi="Inter"/>
+                <w:color w:val="1A1D21"/>
+                <w:sz w:val="19"/>
+                <w:szCs w:val="19"/>
+              </w:rPr>
+              <w:t xml:space="preserve">Collection method &amp; legal sign-off</w:t>
+            </w:r>
+          </w:p>
+        </w:tc>
+        <w:tc>
+          <w:tcPr>
+            <w:tcW w:type="dxa" w:w="5960"/>
+            <w:tcMar>
+              <w:top w:type="dxa" w:w="70"/>
+              <w:left w:type="dxa" w:w="130"/>
+              <w:bottom w:type="dxa" w:w="70"/>
+              <w:right w:type="dxa" w:w="130"/>
+            </w:tcMar>
+          </w:tcPr>
+          <w:p>
+            <w:pPr>
+              <w:spacing w:after="0" w:line="250"/>
+            </w:pPr>
+            <w:r>
+              <w:rPr>
+                <w:rFonts w:ascii="Inter" w:cs="Inter" w:eastAsia="Inter" w:hAnsi="Inter"/>
+                <w:color w:val="1A1D21"/>
+                <w:sz w:val="19"/>
+                <w:szCs w:val="19"/>
+              </w:rPr>
+              <w:t xml:space="preserve">CSV import first (MVP); APIs/licensed feeds in Phase 1; live web collection only after the client’s legal sign-off (DPS-7). Sign-off owner (pending).</w:t>
+            </w:r>
+          </w:p>
+        </w:tc>
+      </w:tr>
+      <w:tr>
+        <w:tc>
+          <w:tcPr>
+            <w:tcW w:type="dxa" w:w="900"/>
+            <w:tcMar>
+              <w:top w:type="dxa" w:w="70"/>
+              <w:left w:type="dxa" w:w="130"/>
+              <w:bottom w:type="dxa" w:w="70"/>
+              <w:right w:type="dxa" w:w="130"/>
+            </w:tcMar>
+          </w:tcPr>
+          <w:p>
+            <w:pPr>
+              <w:spacing w:after="0" w:line="250"/>
+            </w:pPr>
+            <w:r>
+              <w:rPr>
+                <w:rFonts w:ascii="Inter" w:cs="Inter" w:eastAsia="Inter" w:hAnsi="Inter"/>
+                <w:color w:val="1A1D21"/>
+                <w:sz w:val="19"/>
+                <w:szCs w:val="19"/>
+              </w:rPr>
+              <w:t xml:space="preserve">D-12</w:t>
+            </w:r>
+          </w:p>
+        </w:tc>
+        <w:tc>
+          <w:tcPr>
+            <w:tcW w:type="dxa" w:w="2500"/>
+            <w:tcMar>
+              <w:top w:type="dxa" w:w="70"/>
+              <w:left w:type="dxa" w:w="130"/>
+              <w:bottom w:type="dxa" w:w="70"/>
+              <w:right w:type="dxa" w:w="130"/>
+            </w:tcMar>
+          </w:tcPr>
+          <w:p>
+            <w:pPr>
+              <w:spacing w:after="0" w:line="250"/>
+            </w:pPr>
+            <w:r>
+              <w:rPr>
+                <w:rFonts w:ascii="Inter" w:cs="Inter" w:eastAsia="Inter" w:hAnsi="Inter"/>
+                <w:color w:val="1A1D21"/>
+                <w:sz w:val="19"/>
+                <w:szCs w:val="19"/>
+              </w:rPr>
+              <w:t xml:space="preserve">Normalization &amp; Love Index</w:t>
+            </w:r>
+          </w:p>
+        </w:tc>
+        <w:tc>
+          <w:tcPr>
+            <w:tcW w:type="dxa" w:w="5960"/>
+            <w:tcMar>
+              <w:top w:type="dxa" w:w="70"/>
+              <w:left w:type="dxa" w:w="130"/>
+              <w:bottom w:type="dxa" w:w="70"/>
+              <w:right w:type="dxa" w:w="130"/>
+            </w:tcMar>
+          </w:tcPr>
+          <w:p>
+            <w:pPr>
+              <w:spacing w:after="0" w:line="250"/>
+            </w:pPr>
+            <w:r>
+              <w:rPr>
+                <w:rFonts w:ascii="Inter" w:cs="Inter" w:eastAsia="Inter" w:hAnsi="Inter"/>
+                <w:color w:val="1A1D21"/>
+                <w:sz w:val="19"/>
+                <w:szCs w:val="19"/>
+              </w:rPr>
+              <w:t xml:space="preserve">Common 1–5 scale; Brand Love Index = %(Love+Like) − %(Dislike+Hate).</w:t>
+            </w:r>
+          </w:p>
+        </w:tc>
+      </w:tr>
+      <w:tr>
+        <w:tc>
+          <w:tcPr>
+            <w:tcW w:type="dxa" w:w="900"/>
+            <w:tcMar>
+              <w:top w:type="dxa" w:w="70"/>
+              <w:left w:type="dxa" w:w="130"/>
+              <w:bottom w:type="dxa" w:w="70"/>
+              <w:right w:type="dxa" w:w="130"/>
+            </w:tcMar>
+          </w:tcPr>
+          <w:p>
+            <w:pPr>
+              <w:spacing w:after="0" w:line="250"/>
+            </w:pPr>
+            <w:r>
+              <w:rPr>
+                <w:rFonts w:ascii="Inter" w:cs="Inter" w:eastAsia="Inter" w:hAnsi="Inter"/>
+                <w:color w:val="1A1D21"/>
+                <w:sz w:val="19"/>
+                <w:szCs w:val="19"/>
+              </w:rPr>
+              <w:t xml:space="preserve">D-13</w:t>
+            </w:r>
+          </w:p>
+        </w:tc>
+        <w:tc>
+          <w:tcPr>
+            <w:tcW w:type="dxa" w:w="2500"/>
+            <w:tcMar>
+              <w:top w:type="dxa" w:w="70"/>
+              <w:left w:type="dxa" w:w="130"/>
+              <w:bottom w:type="dxa" w:w="70"/>
+              <w:right w:type="dxa" w:w="130"/>
+            </w:tcMar>
+          </w:tcPr>
+          <w:p>
+            <w:pPr>
+              <w:spacing w:after="0" w:line="250"/>
+            </w:pPr>
+            <w:r>
+              <w:rPr>
+                <w:rFonts w:ascii="Inter" w:cs="Inter" w:eastAsia="Inter" w:hAnsi="Inter"/>
+                <w:color w:val="1A1D21"/>
+                <w:sz w:val="19"/>
+                <w:szCs w:val="19"/>
+              </w:rPr>
+              <w:t xml:space="preserve">Collected-data retention</w:t>
+            </w:r>
+          </w:p>
+        </w:tc>
+        <w:tc>
+          <w:tcPr>
+            <w:tcW w:type="dxa" w:w="5960"/>
+            <w:tcMar>
+              <w:top w:type="dxa" w:w="70"/>
+              <w:left w:type="dxa" w:w="130"/>
+              <w:bottom w:type="dxa" w:w="70"/>
+              <w:right w:type="dxa" w:w="130"/>
+            </w:tcMar>
+          </w:tcPr>
+          <w:p>
+            <w:pPr>
+              <w:spacing w:after="0" w:line="250"/>
+            </w:pPr>
+            <w:r>
+              <w:rPr>
+                <w:rFonts w:ascii="Inter" w:cs="Inter" w:eastAsia="Inter" w:hAnsi="Inter"/>
+                <w:color w:val="1A1D21"/>
+                <w:sz w:val="19"/>
+                <w:szCs w:val="19"/>
+              </w:rPr>
+              <w:t xml:space="preserve">Per-account configurable, 24-month default (DPS-5).</w:t>
+            </w:r>
+          </w:p>
+        </w:tc>
+      </w:tr>
+      <w:tr>
+        <w:tc>
+          <w:tcPr>
+            <w:tcW w:type="dxa" w:w="900"/>
+            <w:tcMar>
+              <w:top w:type="dxa" w:w="70"/>
+              <w:left w:type="dxa" w:w="130"/>
+              <w:bottom w:type="dxa" w:w="70"/>
+              <w:right w:type="dxa" w:w="130"/>
+            </w:tcMar>
+          </w:tcPr>
+          <w:p>
+            <w:pPr>
+              <w:spacing w:after="0" w:line="250"/>
+            </w:pPr>
+            <w:r>
+              <w:rPr>
+                <w:rFonts w:ascii="Inter" w:cs="Inter" w:eastAsia="Inter" w:hAnsi="Inter"/>
+                <w:color w:val="1A1D21"/>
+                <w:sz w:val="19"/>
+                <w:szCs w:val="19"/>
+              </w:rPr>
+              <w:t xml:space="preserve">D-14</w:t>
+            </w:r>
+          </w:p>
+        </w:tc>
+        <w:tc>
+          <w:tcPr>
+            <w:tcW w:type="dxa" w:w="2500"/>
+            <w:tcMar>
+              <w:top w:type="dxa" w:w="70"/>
+              <w:left w:type="dxa" w:w="130"/>
+              <w:bottom w:type="dxa" w:w="70"/>
+              <w:right w:type="dxa" w:w="130"/>
+            </w:tcMar>
+          </w:tcPr>
+          <w:p>
+            <w:pPr>
+              <w:spacing w:after="0" w:line="250"/>
+            </w:pPr>
+            <w:r>
+              <w:rPr>
+                <w:rFonts w:ascii="Inter" w:cs="Inter" w:eastAsia="Inter" w:hAnsi="Inter"/>
+                <w:color w:val="1A1D21"/>
+                <w:sz w:val="19"/>
+                <w:szCs w:val="19"/>
+              </w:rPr>
+              <w:t xml:space="preserve">Trust depth for v1</w:t>
+            </w:r>
+          </w:p>
+        </w:tc>
+        <w:tc>
+          <w:tcPr>
+            <w:tcW w:type="dxa" w:w="5960"/>
+            <w:tcMar>
+              <w:top w:type="dxa" w:w="70"/>
+              <w:left w:type="dxa" w:w="130"/>
+              <w:bottom w:type="dxa" w:w="70"/>
+              <w:right w:type="dxa" w:w="130"/>
+            </w:tcMar>
+          </w:tcPr>
+          <w:p>
+            <w:pPr>
+              <w:spacing w:after="0" w:line="250"/>
+            </w:pPr>
+            <w:r>
+              <w:rPr>
+                <w:rFonts w:ascii="Inter" w:cs="Inter" w:eastAsia="Inter" w:hAnsi="Inter"/>
+                <w:color w:val="1A1D21"/>
+                <w:sz w:val="19"/>
+                <w:szCs w:val="19"/>
+              </w:rPr>
+              <w:t xml:space="preserve">Single-item trust + inferred trust in the MVP; driver battery is a fast-follow.</w:t>
+            </w:r>
+          </w:p>
+        </w:tc>
+      </w:tr>
+      <w:tr>
+        <w:tc>
+          <w:tcPr>
+            <w:tcW w:type="dxa" w:w="900"/>
+            <w:tcMar>
+              <w:top w:type="dxa" w:w="70"/>
+              <w:left w:type="dxa" w:w="130"/>
+              <w:bottom w:type="dxa" w:w="70"/>
+              <w:right w:type="dxa" w:w="130"/>
+            </w:tcMar>
+          </w:tcPr>
+          <w:p>
+            <w:pPr>
+              <w:spacing w:after="0" w:line="250"/>
+            </w:pPr>
+            <w:r>
+              <w:rPr>
+                <w:rFonts w:ascii="Inter" w:cs="Inter" w:eastAsia="Inter" w:hAnsi="Inter"/>
+                <w:color w:val="1A1D21"/>
+                <w:sz w:val="19"/>
+                <w:szCs w:val="19"/>
+              </w:rPr>
+              <w:t xml:space="preserve">D-15</w:t>
+            </w:r>
+          </w:p>
+        </w:tc>
+        <w:tc>
+          <w:tcPr>
+            <w:tcW w:type="dxa" w:w="2500"/>
+            <w:tcMar>
+              <w:top w:type="dxa" w:w="70"/>
+              <w:left w:type="dxa" w:w="130"/>
+              <w:bottom w:type="dxa" w:w="70"/>
+              <w:right w:type="dxa" w:w="130"/>
+            </w:tcMar>
+          </w:tcPr>
+          <w:p>
+            <w:pPr>
+              <w:spacing w:after="0" w:line="250"/>
+            </w:pPr>
+            <w:r>
+              <w:rPr>
+                <w:rFonts w:ascii="Inter" w:cs="Inter" w:eastAsia="Inter" w:hAnsi="Inter"/>
+                <w:color w:val="1A1D21"/>
+                <w:sz w:val="19"/>
+                <w:szCs w:val="19"/>
+              </w:rPr>
+              <w:t xml:space="preserve">Trust drivers &amp; Trust Index</w:t>
+            </w:r>
+          </w:p>
+        </w:tc>
+        <w:tc>
+          <w:tcPr>
+            <w:tcW w:type="dxa" w:w="5960"/>
+            <w:tcMar>
+              <w:top w:type="dxa" w:w="70"/>
+              <w:left w:type="dxa" w:w="130"/>
+              <w:bottom w:type="dxa" w:w="70"/>
+              <w:right w:type="dxa" w:w="130"/>
+            </w:tcMar>
+          </w:tcPr>
+          <w:p>
+            <w:pPr>
+              <w:spacing w:after="0" w:line="250"/>
+            </w:pPr>
+            <w:r>
+              <w:rPr>
+                <w:rFonts w:ascii="Inter" w:cs="Inter" w:eastAsia="Inter" w:hAnsi="Inter"/>
+                <w:color w:val="1A1D21"/>
+                <w:sz w:val="19"/>
+                <w:szCs w:val="19"/>
+              </w:rPr>
+              <w:t xml:space="preserve">Drivers: reliability, integrity, benevolence, security/privacy; Trust Index = %positive-trust − %negative-trust.</w:t>
+            </w:r>
+          </w:p>
+        </w:tc>
+      </w:tr>
+      <w:tr>
+        <w:tc>
+          <w:tcPr>
+            <w:tcW w:type="dxa" w:w="900"/>
+            <w:tcMar>
+              <w:top w:type="dxa" w:w="70"/>
+              <w:left w:type="dxa" w:w="130"/>
+              <w:bottom w:type="dxa" w:w="70"/>
+              <w:right w:type="dxa" w:w="130"/>
+            </w:tcMar>
+          </w:tcPr>
+          <w:p>
+            <w:pPr>
+              <w:spacing w:after="0" w:line="250"/>
+            </w:pPr>
+            <w:r>
+              <w:rPr>
+                <w:rFonts w:ascii="Inter" w:cs="Inter" w:eastAsia="Inter" w:hAnsi="Inter"/>
+                <w:color w:val="1A1D21"/>
+                <w:sz w:val="19"/>
+                <w:szCs w:val="19"/>
+              </w:rPr>
+              <w:t xml:space="preserve">D-16</w:t>
+            </w:r>
+          </w:p>
+        </w:tc>
+        <w:tc>
+          <w:tcPr>
+            <w:tcW w:type="dxa" w:w="2500"/>
+            <w:tcMar>
+              <w:top w:type="dxa" w:w="70"/>
+              <w:left w:type="dxa" w:w="130"/>
+              <w:bottom w:type="dxa" w:w="70"/>
+              <w:right w:type="dxa" w:w="130"/>
+            </w:tcMar>
+          </w:tcPr>
+          <w:p>
+            <w:pPr>
+              <w:spacing w:after="0" w:line="250"/>
+            </w:pPr>
+            <w:r>
+              <w:rPr>
+                <w:rFonts w:ascii="Inter" w:cs="Inter" w:eastAsia="Inter" w:hAnsi="Inter"/>
+                <w:color w:val="1A1D21"/>
+                <w:sz w:val="19"/>
+                <w:szCs w:val="19"/>
+              </w:rPr>
+              <w:t xml:space="preserve">Closed-loop / service recovery (v5)</w:t>
+            </w:r>
+          </w:p>
+        </w:tc>
+        <w:tc>
+          <w:tcPr>
+            <w:tcW w:type="dxa" w:w="5960"/>
+            <w:tcMar>
+              <w:top w:type="dxa" w:w="70"/>
+              <w:left w:type="dxa" w:w="130"/>
+              <w:bottom w:type="dxa" w:w="70"/>
+              <w:right w:type="dxa" w:w="130"/>
+            </w:tcMar>
+          </w:tcPr>
+          <w:p>
+            <w:pPr>
+              <w:spacing w:after="0" w:line="250"/>
+            </w:pPr>
+            <w:r>
+              <w:rPr>
+                <w:rFonts w:ascii="Inter" w:cs="Inter" w:eastAsia="Inter" w:hAnsi="Inter"/>
+                <w:color w:val="1A1D21"/>
+                <w:sz w:val="19"/>
+                <w:szCs w:val="19"/>
+              </w:rPr>
+              <w:t xml:space="preserve">Adopt the Closed-Loop pillar as posture #2 (orchestrate + measure), architected for #3 (native workflow) as a later horizon. MVP: detect + prioritize detractors + opt-in follow-up; full loop + recovery measurement in Phase 1.</w:t>
+            </w:r>
+          </w:p>
+        </w:tc>
+      </w:tr>
+    </w:tbl>
+    <w:p>
+      <w:pPr>
+        <w:spacing w:after="90" w:before="200"/>
+      </w:pPr>
+      <w:r>
+        <w:rPr>
+          <w:rFonts w:ascii="Inter" w:cs="Inter" w:eastAsia="Inter" w:hAnsi="Inter"/>
+          <w:b/>
+          <w:bCs/>
+          <w:color w:val="1A1D21"/>
+          <w:sz w:val="22"/>
+          <w:szCs w:val="22"/>
+        </w:rPr>
+        <w:t xml:space="preserve">Commercial model note (D-7)</w:t>
+      </w:r>
+    </w:p>
+    <w:p>
+      <w:pPr>
+        <w:spacing w:after="140" w:line="300"/>
+      </w:pPr>
+      <w:r>
+        <w:rPr>
+          <w:rFonts w:ascii="Inter" w:cs="Inter" w:eastAsia="Inter" w:hAnsi="Inter"/>
+          <w:color w:val="1A1D21"/>
+          <w:sz w:val="21"/>
+          <w:szCs w:val="21"/>
+        </w:rPr>
+        <w:t xml:space="preserve">A hybrid built for SMB/mid-market — tiered subscription plans (e.g. Starter / Growth / Pro) bundling a monthly response/analysis allowance, with usage-based overage and a competitor-tracking add-on. Fuller pricing is a go-to-market decision to firm up alongside the first design partner; the spec only assumes the account/billing hooks in R-21.</w:t>
+      </w:r>
+    </w:p>
+    <w:p>
+      <w:pPr>
+        <w:spacing w:after="90" w:before="200"/>
+      </w:pPr>
+      <w:r>
+        <w:rPr>
+          <w:rFonts w:ascii="Inter" w:cs="Inter" w:eastAsia="Inter" w:hAnsi="Inter"/>
+          <w:b/>
+          <w:bCs/>
+          <w:color w:val="1A1D21"/>
+          <w:sz w:val="22"/>
+          <w:szCs w:val="22"/>
+        </w:rPr>
+        <w:t xml:space="preserve">Still pending (non-blocking)</w:t>
+      </w:r>
+    </w:p>
+    <w:p>
+      <w:pPr>
+        <w:spacing w:after="140" w:line="300"/>
+      </w:pPr>
+      <w:r>
+        <w:rPr>
+          <w:rFonts w:ascii="Inter" w:cs="Inter" w:eastAsia="Inter" w:hAnsi="Inter"/>
+          <w:color w:val="1A1D21"/>
+          <w:sz w:val="21"/>
+          <w:szCs w:val="21"/>
+        </w:rPr>
+        <w:t xml:space="preserve">A named first design partner (D-8) and the named legal sign-off owner for web collection (D-11). Neither blocks approval or the MVP build; both are needed before their respective Phase-1 features go live.</w:t>
       </w:r>
     </w:p>
     <w:p>

</xml_diff>

<commit_message>
"Architecture / Tech Design v1"
</commit_message>
<xml_diff>
--- a/AAA_Insights_PRD.docx
+++ b/AAA_Insights_PRD.docx
@@ -133,7 +133,7 @@
           <w:sz w:val="18"/>
           <w:szCs w:val="18"/>
         </w:rPr>
-        <w:t xml:space="preserve">v6 — Draft (CHALLENGE resolutions folded in — ready for approval)</w:t>
+        <w:t xml:space="preserve">v7 — Draft (Emotion &amp; Experience pillar added — ready for approval)</w:t>
       </w:r>
     </w:p>
     <w:p>
@@ -156,7 +156,7 @@
           <w:sz w:val="18"/>
           <w:szCs w:val="18"/>
         </w:rPr>
-        <w:t xml:space="preserve">2026-07-27</w:t>
+        <w:t xml:space="preserve">2026-07-30</w:t>
       </w:r>
     </w:p>
     <w:p>
@@ -225,7 +225,7 @@
           <w:sz w:val="18"/>
           <w:szCs w:val="18"/>
         </w:rPr>
-        <w:t xml:space="preserve">Grounded AI™ — Phase 2 (CHALLENGE → v6)</w:t>
+        <w:t xml:space="preserve">Grounded AI™ — Phase 1 (SPECIFY increment → v7)</w:t>
       </w:r>
     </w:p>
     <w:p>
@@ -264,7 +264,7 @@
           <w:sz w:val="17"/>
           <w:szCs w:val="17"/>
         </w:rPr>
-        <w:t xml:space="preserve">WHAT CHANGED IN V6</w:t>
+        <w:t xml:space="preserve">WHAT CHANGED IN V7</w:t>
       </w:r>
     </w:p>
     <w:p>
@@ -323,7 +323,7 @@
                 <w:sz w:val="20"/>
                 <w:szCs w:val="20"/>
               </w:rPr>
-              <w:t xml:space="preserve">Revised 2026-07-27 — CHALLENGE resolutions folded in</w:t>
+              <w:t xml:space="preserve">Revised 2026-07-30 — Emotion &amp; Experience pillar added</w:t>
             </w:r>
           </w:p>
           <w:p>
@@ -337,7 +337,7 @@
                 <w:sz w:val="20"/>
                 <w:szCs w:val="20"/>
               </w:rPr>
-              <w:t xml:space="preserve">• Recovery loop is now INTERNAL-only — no customer data pushed to external CRM/helpdesk (D-E). Team is notified; the case is owned and resolved in-app.</w:t>
+              <w:t xml:space="preserve">• New: an Emotion profile (O-17) — the specific emotions customers voice about the brand (pride, relief, delight vs. frustration, disappointment, anger), with intensity, confidence, verbatims, and trend.</w:t>
             </w:r>
           </w:p>
           <w:p>
@@ -351,7 +351,7 @@
                 <w:sz w:val="20"/>
                 <w:szCs w:val="20"/>
               </w:rPr>
-              <w:t xml:space="preserve">• A consented, first-party RecoveryCase is the one allowed identity-linked record (INV-9 exception, D-A/D-B). Case outreach is first-party only (D-C).</w:t>
+              <w:t xml:space="preserve">• New: a Strengths &amp; Gripes board (O-18) — the pluses and minuses customers name, per aspect, ranked by their association with Brand Love / Trust (association, not causation).</w:t>
             </w:r>
           </w:p>
           <w:p>
@@ -365,7 +365,7 @@
                 <w:sz w:val="20"/>
                 <w:szCs w:val="20"/>
               </w:rPr>
-              <w:t xml:space="preserve">• Review prompts are audience-neutral to avoid review-gating (D-D). Erasure now covers scraped third-party review authors (D-F).</w:t>
+              <w:t xml:space="preserve">• Both compare own brand vs. competitors (O-19). Emotions use a compact headline set (~7) that rolls up a finer sub-emotion set on demand (D-17).</w:t>
             </w:r>
           </w:p>
           <w:p>
@@ -379,7 +379,7 @@
                 <w:sz w:val="20"/>
                 <w:szCs w:val="20"/>
               </w:rPr>
-              <w:t xml:space="preserve">• Brand Love / Trust Indices are STATED-only; inferred reads are a labeled companion, and an unreadable comment is "unknown," never "Ambivalence" (D-G, F-12).</w:t>
+              <w:t xml:space="preserve">• Scope: own-brand emotion + strengths/gripes ship in the MVP; the competitive comparison rides Phase-1 competitor collection (D-18).</w:t>
             </w:r>
           </w:p>
           <w:p>
@@ -393,7 +393,7 @@
                 <w:sz w:val="20"/>
                 <w:szCs w:val="20"/>
               </w:rPr>
-              <w:t xml:space="preserve">• New security/privacy/integrity requirements: bot defense, admin auth + secrets, PII redaction, conversational safety, age-gate, case dedup/throttle, timezone/UTC, NFR targets (F-8–F-19).</w:t>
+              <w:t xml:space="preserve">• Guardrails: emotion &amp; aspect reads are AI-inferred COMPANION signals — labeled, confidence-scored, never blended into the stated Love/Trust headline (INV-15/INV-16). New R-46–R-50, E-25–E-27, Emotion + Aspect records.</w:t>
             </w:r>
           </w:p>
         </w:tc>
@@ -1070,6 +1070,153 @@
     </w:p>
     <w:p>
       <w:pPr>
+        <w:spacing w:after="140" w:line="300"/>
+      </w:pPr>
+      <w:r>
+        <w:rPr>
+          <w:rFonts w:ascii="Inter" w:cs="Inter" w:eastAsia="Inter" w:hAnsi="Inter"/>
+          <w:color w:val="1A1D21"/>
+          <w:sz w:val="21"/>
+          <w:szCs w:val="21"/>
+        </w:rPr>
+        <w:t xml:space="preserve">AAA Insights lets a company collect feedback — surveys, reviews, ratings, and open comments — unify it, and analyze it with AI to produce plain-language insight the business can act on. It extends this to a competitive view (the same analysis run against tracked competitors) and to acting on what it finds — resolving dissatisfied customers and reinforcing loyal ones, and measuring whether the action worked.</w:t>
+      </w:r>
+    </w:p>
+    <w:p>
+      <w:pPr>
+        <w:spacing w:after="140" w:line="300"/>
+      </w:pPr>
+      <w:r>
+        <w:rPr>
+          <w:rFonts w:ascii="Inter" w:cs="Inter" w:eastAsia="Inter" w:hAnsi="Inter"/>
+          <w:color w:val="1A1D21"/>
+          <w:sz w:val="21"/>
+          <w:szCs w:val="21"/>
+        </w:rPr>
+        <w:t xml:space="preserve">At the heart of the analysis are two complementary relationship indicators: </w:t>
+      </w:r>
+      <w:r>
+        <w:rPr>
+          <w:rFonts w:ascii="Inter" w:cs="Inter" w:eastAsia="Inter" w:hAnsi="Inter"/>
+          <w:b/>
+          <w:bCs/>
+          <w:color w:val="1A1D21"/>
+          <w:sz w:val="21"/>
+          <w:szCs w:val="21"/>
+        </w:rPr>
+        <w:t xml:space="preserve">Brand Love</w:t>
+      </w:r>
+      <w:r>
+        <w:rPr>
+          <w:rFonts w:ascii="Inter" w:cs="Inter" w:eastAsia="Inter" w:hAnsi="Inter"/>
+          <w:color w:val="1A1D21"/>
+          <w:sz w:val="21"/>
+          <w:szCs w:val="21"/>
+        </w:rPr>
+        <w:t xml:space="preserve"> (the emotional pull) and </w:t>
+      </w:r>
+      <w:r>
+        <w:rPr>
+          <w:rFonts w:ascii="Inter" w:cs="Inter" w:eastAsia="Inter" w:hAnsi="Inter"/>
+          <w:b/>
+          <w:bCs/>
+          <w:color w:val="1A1D21"/>
+          <w:sz w:val="21"/>
+          <w:szCs w:val="21"/>
+        </w:rPr>
+        <w:t xml:space="preserve">Brand Trust</w:t>
+      </w:r>
+      <w:r>
+        <w:rPr>
+          <w:rFonts w:ascii="Inter" w:cs="Inter" w:eastAsia="Inter" w:hAnsi="Inter"/>
+          <w:color w:val="1A1D21"/>
+          <w:sz w:val="21"/>
+          <w:szCs w:val="21"/>
+        </w:rPr>
+        <w:t xml:space="preserve"> (confidence the brand is reliable, honest, and acts in the customer’s interest). Measured together they diagnose what neither does alone — an attached customer who no longer trusts the brand is a very different, more fragile situation.</w:t>
+      </w:r>
+    </w:p>
+    <w:p>
+      <w:pPr>
+        <w:spacing w:after="140" w:line="300"/>
+      </w:pPr>
+      <w:r>
+        <w:rPr>
+          <w:rFonts w:ascii="Inter" w:cs="Inter" w:eastAsia="Inter" w:hAnsi="Inter"/>
+          <w:color w:val="1A1D21"/>
+          <w:sz w:val="21"/>
+          <w:szCs w:val="21"/>
+        </w:rPr>
+        <w:t xml:space="preserve">Underneath those indicators, the product reads two things that help a manager empathize and act: the </w:t>
+      </w:r>
+      <w:r>
+        <w:rPr>
+          <w:rFonts w:ascii="Inter" w:cs="Inter" w:eastAsia="Inter" w:hAnsi="Inter"/>
+          <w:b/>
+          <w:bCs/>
+          <w:color w:val="1A1D21"/>
+          <w:sz w:val="21"/>
+          <w:szCs w:val="21"/>
+        </w:rPr>
+        <w:t xml:space="preserve">emotional texture</w:t>
+      </w:r>
+      <w:r>
+        <w:rPr>
+          <w:rFonts w:ascii="Inter" w:cs="Inter" w:eastAsia="Inter" w:hAnsi="Inter"/>
+          <w:color w:val="1A1D21"/>
+          <w:sz w:val="21"/>
+          <w:szCs w:val="21"/>
+        </w:rPr>
+        <w:t xml:space="preserve"> of the experience — the specific emotions customers voice, and how they compare to rivals — and the concrete </w:t>
+      </w:r>
+      <w:r>
+        <w:rPr>
+          <w:rFonts w:ascii="Inter" w:cs="Inter" w:eastAsia="Inter" w:hAnsi="Inter"/>
+          <w:b/>
+          <w:bCs/>
+          <w:color w:val="1A1D21"/>
+          <w:sz w:val="21"/>
+          <w:szCs w:val="21"/>
+        </w:rPr>
+        <w:t xml:space="preserve">strengths and gripes</w:t>
+      </w:r>
+      <w:r>
+        <w:rPr>
+          <w:rFonts w:ascii="Inter" w:cs="Inter" w:eastAsia="Inter" w:hAnsi="Inter"/>
+          <w:color w:val="1A1D21"/>
+          <w:sz w:val="21"/>
+          <w:szCs w:val="21"/>
+        </w:rPr>
+        <w:t xml:space="preserve"> (the pluses and minuses) customers name. These are inferred from open text and stand beside the stated indicators as labeled, evidence-backed reads, never blended into a headline number.</w:t>
+      </w:r>
+    </w:p>
+    <w:p>
+      <w:pPr>
+        <w:spacing w:after="140" w:line="300"/>
+      </w:pPr>
+      <w:r>
+        <w:rPr>
+          <w:rFonts w:ascii="Inter" w:cs="Inter" w:eastAsia="Inter" w:hAnsi="Inter"/>
+          <w:b/>
+          <w:bCs/>
+          <w:color w:val="1A1D21"/>
+          <w:sz w:val="21"/>
+          <w:szCs w:val="21"/>
+        </w:rPr>
+        <w:t xml:space="preserve">Not "another survey tool." </w:t>
+      </w:r>
+      <w:r>
+        <w:rPr>
+          <w:rFonts w:ascii="Inter" w:cs="Inter" w:eastAsia="Inter" w:hAnsi="Inter"/>
+          <w:color w:val="1A1D21"/>
+          <w:sz w:val="21"/>
+          <w:szCs w:val="21"/>
+        </w:rPr>
+        <w:t xml:space="preserve">Survey creation is the on-ramp; the value is what happens after — themes and sentiment, conversational probing, brand-love and trust measurement, a unified hub, competitive benchmarking, insight with recommended actions, and a closed loop that helps the company act and measures the recovery.</w:t>
+      </w:r>
+    </w:p>
+    <w:p>
+      <w:pPr>
         <w:spacing w:after="80" w:before="360"/>
       </w:pPr>
       <w:r>
@@ -1132,6 +1279,31 @@
           <w:szCs w:val="26"/>
         </w:rPr>
         <w:t xml:space="preserve">Two audiences, one product: credible analysis for the business, effortless response for the customer.</w:t>
+      </w:r>
+    </w:p>
+    <w:p>
+      <w:pPr>
+        <w:spacing w:after="140" w:line="300"/>
+      </w:pPr>
+      <w:r>
+        <w:rPr>
+          <w:rFonts w:ascii="Inter" w:cs="Inter" w:eastAsia="Inter" w:hAnsi="Inter"/>
+          <w:b/>
+          <w:bCs/>
+          <w:color w:val="1A1D21"/>
+          <w:sz w:val="21"/>
+          <w:szCs w:val="21"/>
+        </w:rPr>
+        <w:t xml:space="preserve">Primary market: </w:t>
+      </w:r>
+      <w:r>
+        <w:rPr>
+          <w:rFonts w:ascii="Inter" w:cs="Inter" w:eastAsia="Inter" w:hAnsi="Inter"/>
+          <w:color w:val="1A1D21"/>
+          <w:sz w:val="21"/>
+          <w:szCs w:val="21"/>
+        </w:rPr>
+        <w:t xml:space="preserve">SMB / mid-market companies (~10–500 employees) that want to understand customers but have no in-house research team.</w:t>
       </w:r>
     </w:p>
     <w:tbl>
@@ -1535,7 +1707,7 @@
           <w:sz w:val="26"/>
           <w:szCs w:val="26"/>
         </w:rPr>
-        <w:t xml:space="preserve">Eight commitments that shape every design decision.</w:t>
+        <w:t xml:space="preserve">Nine commitments that shape every design decision.</w:t>
       </w:r>
     </w:p>
     <w:p>
@@ -2754,6 +2926,96 @@
     </w:p>
     <w:p>
       <w:pPr>
+        <w:pStyle w:val="ListParagraph"/>
+        <w:numPr>
+          <w:ilvl w:val="0"/>
+          <w:numId w:val="2"/>
+        </w:numPr>
+        <w:spacing w:after="90" w:line="288"/>
+      </w:pPr>
+      <w:r>
+        <w:rPr>
+          <w:rFonts w:ascii="JetBrains Mono" w:cs="JetBrains Mono" w:eastAsia="JetBrains Mono" w:hAnsi="JetBrains Mono"/>
+          <w:b/>
+          <w:bCs/>
+          <w:color w:val="D9763A"/>
+          <w:sz w:val="20"/>
+          <w:szCs w:val="20"/>
+        </w:rPr>
+        <w:t xml:space="preserve">O-17  </w:t>
+      </w:r>
+      <w:r>
+        <w:rPr>
+          <w:rFonts w:ascii="Inter" w:cs="Inter" w:eastAsia="Inter" w:hAnsi="Inter"/>
+          <w:color w:val="1A1D21"/>
+          <w:sz w:val="21"/>
+          <w:szCs w:val="21"/>
+        </w:rPr>
+        <w:t xml:space="preserve">(v7) Emotion profile — for a brand and filtered set, the distribution of emotions expressed in open text and transcripts, using a compact headline taxonomy (~7 emotions: pride, delight, relief/reassurance, hope vs. frustration, disappointment, anger/anxiety), each with intensity, confidence, and representative verbatims, plus trend. Each headline emotion rolls up a finer sub-emotion set to drill into (D-17). "No emotion detected" is its own bucket, never a forced neutral (INV-15). A labeled companion signal — never blended into the stated Love/Trust Indices (INV-4, INV-14, INV-16).</w:t>
+      </w:r>
+    </w:p>
+    <w:p>
+      <w:pPr>
+        <w:pStyle w:val="ListParagraph"/>
+        <w:numPr>
+          <w:ilvl w:val="0"/>
+          <w:numId w:val="2"/>
+        </w:numPr>
+        <w:spacing w:after="90" w:line="288"/>
+      </w:pPr>
+      <w:r>
+        <w:rPr>
+          <w:rFonts w:ascii="JetBrains Mono" w:cs="JetBrains Mono" w:eastAsia="JetBrains Mono" w:hAnsi="JetBrains Mono"/>
+          <w:b/>
+          <w:bCs/>
+          <w:color w:val="D9763A"/>
+          <w:sz w:val="20"/>
+          <w:szCs w:val="20"/>
+        </w:rPr>
+        <w:t xml:space="preserve">O-18  </w:t>
+      </w:r>
+      <w:r>
+        <w:rPr>
+          <w:rFonts w:ascii="Inter" w:cs="Inter" w:eastAsia="Inter" w:hAnsi="Inter"/>
+          <w:color w:val="1A1D21"/>
+          <w:sz w:val="21"/>
+          <w:szCs w:val="21"/>
+        </w:rPr>
+        <w:t xml:space="preserve">(v7) Strengths &amp; Gripes — the pluses and minuses customers name, extracted per aspect (product quality, price/value, support responsiveness, delivery, ease of use): each with polarity (+/−), volume, representative quotes, and a ranking by association with Brand Love / Trust movement (labeled association, not causation). Aspects are account-configurable; low-confidence aspects excluded from headline figures. Traceable to source responses (INV-3).</w:t>
+      </w:r>
+    </w:p>
+    <w:p>
+      <w:pPr>
+        <w:pStyle w:val="ListParagraph"/>
+        <w:numPr>
+          <w:ilvl w:val="0"/>
+          <w:numId w:val="2"/>
+        </w:numPr>
+        <w:spacing w:after="90" w:line="288"/>
+      </w:pPr>
+      <w:r>
+        <w:rPr>
+          <w:rFonts w:ascii="JetBrains Mono" w:cs="JetBrains Mono" w:eastAsia="JetBrains Mono" w:hAnsi="JetBrains Mono"/>
+          <w:b/>
+          <w:bCs/>
+          <w:color w:val="D9763A"/>
+          <w:sz w:val="20"/>
+          <w:szCs w:val="20"/>
+        </w:rPr>
+        <w:t xml:space="preserve">O-19  </w:t>
+      </w:r>
+      <w:r>
+        <w:rPr>
+          <w:rFonts w:ascii="Inter" w:cs="Inter" w:eastAsia="Inter" w:hAnsi="Inter"/>
+          <w:color w:val="1A1D21"/>
+          <w:sz w:val="21"/>
+          <w:szCs w:val="21"/>
+        </w:rPr>
+        <w:t xml:space="preserve">(v7; Phase 1) Emotion &amp; Strengths/Gripes — competitive comparison — own brand vs. tracked competitors on the emotion profile and on strengths/gripes, side by side over a period (e.g. "your customers voice pride and relief; Competitor X’s voice frustration around billing"). Built only on lawfully-collected public reviews (DPS-7), aggregate only (INV-9, INV-11).</w:t>
+      </w:r>
+    </w:p>
+    <w:p>
+      <w:pPr>
         <w:spacing w:after="80" w:before="360"/>
       </w:pPr>
       <w:r>
@@ -3495,6 +3757,172 @@
           <w:sz w:val="22"/>
           <w:szCs w:val="22"/>
         </w:rPr>
+        <w:t xml:space="preserve">Emotion &amp; experience analysis  (v7)</w:t>
+      </w:r>
+    </w:p>
+    <w:p>
+      <w:pPr>
+        <w:pStyle w:val="ListParagraph"/>
+        <w:numPr>
+          <w:ilvl w:val="0"/>
+          <w:numId w:val="2"/>
+        </w:numPr>
+        <w:spacing w:after="90" w:line="288"/>
+      </w:pPr>
+      <w:r>
+        <w:rPr>
+          <w:rFonts w:ascii="JetBrains Mono" w:cs="JetBrains Mono" w:eastAsia="JetBrains Mono" w:hAnsi="JetBrains Mono"/>
+          <w:b/>
+          <w:bCs/>
+          <w:color w:val="D9763A"/>
+          <w:sz w:val="20"/>
+          <w:szCs w:val="20"/>
+        </w:rPr>
+        <w:t xml:space="preserve">R-46  </w:t>
+      </w:r>
+      <w:r>
+        <w:rPr>
+          <w:rFonts w:ascii="Inter" w:cs="Inter" w:eastAsia="Inter" w:hAnsi="Inter"/>
+          <w:color w:val="1A1D21"/>
+          <w:sz w:val="21"/>
+          <w:szCs w:val="21"/>
+        </w:rPr>
+        <w:t xml:space="preserve">Detect the emotions expressed in open text and conversational transcripts and classify each to a compact headline taxonomy (~7 emotions) that rolls up a finer sub-emotion set. Each read is labeled inferred, carries intensity and confidence, and produces the per-brand emotion profile (O-17) with verbatims and trend. A comment with no readable affect is "no emotion detected," never a forced neutral (INV-15).</w:t>
+      </w:r>
+    </w:p>
+    <w:p>
+      <w:pPr>
+        <w:pStyle w:val="ListParagraph"/>
+        <w:numPr>
+          <w:ilvl w:val="0"/>
+          <w:numId w:val="2"/>
+        </w:numPr>
+        <w:spacing w:after="90" w:line="288"/>
+      </w:pPr>
+      <w:r>
+        <w:rPr>
+          <w:rFonts w:ascii="JetBrains Mono" w:cs="JetBrains Mono" w:eastAsia="JetBrains Mono" w:hAnsi="JetBrains Mono"/>
+          <w:b/>
+          <w:bCs/>
+          <w:color w:val="D9763A"/>
+          <w:sz w:val="20"/>
+          <w:szCs w:val="20"/>
+        </w:rPr>
+        <w:t xml:space="preserve">R-47  </w:t>
+      </w:r>
+      <w:r>
+        <w:rPr>
+          <w:rFonts w:ascii="Inter" w:cs="Inter" w:eastAsia="Inter" w:hAnsi="Inter"/>
+          <w:color w:val="1A1D21"/>
+          <w:sz w:val="21"/>
+          <w:szCs w:val="21"/>
+        </w:rPr>
+        <w:t xml:space="preserve">Drill down from any headline emotion to its granular sub-emotions and the underlying verbatims (INV-3), so the compact view stays readable while analysts can go deeper (D-17).</w:t>
+      </w:r>
+    </w:p>
+    <w:p>
+      <w:pPr>
+        <w:pStyle w:val="ListParagraph"/>
+        <w:numPr>
+          <w:ilvl w:val="0"/>
+          <w:numId w:val="2"/>
+        </w:numPr>
+        <w:spacing w:after="90" w:line="288"/>
+      </w:pPr>
+      <w:r>
+        <w:rPr>
+          <w:rFonts w:ascii="JetBrains Mono" w:cs="JetBrains Mono" w:eastAsia="JetBrains Mono" w:hAnsi="JetBrains Mono"/>
+          <w:b/>
+          <w:bCs/>
+          <w:color w:val="D9763A"/>
+          <w:sz w:val="20"/>
+          <w:szCs w:val="20"/>
+        </w:rPr>
+        <w:t xml:space="preserve">R-48  </w:t>
+      </w:r>
+      <w:r>
+        <w:rPr>
+          <w:rFonts w:ascii="Inter" w:cs="Inter" w:eastAsia="Inter" w:hAnsi="Inter"/>
+          <w:color w:val="1A1D21"/>
+          <w:sz w:val="21"/>
+          <w:szCs w:val="21"/>
+        </w:rPr>
+        <w:t xml:space="preserve">Extract aspect-based strengths and gripes from comments — the attributes customers praise or criticize, each with polarity, volume, and representative quotes — and rank them by volume and by association with Brand Love / Trust movement (association, not causation). Aspects are account-configurable; produce O-18. Guarded against fabricated aspects (only aspects grounded in verbatims; low-confidence excluded — E-26).</w:t>
+      </w:r>
+    </w:p>
+    <w:p>
+      <w:pPr>
+        <w:pStyle w:val="ListParagraph"/>
+        <w:numPr>
+          <w:ilvl w:val="0"/>
+          <w:numId w:val="2"/>
+        </w:numPr>
+        <w:spacing w:after="90" w:line="288"/>
+      </w:pPr>
+      <w:r>
+        <w:rPr>
+          <w:rFonts w:ascii="JetBrains Mono" w:cs="JetBrains Mono" w:eastAsia="JetBrains Mono" w:hAnsi="JetBrains Mono"/>
+          <w:b/>
+          <w:bCs/>
+          <w:color w:val="D9763A"/>
+          <w:sz w:val="20"/>
+          <w:szCs w:val="20"/>
+        </w:rPr>
+        <w:t xml:space="preserve">R-49  </w:t>
+      </w:r>
+      <w:r>
+        <w:rPr>
+          <w:rFonts w:ascii="Inter" w:cs="Inter" w:eastAsia="Inter" w:hAnsi="Inter"/>
+          <w:color w:val="1A1D21"/>
+          <w:sz w:val="21"/>
+          <w:szCs w:val="21"/>
+        </w:rPr>
+        <w:t xml:space="preserve">(Phase 1) Compare emotion profiles and strengths/gripes across own brand and tracked competitors (O-19), computed on lawfully-collected public reviews (DPS-7) at aggregate level only (INV-9, INV-11).</w:t>
+      </w:r>
+    </w:p>
+    <w:p>
+      <w:pPr>
+        <w:pStyle w:val="ListParagraph"/>
+        <w:numPr>
+          <w:ilvl w:val="0"/>
+          <w:numId w:val="2"/>
+        </w:numPr>
+        <w:spacing w:after="90" w:line="288"/>
+      </w:pPr>
+      <w:r>
+        <w:rPr>
+          <w:rFonts w:ascii="JetBrains Mono" w:cs="JetBrains Mono" w:eastAsia="JetBrains Mono" w:hAnsi="JetBrains Mono"/>
+          <w:b/>
+          <w:bCs/>
+          <w:color w:val="D9763A"/>
+          <w:sz w:val="20"/>
+          <w:szCs w:val="20"/>
+        </w:rPr>
+        <w:t xml:space="preserve">R-50  </w:t>
+      </w:r>
+      <w:r>
+        <w:rPr>
+          <w:rFonts w:ascii="Inter" w:cs="Inter" w:eastAsia="Inter" w:hAnsi="Inter"/>
+          <w:color w:val="1A1D21"/>
+          <w:sz w:val="21"/>
+          <w:szCs w:val="21"/>
+        </w:rPr>
+        <w:t xml:space="preserve">Be transparent about the method — publish the emotion taxonomy and its headline→sub-emotion roll-up mapping, and carry model_version/confidence on every emotion and aspect read (leave-no-black-box; NFR-6). Emotion and aspect reads are companion signals, never blended into a stated headline (INV-16).</w:t>
+      </w:r>
+    </w:p>
+    <w:p>
+      <w:pPr>
+        <w:spacing w:after="90" w:before="200"/>
+      </w:pPr>
+      <w:r>
+        <w:rPr>
+          <w:rFonts w:ascii="Inter" w:cs="Inter" w:eastAsia="Inter" w:hAnsi="Inter"/>
+          <w:b/>
+          <w:bCs/>
+          <w:color w:val="1A1D21"/>
+          <w:sz w:val="22"/>
+          <w:szCs w:val="22"/>
+        </w:rPr>
         <w:t xml:space="preserve">Unified customer &amp; competitive insight</w:t>
       </w:r>
     </w:p>
@@ -4784,6 +5212,66 @@
     </w:p>
     <w:p>
       <w:pPr>
+        <w:pStyle w:val="ListParagraph"/>
+        <w:numPr>
+          <w:ilvl w:val="0"/>
+          <w:numId w:val="2"/>
+        </w:numPr>
+        <w:spacing w:after="90" w:line="288"/>
+      </w:pPr>
+      <w:r>
+        <w:rPr>
+          <w:rFonts w:ascii="JetBrains Mono" w:cs="JetBrains Mono" w:eastAsia="JetBrains Mono" w:hAnsi="JetBrains Mono"/>
+          <w:b/>
+          <w:bCs/>
+          <w:color w:val="D9763A"/>
+          <w:sz w:val="20"/>
+          <w:szCs w:val="20"/>
+        </w:rPr>
+        <w:t xml:space="preserve">INV-15  </w:t>
+      </w:r>
+      <w:r>
+        <w:rPr>
+          <w:rFonts w:ascii="Inter" w:cs="Inter" w:eastAsia="Inter" w:hAnsi="Inter"/>
+          <w:color w:val="1A1D21"/>
+          <w:sz w:val="21"/>
+          <w:szCs w:val="21"/>
+        </w:rPr>
+        <w:t xml:space="preserve">(v7) Emotion and aspect (strengths/gripes) reads are AI-inferred COMPANION signals — always labeled inferred, always carrying confidence, and never blended into the stated Brand Love / Trust headline Indices. A comment with no readable affect is "no emotion detected," a distinct bucket, never a neutral emotion.</w:t>
+      </w:r>
+    </w:p>
+    <w:p>
+      <w:pPr>
+        <w:pStyle w:val="ListParagraph"/>
+        <w:numPr>
+          <w:ilvl w:val="0"/>
+          <w:numId w:val="2"/>
+        </w:numPr>
+        <w:spacing w:after="90" w:line="288"/>
+      </w:pPr>
+      <w:r>
+        <w:rPr>
+          <w:rFonts w:ascii="JetBrains Mono" w:cs="JetBrains Mono" w:eastAsia="JetBrains Mono" w:hAnsi="JetBrains Mono"/>
+          <w:b/>
+          <w:bCs/>
+          <w:color w:val="D9763A"/>
+          <w:sz w:val="20"/>
+          <w:szCs w:val="20"/>
+        </w:rPr>
+        <w:t xml:space="preserve">INV-16  </w:t>
+      </w:r>
+      <w:r>
+        <w:rPr>
+          <w:rFonts w:ascii="Inter" w:cs="Inter" w:eastAsia="Inter" w:hAnsi="Inter"/>
+          <w:color w:val="1A1D21"/>
+          <w:sz w:val="21"/>
+          <w:szCs w:val="21"/>
+        </w:rPr>
+        <w:t xml:space="preserve">(v7) Emotion is a DISTINCT lens from Brand Love, Brand Trust, and sentiment — reported alongside them, never collapsed into any one. Any "emotion/aspect → Love/Trust" relationship is presented as association, not causation.</w:t>
+      </w:r>
+    </w:p>
+    <w:p>
+      <w:pPr>
         <w:spacing w:after="80" w:before="360"/>
       </w:pPr>
       <w:r>
@@ -5566,6 +6054,96 @@
           <w:szCs w:val="21"/>
         </w:rPr>
         <w:t xml:space="preserve">(v6) No stated reads in scope — if a filtered set has no stated Love/Trust, the headline Index shows "no stated data" and only the labeled inferred signal is shown.</w:t>
+      </w:r>
+    </w:p>
+    <w:p>
+      <w:pPr>
+        <w:pStyle w:val="ListParagraph"/>
+        <w:numPr>
+          <w:ilvl w:val="0"/>
+          <w:numId w:val="2"/>
+        </w:numPr>
+        <w:spacing w:after="90" w:line="288"/>
+      </w:pPr>
+      <w:r>
+        <w:rPr>
+          <w:rFonts w:ascii="JetBrains Mono" w:cs="JetBrains Mono" w:eastAsia="JetBrains Mono" w:hAnsi="JetBrains Mono"/>
+          <w:b/>
+          <w:bCs/>
+          <w:color w:val="D9763A"/>
+          <w:sz w:val="20"/>
+          <w:szCs w:val="20"/>
+        </w:rPr>
+        <w:t xml:space="preserve">E-25  </w:t>
+      </w:r>
+      <w:r>
+        <w:rPr>
+          <w:rFonts w:ascii="Inter" w:cs="Inter" w:eastAsia="Inter" w:hAnsi="Inter"/>
+          <w:color w:val="1A1D21"/>
+          <w:sz w:val="21"/>
+          <w:szCs w:val="21"/>
+        </w:rPr>
+        <w:t xml:space="preserve">(v7) Mixed / conflicting emotions in one comment — represented as multiple emotions with intensities, not forced to one label; contributes to each, counted once per dimension (INV-2).</w:t>
+      </w:r>
+    </w:p>
+    <w:p>
+      <w:pPr>
+        <w:pStyle w:val="ListParagraph"/>
+        <w:numPr>
+          <w:ilvl w:val="0"/>
+          <w:numId w:val="2"/>
+        </w:numPr>
+        <w:spacing w:after="90" w:line="288"/>
+      </w:pPr>
+      <w:r>
+        <w:rPr>
+          <w:rFonts w:ascii="JetBrains Mono" w:cs="JetBrains Mono" w:eastAsia="JetBrains Mono" w:hAnsi="JetBrains Mono"/>
+          <w:b/>
+          <w:bCs/>
+          <w:color w:val="D9763A"/>
+          <w:sz w:val="20"/>
+          <w:szCs w:val="20"/>
+        </w:rPr>
+        <w:t xml:space="preserve">E-26  </w:t>
+      </w:r>
+      <w:r>
+        <w:rPr>
+          <w:rFonts w:ascii="Inter" w:cs="Inter" w:eastAsia="Inter" w:hAnsi="Inter"/>
+          <w:color w:val="1A1D21"/>
+          <w:sz w:val="21"/>
+          <w:szCs w:val="21"/>
+        </w:rPr>
+        <w:t xml:space="preserve">(v7) Sarcasm / ambiguous affect — low-confidence emotion or aspect reads are flagged and excluded from headline figures until a confidence floor is met; the verbatim stays available.</w:t>
+      </w:r>
+    </w:p>
+    <w:p>
+      <w:pPr>
+        <w:pStyle w:val="ListParagraph"/>
+        <w:numPr>
+          <w:ilvl w:val="0"/>
+          <w:numId w:val="2"/>
+        </w:numPr>
+        <w:spacing w:after="90" w:line="288"/>
+      </w:pPr>
+      <w:r>
+        <w:rPr>
+          <w:rFonts w:ascii="JetBrains Mono" w:cs="JetBrains Mono" w:eastAsia="JetBrains Mono" w:hAnsi="JetBrains Mono"/>
+          <w:b/>
+          <w:bCs/>
+          <w:color w:val="D9763A"/>
+          <w:sz w:val="20"/>
+          <w:szCs w:val="20"/>
+        </w:rPr>
+        <w:t xml:space="preserve">E-27  </w:t>
+      </w:r>
+      <w:r>
+        <w:rPr>
+          <w:rFonts w:ascii="Inter" w:cs="Inter" w:eastAsia="Inter" w:hAnsi="Inter"/>
+          <w:color w:val="1A1D21"/>
+          <w:sz w:val="21"/>
+          <w:szCs w:val="21"/>
+        </w:rPr>
+        <w:t xml:space="preserve">(v7) No emotion / no aspect detectable — the system shows "no signal" rather than fabricating an emotion or a strength/gripe (parallels E-1, E-24).</w:t>
       </w:r>
     </w:p>
     <w:p>
@@ -6742,6 +7320,40 @@
           <w:szCs w:val="26"/>
         </w:rPr>
         <w:t xml:space="preserve">The records the system keeps and how they relate. Physical schema is an Architecture-phase decision.</w:t>
+      </w:r>
+    </w:p>
+    <w:p>
+      <w:pPr>
+        <w:spacing w:after="140" w:line="300"/>
+      </w:pPr>
+      <w:r>
+        <w:rPr>
+          <w:rFonts w:ascii="Inter" w:cs="Inter" w:eastAsia="Inter" w:hAnsi="Inter"/>
+          <w:color w:val="1A1D21"/>
+          <w:sz w:val="21"/>
+          <w:szCs w:val="21"/>
+        </w:rPr>
+        <w:t xml:space="preserve">Every record is scoped to an </w:t>
+      </w:r>
+      <w:r>
+        <w:rPr>
+          <w:rFonts w:ascii="Inter" w:cs="Inter" w:eastAsia="Inter" w:hAnsi="Inter"/>
+          <w:b/>
+          <w:bCs/>
+          <w:color w:val="1A1D21"/>
+          <w:sz w:val="21"/>
+          <w:szCs w:val="21"/>
+        </w:rPr>
+        <w:t xml:space="preserve">Account</w:t>
+      </w:r>
+      <w:r>
+        <w:rPr>
+          <w:rFonts w:ascii="Inter" w:cs="Inter" w:eastAsia="Inter" w:hAnsi="Inter"/>
+          <w:color w:val="1A1D21"/>
+          <w:sz w:val="21"/>
+          <w:szCs w:val="21"/>
+        </w:rPr>
+        <w:t xml:space="preserve"> (tenant) for isolation (INV-6).</w:t>
       </w:r>
     </w:p>
     <w:p>
@@ -7869,6 +8481,51 @@
           <w:sz w:val="21"/>
           <w:szCs w:val="21"/>
         </w:rPr>
+        <w:t xml:space="preserve">Emotion (v7)</w:t>
+      </w:r>
+      <w:r>
+        <w:rPr>
+          <w:rFonts w:ascii="Inter" w:cs="Inter" w:eastAsia="Inter" w:hAnsi="Inter"/>
+          <w:color w:val="1A1D21"/>
+          <w:sz w:val="21"/>
+          <w:szCs w:val="21"/>
+        </w:rPr>
+        <w:t xml:space="preserve"> — derived, ONE OR MORE per record (a comment may carry several — E-25): emotion_id, record_id, emotion_headline (the ~7-set label), sub_emotion (finer — D-17), intensity, valence, model_version/confidence. Always inferred = true; a "no emotion detected" read is stored explicitly, never a neutral emotion (INV-15).   </w:t>
+      </w:r>
+      <w:r>
+        <w:rPr>
+          <w:rFonts w:ascii="Inter" w:cs="Inter" w:eastAsia="Inter" w:hAnsi="Inter"/>
+          <w:b/>
+          <w:bCs/>
+          <w:color w:val="1A1D21"/>
+          <w:sz w:val="21"/>
+          <w:szCs w:val="21"/>
+        </w:rPr>
+        <w:t xml:space="preserve">AspectSentiment (v7)</w:t>
+      </w:r>
+      <w:r>
+        <w:rPr>
+          <w:rFonts w:ascii="Inter" w:cs="Inter" w:eastAsia="Inter" w:hAnsi="Inter"/>
+          <w:color w:val="1A1D21"/>
+          <w:sz w:val="21"/>
+          <w:szCs w:val="21"/>
+        </w:rPr>
+        <w:t xml:space="preserve"> — derived, ZERO OR MORE per record: aspect_id, record_id, aspect_label (account-configurable), polarity (+/−), intensity, confidence. Links to the verbatim (INV-3); feeds the Strengths &amp; Gripes board (O-18).</w:t>
+      </w:r>
+    </w:p>
+    <w:p>
+      <w:pPr>
+        <w:spacing w:after="140" w:line="300"/>
+      </w:pPr>
+      <w:r>
+        <w:rPr>
+          <w:rFonts w:ascii="Inter" w:cs="Inter" w:eastAsia="Inter" w:hAnsi="Inter"/>
+          <w:b/>
+          <w:bCs/>
+          <w:color w:val="1A1D21"/>
+          <w:sz w:val="21"/>
+          <w:szCs w:val="21"/>
+        </w:rPr>
         <w:t xml:space="preserve">Contact (v5)</w:t>
       </w:r>
       <w:r>
@@ -8496,7 +9153,7 @@
           <w:sz w:val="21"/>
           <w:szCs w:val="21"/>
         </w:rPr>
-        <w:t xml:space="preserve"> — a rollup: metric ∈ avg_rating · nps · csat · brand_love_index (stated) · trust_index (stated) · recovery_rate (measured) · case_resolution_rate · avg_time_to_resolve · neg_sentiment_share · response_rate · completion_rate; value + filter_context (INV-2). Theme/ThemeAssignment, Survey/Campaign, Segment, Alert, Account/User/Role (incl. case-owner) round out the model.</w:t>
+        <w:t xml:space="preserve"> — a rollup: metric ∈ avg_rating · nps · csat · brand_love_index (stated) · trust_index (stated) · recovery_rate (measured) · case_resolution_rate · avg_time_to_resolve · neg_sentiment_share · response_rate · completion_rate · emotion_distribution (inferred, companion) · top_strengths / top_gripes (inferred, companion, v7); value + filter_context (INV-2). Theme/ThemeAssignment, Survey/Campaign, Segment, Alert, Account/User/Role (incl. case-owner) round out the model.</w:t>
       </w:r>
     </w:p>
     <w:tbl>
@@ -8749,6 +9406,20 @@
                 <w:sz w:val="20"/>
                 <w:szCs w:val="20"/>
               </w:rPr>
+              <w:t xml:space="preserve">• Emotion &amp; experience (own brand): emotion profile with drill-down + Strengths &amp; Gripes board, as labeled companion reads (R-46–R-48, R-50, O-17, O-18, INV-15, INV-16)</w:t>
+            </w:r>
+          </w:p>
+          <w:p>
+            <w:pPr>
+              <w:spacing w:after="40" w:line="276"/>
+            </w:pPr>
+            <w:r>
+              <w:rPr>
+                <w:rFonts w:ascii="Inter" w:cs="Inter" w:eastAsia="Inter" w:hAnsi="Inter"/>
+                <w:color w:val="1A1D21"/>
+                <w:sz w:val="20"/>
+                <w:szCs w:val="20"/>
+              </w:rPr>
               <w:t xml:space="preserve">• Closed-loop (internal starter): first-party opt-in contact, triggers, RecoveryCase own/track/resolve in-app + team notification, prioritization (R-34–R-37, R-40)</w:t>
             </w:r>
           </w:p>
@@ -8821,6 +9492,25 @@
           <w:szCs w:val="21"/>
         </w:rPr>
         <w:t xml:space="preserve">Competitor config + benchmarking (R-24, R-27, O-9) — CSV / licensed-provider / API first; live web collection (R-25, DPS-7) only after legal sign-off; per-competitor deep-dive (R-28, O-10).</w:t>
+      </w:r>
+    </w:p>
+    <w:p>
+      <w:pPr>
+        <w:pStyle w:val="ListParagraph"/>
+        <w:numPr>
+          <w:ilvl w:val="0"/>
+          <w:numId w:val="2"/>
+        </w:numPr>
+        <w:spacing w:after="90" w:line="288"/>
+      </w:pPr>
+      <w:r>
+        <w:rPr>
+          <w:rFonts w:ascii="Inter" w:cs="Inter" w:eastAsia="Inter" w:hAnsi="Inter"/>
+          <w:color w:val="1A1D21"/>
+          <w:sz w:val="21"/>
+          <w:szCs w:val="21"/>
+        </w:rPr>
+        <w:t xml:space="preserve">Emotion &amp; Strengths/Gripes competitive comparison (R-49, O-19) — own brand vs. competitors, on lawfully-collected public reviews, aggregate only.</w:t>
       </w:r>
     </w:p>
     <w:p>
@@ -9028,6 +9718,104 @@
           <w:szCs w:val="21"/>
         </w:rPr>
         <w:t xml:space="preserve">Keep AAA Insights working name (D-1); build survey engine natively (D-2); provider-abstracted hosting, US residency, no lock-in (D-3); English-only MVP (D-4); GDPR+CCPA (D-5); ~5,000-response target (D-6); hybrid tiered + usage pricing (D-7); no design partner yet (D-8, pending); Brand Love grounded in Batra/Ahuvia/Bagozzi 2012, label "Ambivalence" (D-9); competitors generic &amp; configurable (D-10); CSV-first collection, web after legal sign-off (D-11, sign-off owner pending); 1–5 scale + net Love Index (D-12); per-account 24-mo retention (D-13); single-item + inferred Trust in MVP (D-14); four Trust drivers + net Index (D-15); Closed-Loop pillar #2→#3 (D-16).</w:t>
+      </w:r>
+    </w:p>
+    <w:p>
+      <w:pPr>
+        <w:spacing w:after="90" w:before="200"/>
+      </w:pPr>
+      <w:r>
+        <w:rPr>
+          <w:rFonts w:ascii="Inter" w:cs="Inter" w:eastAsia="Inter" w:hAnsi="Inter"/>
+          <w:b/>
+          <w:bCs/>
+          <w:color w:val="1A1D21"/>
+          <w:sz w:val="22"/>
+          <w:szCs w:val="22"/>
+        </w:rPr>
+        <w:t xml:space="preserve">v7 additions (SPECIFY increment, 2026-07-30)</w:t>
+      </w:r>
+    </w:p>
+    <w:p>
+      <w:pPr>
+        <w:pStyle w:val="ListParagraph"/>
+        <w:numPr>
+          <w:ilvl w:val="0"/>
+          <w:numId w:val="2"/>
+        </w:numPr>
+        <w:spacing w:after="90" w:line="288"/>
+      </w:pPr>
+      <w:r>
+        <w:rPr>
+          <w:rFonts w:ascii="JetBrains Mono" w:cs="JetBrains Mono" w:eastAsia="JetBrains Mono" w:hAnsi="JetBrains Mono"/>
+          <w:b/>
+          <w:bCs/>
+          <w:color w:val="D9763A"/>
+          <w:sz w:val="20"/>
+          <w:szCs w:val="20"/>
+        </w:rPr>
+        <w:t xml:space="preserve">D-17  </w:t>
+      </w:r>
+      <w:r>
+        <w:rPr>
+          <w:rFonts w:ascii="Inter" w:cs="Inter" w:eastAsia="Inter" w:hAnsi="Inter"/>
+          <w:b/>
+          <w:bCs/>
+          <w:color w:val="1A1D21"/>
+          <w:sz w:val="21"/>
+          <w:szCs w:val="21"/>
+        </w:rPr>
+        <w:t xml:space="preserve">Emotion taxonomy — </w:t>
+      </w:r>
+      <w:r>
+        <w:rPr>
+          <w:rFonts w:ascii="Inter" w:cs="Inter" w:eastAsia="Inter" w:hAnsi="Inter"/>
+          <w:color w:val="1A1D21"/>
+          <w:sz w:val="21"/>
+          <w:szCs w:val="21"/>
+        </w:rPr>
+        <w:t xml:space="preserve">a compact, manager-readable headline set (~7 emotions) that rolls up a finer sub-emotion set on demand. Grounded in the consumer-emotion literature (Richins’ Consumption Emotions Set; Laros &amp; Steenkamp’s hierarchy of consumer emotions; Plutchik). Reported as a labeled, confidence-scored companion signal (INV-15/INV-16).</w:t>
+      </w:r>
+    </w:p>
+    <w:p>
+      <w:pPr>
+        <w:pStyle w:val="ListParagraph"/>
+        <w:numPr>
+          <w:ilvl w:val="0"/>
+          <w:numId w:val="2"/>
+        </w:numPr>
+        <w:spacing w:after="90" w:line="288"/>
+      </w:pPr>
+      <w:r>
+        <w:rPr>
+          <w:rFonts w:ascii="JetBrains Mono" w:cs="JetBrains Mono" w:eastAsia="JetBrains Mono" w:hAnsi="JetBrains Mono"/>
+          <w:b/>
+          <w:bCs/>
+          <w:color w:val="D9763A"/>
+          <w:sz w:val="20"/>
+          <w:szCs w:val="20"/>
+        </w:rPr>
+        <w:t xml:space="preserve">D-18  </w:t>
+      </w:r>
+      <w:r>
+        <w:rPr>
+          <w:rFonts w:ascii="Inter" w:cs="Inter" w:eastAsia="Inter" w:hAnsi="Inter"/>
+          <w:b/>
+          <w:bCs/>
+          <w:color w:val="1A1D21"/>
+          <w:sz w:val="21"/>
+          <w:szCs w:val="21"/>
+        </w:rPr>
+        <w:t xml:space="preserve">Scope of the pillar — </w:t>
+      </w:r>
+      <w:r>
+        <w:rPr>
+          <w:rFonts w:ascii="Inter" w:cs="Inter" w:eastAsia="Inter" w:hAnsi="Inter"/>
+          <w:color w:val="1A1D21"/>
+          <w:sz w:val="21"/>
+          <w:szCs w:val="21"/>
+        </w:rPr>
+        <w:t xml:space="preserve">own-brand emotion + Strengths/Gripes ship in the MVP (they reuse the analysis engine); the competitive comparison rides Phase-1 competitor collection. Emotion &amp; Strengths/Gripes are a new research theme for the library.</w:t>
       </w:r>
     </w:p>
     <w:p>
@@ -9824,7 +10612,46 @@
           <w:sz w:val="40"/>
           <w:szCs w:val="40"/>
         </w:rPr>
-        <w:t xml:space="preserve">The CHALLENGE gate</w:t>
+        <w:t xml:space="preserve">The specification gate</w:t>
+      </w:r>
+    </w:p>
+    <w:p>
+      <w:pPr>
+        <w:spacing w:after="140" w:line="300"/>
+      </w:pPr>
+      <w:r>
+        <w:rPr>
+          <w:rFonts w:ascii="Inter" w:cs="Inter" w:eastAsia="Inter" w:hAnsi="Inter"/>
+          <w:color w:val="1A1D21"/>
+          <w:sz w:val="21"/>
+          <w:szCs w:val="21"/>
+        </w:rPr>
+        <w:t xml:space="preserve">v7 adds the Emotion &amp; Experience pillar on top of the v6 CHALLENGE baseline and is ready for your approval. On approval, v7 is the baseline that carries into TEST FIRST (Phase 3) — deriving the test suite from this spec before any implementation. The (confirm) NFR targets (NFR-2/3/8/9) can be confirmed at approval or adjusted.</w:t>
+      </w:r>
+    </w:p>
+    <w:p>
+      <w:pPr>
+        <w:spacing w:after="140" w:line="300"/>
+      </w:pPr>
+      <w:r>
+        <w:rPr>
+          <w:rFonts w:ascii="Inter" w:cs="Inter" w:eastAsia="Inter" w:hAnsi="Inter"/>
+          <w:b/>
+          <w:bCs/>
+          <w:color w:val="1A1D21"/>
+          <w:sz w:val="21"/>
+          <w:szCs w:val="21"/>
+        </w:rPr>
+        <w:t xml:space="preserve">Note: </w:t>
+      </w:r>
+      <w:r>
+        <w:rPr>
+          <w:rFonts w:ascii="Inter" w:cs="Inter" w:eastAsia="Inter" w:hAnsi="Inter"/>
+          <w:color w:val="1A1D21"/>
+          <w:sz w:val="21"/>
+          <w:szCs w:val="21"/>
+        </w:rPr>
+        <w:t xml:space="preserve">the new pillar warrants a light CHALLENGE pass — chiefly on inferred-emotion accuracy and the association-vs-causation framing — which its invariants INV-15/INV-16 and edge cases E-25–E-27 already pre-empt; we can fold any further findings before Phase 3.</w:t>
       </w:r>
     </w:p>
     <w:p>

</xml_diff>

<commit_message>
Requirements v7.1 — NFR targets confirmed
</commit_message>
<xml_diff>
--- a/AAA_Insights_PRD.docx
+++ b/AAA_Insights_PRD.docx
@@ -133,7 +133,7 @@
           <w:sz w:val="18"/>
           <w:szCs w:val="18"/>
         </w:rPr>
-        <w:t xml:space="preserve">v7 — Draft (Emotion &amp; Experience pillar added — ready for approval)</w:t>
+        <w:t xml:space="preserve">v7.1 — Approved (Emotion &amp; Experience pillar; NFR targets confirmed)</w:t>
       </w:r>
     </w:p>
     <w:p>
@@ -156,7 +156,7 @@
           <w:sz w:val="18"/>
           <w:szCs w:val="18"/>
         </w:rPr>
-        <w:t xml:space="preserve">2026-07-30</w:t>
+        <w:t xml:space="preserve">2026-08-11</w:t>
       </w:r>
     </w:p>
     <w:p>
@@ -225,7 +225,7 @@
           <w:sz w:val="18"/>
           <w:szCs w:val="18"/>
         </w:rPr>
-        <w:t xml:space="preserve">Grounded AI™ — Phase 1 (SPECIFY increment → v7)</w:t>
+        <w:t xml:space="preserve">Grounded AI™ — Phase 1 (SPECIFY → v7.1)</w:t>
       </w:r>
     </w:p>
     <w:p>
@@ -264,7 +264,7 @@
           <w:sz w:val="17"/>
           <w:szCs w:val="17"/>
         </w:rPr>
-        <w:t xml:space="preserve">WHAT CHANGED IN V7</w:t>
+        <w:t xml:space="preserve">WHAT CHANGED IN V7 / V7.1</w:t>
       </w:r>
     </w:p>
     <w:p>
@@ -323,7 +323,21 @@
                 <w:sz w:val="20"/>
                 <w:szCs w:val="20"/>
               </w:rPr>
-              <w:t xml:space="preserve">Revised 2026-07-30 — Emotion &amp; Experience pillar added</w:t>
+              <w:t xml:space="preserve">Emotion &amp; Experience pillar (v7) · NFR targets confirmed (v7.1, 2026-08-11)</w:t>
+            </w:r>
+          </w:p>
+          <w:p>
+            <w:pPr>
+              <w:spacing w:after="40" w:line="276"/>
+            </w:pPr>
+            <w:r>
+              <w:rPr>
+                <w:rFonts w:ascii="Inter" w:cs="Inter" w:eastAsia="Inter" w:hAnsi="Inter"/>
+                <w:color w:val="1A1D21"/>
+                <w:sz w:val="20"/>
+                <w:szCs w:val="20"/>
+              </w:rPr>
+              <w:t xml:space="preserve">• v7.1: confirmed the four NFR targets — analysis p95 ≤ 60 s, 99.9% uptime, trigger ≤ 60 s, and durability tightened to RPO ≤ 1 h / RTO ≤ 8 h (from a 24 h placeholder).</w:t>
             </w:r>
           </w:p>
           <w:p>
@@ -6983,7 +6997,7 @@
           <w:sz w:val="26"/>
           <w:szCs w:val="26"/>
         </w:rPr>
-        <w:t xml:space="preserve">Speed, reliability, access, honesty — testable budgets. (v6: "confirm" targets want your sign-off.)</w:t>
+        <w:t xml:space="preserve">Speed, reliability, access, honesty — testable budgets. (v7.1: NFR-2/3/8/9 targets confirmed.)</w:t>
       </w:r>
     </w:p>
     <w:p>
@@ -7043,7 +7057,7 @@
           <w:sz w:val="21"/>
           <w:szCs w:val="21"/>
         </w:rPr>
-        <w:t xml:space="preserve">(v6) Analysis latency — the MVP size (~5,000 items) returns at p95 ≤ 60 s (confirm); larger sets background with progress.</w:t>
+        <w:t xml:space="preserve">(v7.1) Analysis latency — the MVP size (~5,000 items) returns at p95 ≤ 60 s (confirmed); larger sets background with progress.</w:t>
       </w:r>
     </w:p>
     <w:p>
@@ -7073,7 +7087,7 @@
           <w:sz w:val="21"/>
           <w:szCs w:val="21"/>
         </w:rPr>
-        <w:t xml:space="preserve">(v6) Availability — the collection endpoint targets 99.9% uptime (confirm); ingestion durable even if analysis is degraded.</w:t>
+        <w:t xml:space="preserve">(v7.1) Availability — the collection endpoint targets 99.9% uptime (confirmed); ingestion durable even if analysis is degraded.</w:t>
       </w:r>
     </w:p>
     <w:p>
@@ -7223,7 +7237,7 @@
           <w:sz w:val="21"/>
           <w:szCs w:val="21"/>
         </w:rPr>
-        <w:t xml:space="preserve">(v6) Trigger latency — a dissatisfaction signal opens a RecoveryCase within ≤ 60 s (confirm).</w:t>
+        <w:t xml:space="preserve">(v7.1) Trigger latency — a dissatisfaction signal opens a RecoveryCase within ≤ 60 s (confirmed).</w:t>
       </w:r>
     </w:p>
     <w:p>
@@ -7253,7 +7267,7 @@
           <w:sz w:val="21"/>
           <w:szCs w:val="21"/>
         </w:rPr>
-        <w:t xml:space="preserve">(v6) Durability — RPO ≤ 24 h, RTO ≤ 8 h (confirm); timestamps stored UTC, reporting in the account’s configured timezone.</w:t>
+        <w:t xml:space="preserve">(v7.1) Durability — RPO ≤ 1 h, RTO ≤ 8 h (point-in-time recovery); timestamps stored UTC, reporting in the account’s configured timezone.</w:t>
       </w:r>
     </w:p>
     <w:p>
@@ -10626,7 +10640,7 @@
           <w:sz w:val="21"/>
           <w:szCs w:val="21"/>
         </w:rPr>
-        <w:t xml:space="preserve">v7 adds the Emotion &amp; Experience pillar on top of the v6 CHALLENGE baseline and is ready for your approval. On approval, v7 is the baseline that carries into TEST FIRST (Phase 3) — deriving the test suite from this spec before any implementation. The (confirm) NFR targets (NFR-2/3/8/9) can be confirmed at approval or adjusted.</w:t>
+        <w:t xml:space="preserve">v7 added the Emotion &amp; Experience pillar on the v6 CHALLENGE baseline and was approved; v7.1 confirms the four NFR targets (NFR-2/3/8/9). This approved spec is the baseline that carries into TEST FIRST (Phase 3) and IMPLEMENT (Phase 4).</w:t>
       </w:r>
     </w:p>
     <w:p>

</xml_diff>